<commit_message>
new font + photos
</commit_message>
<xml_diff>
--- a/public/Resume.docx
+++ b/public/Resume.docx
@@ -41,8 +41,6 @@
         <w:jc w:val="center"/>
         <w:rPr>
           <w:rFonts w:asciiTheme="minorHAnsi" w:eastAsia="Times New Roman" w:hAnsiTheme="minorHAnsi" w:cstheme="minorHAnsi"/>
-          <w:b/>
-          <w:color w:val="FF9900"/>
         </w:rPr>
       </w:pPr>
       <w:hyperlink r:id="rId5" w:history="1">
@@ -78,14 +76,12 @@
         </w:rPr>
         <w:t>github.com/</w:t>
       </w:r>
-      <w:proofErr w:type="spellStart"/>
       <w:r>
         <w:rPr>
           <w:rFonts w:asciiTheme="minorHAnsi" w:eastAsia="Times New Roman" w:hAnsiTheme="minorHAnsi" w:cstheme="minorHAnsi"/>
         </w:rPr>
         <w:t>joshrashtian</w:t>
       </w:r>
-      <w:proofErr w:type="spellEnd"/>
       <w:r>
         <w:rPr>
           <w:rFonts w:asciiTheme="minorHAnsi" w:eastAsia="Times New Roman" w:hAnsiTheme="minorHAnsi" w:cstheme="minorHAnsi"/>
@@ -104,14 +100,12 @@
         </w:rPr>
         <w:t>n.com/in/</w:t>
       </w:r>
-      <w:proofErr w:type="spellStart"/>
       <w:r>
         <w:rPr>
           <w:rFonts w:asciiTheme="minorHAnsi" w:eastAsia="Times New Roman" w:hAnsiTheme="minorHAnsi" w:cstheme="minorHAnsi"/>
         </w:rPr>
         <w:t>joshrashtian</w:t>
       </w:r>
-      <w:proofErr w:type="spellEnd"/>
     </w:p>
     <w:p>
       <w:pPr>
@@ -123,12 +117,6 @@
           <w:u w:val="single"/>
         </w:rPr>
       </w:pPr>
-      <w:r>
-        <w:rPr>
-          <w:rFonts w:asciiTheme="minorHAnsi" w:hAnsiTheme="minorHAnsi" w:cstheme="minorHAnsi"/>
-          <w:noProof/>
-        </w:rPr>
-      </w:r>
       <w:r>
         <w:rPr>
           <w:rFonts w:asciiTheme="minorHAnsi" w:hAnsiTheme="minorHAnsi" w:cstheme="minorHAnsi"/>
@@ -170,6 +158,30 @@
         </w:rPr>
         <w:t>California Polytechnic State University, San Luis Obispo (Cal Poly)</w:t>
       </w:r>
+      <w:r>
+        <w:rPr>
+          <w:rFonts w:asciiTheme="minorHAnsi" w:eastAsia="Garamond" w:hAnsiTheme="minorHAnsi" w:cstheme="minorHAnsi"/>
+        </w:rPr>
+        <w:t xml:space="preserve">                                             </w:t>
+      </w:r>
+      <w:r>
+        <w:rPr>
+          <w:rFonts w:asciiTheme="minorHAnsi" w:eastAsia="Garamond" w:hAnsiTheme="minorHAnsi" w:cstheme="minorHAnsi"/>
+        </w:rPr>
+        <w:t xml:space="preserve">    </w:t>
+      </w:r>
+      <w:r>
+        <w:rPr>
+          <w:rFonts w:asciiTheme="minorHAnsi" w:eastAsia="Times New Roman" w:hAnsiTheme="minorHAnsi" w:cstheme="minorHAnsi"/>
+        </w:rPr>
+        <w:t>Aug</w:t>
+      </w:r>
+      <w:r>
+        <w:rPr>
+          <w:rFonts w:asciiTheme="minorHAnsi" w:eastAsia="Times New Roman" w:hAnsiTheme="minorHAnsi" w:cstheme="minorHAnsi"/>
+        </w:rPr>
+        <w:t xml:space="preserve"> 2026-June 2028</w:t>
+      </w:r>
     </w:p>
     <w:p>
       <w:pPr>
@@ -240,7 +252,6 @@
         </w:rPr>
         <w:tab/>
       </w:r>
-      <w:proofErr w:type="gramStart"/>
       <w:r>
         <w:rPr>
           <w:rFonts w:asciiTheme="minorHAnsi" w:eastAsia="Times New Roman" w:hAnsiTheme="minorHAnsi" w:cstheme="minorHAnsi"/>
@@ -253,47 +264,6 @@
         </w:rPr>
         <w:t xml:space="preserve"> </w:t>
       </w:r>
-      <w:r>
-        <w:rPr>
-          <w:rFonts w:asciiTheme="minorHAnsi" w:eastAsia="Times New Roman" w:hAnsiTheme="minorHAnsi" w:cstheme="minorHAnsi"/>
-        </w:rPr>
-        <w:t xml:space="preserve"> </w:t>
-      </w:r>
-      <w:r>
-        <w:rPr>
-          <w:rFonts w:asciiTheme="minorHAnsi" w:eastAsia="Times New Roman" w:hAnsiTheme="minorHAnsi" w:cstheme="minorHAnsi"/>
-        </w:rPr>
-        <w:t>Aug</w:t>
-      </w:r>
-      <w:proofErr w:type="gramEnd"/>
-      <w:r>
-        <w:rPr>
-          <w:rFonts w:asciiTheme="minorHAnsi" w:eastAsia="Times New Roman" w:hAnsiTheme="minorHAnsi" w:cstheme="minorHAnsi"/>
-        </w:rPr>
-        <w:t xml:space="preserve"> 2026-</w:t>
-      </w:r>
-      <w:r>
-        <w:rPr>
-          <w:rFonts w:asciiTheme="minorHAnsi" w:eastAsia="Times New Roman" w:hAnsiTheme="minorHAnsi" w:cstheme="minorHAnsi"/>
-        </w:rPr>
-        <w:t>June 2028</w:t>
-      </w:r>
-      <w:r>
-        <w:rPr>
-          <w:rFonts w:asciiTheme="minorHAnsi" w:eastAsia="Times New Roman" w:hAnsiTheme="minorHAnsi" w:cstheme="minorHAnsi"/>
-        </w:rPr>
-        <w:tab/>
-      </w:r>
-    </w:p>
-    <w:p>
-      <w:pPr>
-        <w:spacing w:line="240" w:lineRule="auto"/>
-        <w:contextualSpacing/>
-        <w:rPr>
-          <w:rFonts w:asciiTheme="minorHAnsi" w:eastAsia="Garamond" w:hAnsiTheme="minorHAnsi" w:cstheme="minorHAnsi"/>
-          <w:b/>
-        </w:rPr>
-      </w:pPr>
     </w:p>
     <w:p>
       <w:pPr>
@@ -333,7 +303,6 @@
     <w:p>
       <w:pPr>
         <w:spacing w:line="240" w:lineRule="auto"/>
-        <w:ind w:firstLine="720"/>
         <w:contextualSpacing/>
         <w:rPr>
           <w:rFonts w:asciiTheme="minorHAnsi" w:eastAsia="Garamond" w:hAnsiTheme="minorHAnsi" w:cstheme="minorHAnsi"/>
@@ -348,6 +317,7 @@
         <w:contextualSpacing/>
         <w:rPr>
           <w:rFonts w:asciiTheme="minorHAnsi" w:eastAsia="Garamond" w:hAnsiTheme="minorHAnsi" w:cstheme="minorHAnsi"/>
+          <w:b/>
         </w:rPr>
       </w:pPr>
       <w:r>
@@ -355,6 +325,66 @@
           <w:rFonts w:asciiTheme="minorHAnsi" w:eastAsia="Garamond" w:hAnsiTheme="minorHAnsi" w:cstheme="minorHAnsi"/>
         </w:rPr>
         <w:t>College of the Canyons, Valencia</w:t>
+      </w:r>
+      <w:r>
+        <w:rPr>
+          <w:rFonts w:asciiTheme="minorHAnsi" w:eastAsia="Garamond" w:hAnsiTheme="minorHAnsi" w:cstheme="minorHAnsi"/>
+        </w:rPr>
+        <w:tab/>
+      </w:r>
+      <w:r>
+        <w:rPr>
+          <w:rFonts w:asciiTheme="minorHAnsi" w:eastAsia="Garamond" w:hAnsiTheme="minorHAnsi" w:cstheme="minorHAnsi"/>
+        </w:rPr>
+        <w:tab/>
+      </w:r>
+      <w:r>
+        <w:rPr>
+          <w:rFonts w:asciiTheme="minorHAnsi" w:eastAsia="Garamond" w:hAnsiTheme="minorHAnsi" w:cstheme="minorHAnsi"/>
+        </w:rPr>
+        <w:tab/>
+      </w:r>
+      <w:r>
+        <w:rPr>
+          <w:rFonts w:asciiTheme="minorHAnsi" w:eastAsia="Garamond" w:hAnsiTheme="minorHAnsi" w:cstheme="minorHAnsi"/>
+        </w:rPr>
+        <w:tab/>
+      </w:r>
+      <w:r>
+        <w:rPr>
+          <w:rFonts w:asciiTheme="minorHAnsi" w:eastAsia="Garamond" w:hAnsiTheme="minorHAnsi" w:cstheme="minorHAnsi"/>
+        </w:rPr>
+        <w:tab/>
+      </w:r>
+      <w:r>
+        <w:rPr>
+          <w:rFonts w:asciiTheme="minorHAnsi" w:eastAsia="Garamond" w:hAnsiTheme="minorHAnsi" w:cstheme="minorHAnsi"/>
+        </w:rPr>
+        <w:tab/>
+      </w:r>
+      <w:r>
+        <w:rPr>
+          <w:rFonts w:asciiTheme="minorHAnsi" w:eastAsia="Garamond" w:hAnsiTheme="minorHAnsi" w:cstheme="minorHAnsi"/>
+        </w:rPr>
+        <w:t xml:space="preserve">                </w:t>
+      </w:r>
+      <w:r>
+        <w:rPr>
+          <w:rFonts w:asciiTheme="minorHAnsi" w:eastAsia="Garamond" w:hAnsiTheme="minorHAnsi" w:cstheme="minorHAnsi"/>
+        </w:rPr>
+        <w:t xml:space="preserve">    </w:t>
+      </w:r>
+      <w:r>
+        <w:rPr>
+          <w:rFonts w:asciiTheme="minorHAnsi" w:eastAsia="Times New Roman" w:hAnsiTheme="minorHAnsi" w:cstheme="minorHAnsi"/>
+        </w:rPr>
+        <w:t>June 2023-June 2026</w:t>
+      </w:r>
+      <w:r>
+        <w:rPr>
+          <w:rFonts w:asciiTheme="minorHAnsi" w:eastAsia="Garamond" w:hAnsiTheme="minorHAnsi" w:cstheme="minorHAnsi"/>
+        </w:rPr>
+        <w:t xml:space="preserve">                   </w:t>
       </w:r>
     </w:p>
     <w:p>
@@ -433,19 +463,111 @@
         <w:rPr>
           <w:rFonts w:asciiTheme="minorHAnsi" w:eastAsia="Times New Roman" w:hAnsiTheme="minorHAnsi" w:cstheme="minorHAnsi"/>
         </w:rPr>
-        <w:t>June 2023-</w:t>
-      </w:r>
-      <w:r>
-        <w:rPr>
-          <w:rFonts w:asciiTheme="minorHAnsi" w:eastAsia="Times New Roman" w:hAnsiTheme="minorHAnsi" w:cstheme="minorHAnsi"/>
-        </w:rPr>
-        <w:t>June 2026</w:t>
+        <w:t xml:space="preserve">                    </w:t>
+      </w:r>
+      <w:r>
+        <w:rPr>
+          <w:rFonts w:asciiTheme="minorHAnsi" w:eastAsia="Times New Roman" w:hAnsiTheme="minorHAnsi" w:cstheme="minorHAnsi"/>
+        </w:rPr>
+        <w:t xml:space="preserve">     </w:t>
+      </w:r>
+      <w:r>
+        <w:rPr>
+          <w:rFonts w:asciiTheme="minorHAnsi" w:eastAsia="Times New Roman" w:hAnsiTheme="minorHAnsi" w:cstheme="minorHAnsi"/>
+        </w:rPr>
+        <w:t>GPA:</w:t>
+      </w:r>
+      <w:r>
+        <w:rPr>
+          <w:rFonts w:asciiTheme="minorHAnsi" w:eastAsia="Garamond" w:hAnsiTheme="minorHAnsi" w:cstheme="minorHAnsi"/>
+        </w:rPr>
+        <w:t xml:space="preserve"> 3.6</w:t>
+      </w:r>
+      <w:r>
+        <w:rPr>
+          <w:rFonts w:asciiTheme="minorHAnsi" w:eastAsia="Garamond" w:hAnsiTheme="minorHAnsi" w:cstheme="minorHAnsi"/>
+        </w:rPr>
+        <w:t>2</w:t>
       </w:r>
       <w:r>
         <w:rPr>
           <w:rFonts w:asciiTheme="minorHAnsi" w:eastAsia="Times New Roman" w:hAnsiTheme="minorHAnsi" w:cstheme="minorHAnsi"/>
         </w:rPr>
         <w:tab/>
+      </w:r>
+    </w:p>
+    <w:p>
+      <w:pPr>
+        <w:spacing w:line="240" w:lineRule="auto"/>
+        <w:ind w:left="720"/>
+        <w:contextualSpacing/>
+        <w:rPr>
+          <w:rFonts w:asciiTheme="minorHAnsi" w:eastAsia="Times New Roman" w:hAnsiTheme="minorHAnsi" w:cstheme="minorHAnsi"/>
+        </w:rPr>
+      </w:pPr>
+      <w:r>
+        <w:rPr>
+          <w:rFonts w:asciiTheme="minorHAnsi" w:eastAsia="Times New Roman" w:hAnsiTheme="minorHAnsi" w:cstheme="minorHAnsi"/>
+          <w:b/>
+        </w:rPr>
+        <w:t xml:space="preserve">Relevant Coursework: </w:t>
+      </w:r>
+      <w:r>
+        <w:rPr>
+          <w:rFonts w:asciiTheme="minorHAnsi" w:eastAsia="Times New Roman" w:hAnsiTheme="minorHAnsi" w:cstheme="minorHAnsi"/>
+        </w:rPr>
+        <w:t>Electricity and Magnetism, Data Structures</w:t>
+      </w:r>
+      <w:r>
+        <w:rPr>
+          <w:rFonts w:asciiTheme="minorHAnsi" w:eastAsia="Times New Roman" w:hAnsiTheme="minorHAnsi" w:cstheme="minorHAnsi"/>
+        </w:rPr>
+        <w:t xml:space="preserve"> 1 and 2</w:t>
+      </w:r>
+      <w:r>
+        <w:rPr>
+          <w:rFonts w:asciiTheme="minorHAnsi" w:eastAsia="Times New Roman" w:hAnsiTheme="minorHAnsi" w:cstheme="minorHAnsi"/>
+        </w:rPr>
+        <w:t>,</w:t>
+      </w:r>
+      <w:r>
+        <w:rPr>
+          <w:rFonts w:asciiTheme="minorHAnsi" w:eastAsia="Times New Roman" w:hAnsiTheme="minorHAnsi" w:cstheme="minorHAnsi"/>
+        </w:rPr>
+        <w:t xml:space="preserve"> </w:t>
+      </w:r>
+      <w:r>
+        <w:rPr>
+          <w:rFonts w:asciiTheme="minorHAnsi" w:eastAsia="Times New Roman" w:hAnsiTheme="minorHAnsi" w:cstheme="minorHAnsi"/>
+        </w:rPr>
+        <w:t>C++ Programming, Java Programming</w:t>
+      </w:r>
+    </w:p>
+    <w:p>
+      <w:pPr>
+        <w:spacing w:line="240" w:lineRule="auto"/>
+        <w:contextualSpacing/>
+        <w:rPr>
+          <w:rFonts w:asciiTheme="minorHAnsi" w:eastAsia="Garamond" w:hAnsiTheme="minorHAnsi" w:cstheme="minorHAnsi"/>
+          <w:b/>
+        </w:rPr>
+      </w:pPr>
+    </w:p>
+    <w:p>
+      <w:pPr>
+        <w:spacing w:line="240" w:lineRule="auto"/>
+        <w:contextualSpacing/>
+        <w:rPr>
+          <w:rFonts w:asciiTheme="minorHAnsi" w:eastAsia="Garamond" w:hAnsiTheme="minorHAnsi" w:cstheme="minorHAnsi"/>
+          <w:b/>
+        </w:rPr>
+      </w:pPr>
+      <w:r>
+        <w:rPr>
+          <w:rFonts w:asciiTheme="minorHAnsi" w:eastAsia="Garamond" w:hAnsiTheme="minorHAnsi" w:cstheme="minorHAnsi"/>
+          <w:b/>
+        </w:rPr>
+        <w:t>SKILLS</w:t>
       </w:r>
     </w:p>
     <w:p>
@@ -455,26 +577,44 @@
         <w:contextualSpacing/>
         <w:rPr>
           <w:rFonts w:asciiTheme="minorHAnsi" w:eastAsia="Garamond" w:hAnsiTheme="minorHAnsi" w:cstheme="minorHAnsi"/>
-          <w:b/>
-        </w:rPr>
-      </w:pPr>
-      <w:r>
-        <w:rPr>
-          <w:rFonts w:asciiTheme="minorHAnsi" w:eastAsia="Times New Roman" w:hAnsiTheme="minorHAnsi" w:cstheme="minorHAnsi"/>
-        </w:rPr>
-        <w:t>GPA:</w:t>
-      </w:r>
-      <w:r>
-        <w:rPr>
-          <w:rFonts w:asciiTheme="minorHAnsi" w:eastAsia="Garamond" w:hAnsiTheme="minorHAnsi" w:cstheme="minorHAnsi"/>
-        </w:rPr>
-        <w:t xml:space="preserve"> 3.6</w:t>
-      </w:r>
-      <w:r>
-        <w:rPr>
-          <w:rFonts w:asciiTheme="minorHAnsi" w:eastAsia="Garamond" w:hAnsiTheme="minorHAnsi" w:cstheme="minorHAnsi"/>
-        </w:rPr>
-        <w:t>2</w:t>
+        </w:rPr>
+      </w:pPr>
+      <w:r>
+        <w:rPr>
+          <w:rFonts w:asciiTheme="minorHAnsi" w:eastAsia="Garamond" w:hAnsiTheme="minorHAnsi" w:cstheme="minorHAnsi"/>
+          <w:b/>
+        </w:rPr>
+        <w:t xml:space="preserve">Programming Languages: </w:t>
+      </w:r>
+      <w:r>
+        <w:rPr>
+          <w:rFonts w:asciiTheme="minorHAnsi" w:eastAsia="Garamond" w:hAnsiTheme="minorHAnsi" w:cstheme="minorHAnsi"/>
+        </w:rPr>
+        <w:t>C, C++, Java, Python, HTML, CSS, Java</w:t>
+      </w:r>
+      <w:r>
+        <w:rPr>
+          <w:rFonts w:asciiTheme="minorHAnsi" w:eastAsia="Garamond" w:hAnsiTheme="minorHAnsi" w:cstheme="minorHAnsi"/>
+        </w:rPr>
+        <w:t>S</w:t>
+      </w:r>
+      <w:r>
+        <w:rPr>
+          <w:rFonts w:asciiTheme="minorHAnsi" w:eastAsia="Garamond" w:hAnsiTheme="minorHAnsi" w:cstheme="minorHAnsi"/>
+        </w:rPr>
+        <w:t>cript, SQL</w:t>
+      </w:r>
+      <w:r>
+        <w:rPr>
+          <w:rFonts w:asciiTheme="minorHAnsi" w:eastAsia="Garamond" w:hAnsiTheme="minorHAnsi" w:cstheme="minorHAnsi"/>
+        </w:rPr>
+        <w:t>, PostgreSQL</w:t>
+      </w:r>
+      <w:r>
+        <w:rPr>
+          <w:rFonts w:asciiTheme="minorHAnsi" w:eastAsia="Garamond" w:hAnsiTheme="minorHAnsi" w:cstheme="minorHAnsi"/>
+        </w:rPr>
+        <w:t xml:space="preserve">, </w:t>
       </w:r>
     </w:p>
     <w:p>
@@ -487,6 +627,54 @@
           <w:b/>
         </w:rPr>
       </w:pPr>
+      <w:r>
+        <w:rPr>
+          <w:rFonts w:asciiTheme="minorHAnsi" w:eastAsia="Garamond" w:hAnsiTheme="minorHAnsi" w:cstheme="minorHAnsi"/>
+          <w:b/>
+          <w:bCs/>
+        </w:rPr>
+        <w:t xml:space="preserve">Frameworks / </w:t>
+      </w:r>
+      <w:r>
+        <w:rPr>
+          <w:rFonts w:asciiTheme="minorHAnsi" w:eastAsia="Garamond" w:hAnsiTheme="minorHAnsi" w:cstheme="minorHAnsi"/>
+          <w:b/>
+          <w:bCs/>
+        </w:rPr>
+        <w:t>Libraries</w:t>
+      </w:r>
+      <w:r>
+        <w:rPr>
+          <w:rFonts w:asciiTheme="minorHAnsi" w:eastAsia="Garamond" w:hAnsiTheme="minorHAnsi" w:cstheme="minorHAnsi"/>
+          <w:b/>
+          <w:bCs/>
+        </w:rPr>
+        <w:t xml:space="preserve">: </w:t>
+      </w:r>
+      <w:r>
+        <w:rPr>
+          <w:rFonts w:asciiTheme="minorHAnsi" w:eastAsia="Garamond" w:hAnsiTheme="minorHAnsi" w:cstheme="minorHAnsi"/>
+        </w:rPr>
+        <w:t>React, Next</w:t>
+      </w:r>
+      <w:r>
+        <w:rPr>
+          <w:rFonts w:asciiTheme="minorHAnsi" w:eastAsia="Garamond" w:hAnsiTheme="minorHAnsi" w:cstheme="minorHAnsi"/>
+        </w:rPr>
+        <w:t>.</w:t>
+      </w:r>
+      <w:r>
+        <w:rPr>
+          <w:rFonts w:asciiTheme="minorHAnsi" w:eastAsia="Garamond" w:hAnsiTheme="minorHAnsi" w:cstheme="minorHAnsi"/>
+        </w:rPr>
+        <w:t>J</w:t>
+      </w:r>
+      <w:r>
+        <w:rPr>
+          <w:rFonts w:asciiTheme="minorHAnsi" w:eastAsia="Garamond" w:hAnsiTheme="minorHAnsi" w:cstheme="minorHAnsi"/>
+        </w:rPr>
+        <w:t>S, React Native, NestJS</w:t>
+      </w:r>
     </w:p>
     <w:p>
       <w:pPr>
@@ -502,31 +690,173 @@
           <w:rFonts w:asciiTheme="minorHAnsi" w:eastAsia="Times New Roman" w:hAnsiTheme="minorHAnsi" w:cstheme="minorHAnsi"/>
           <w:b/>
         </w:rPr>
-        <w:t xml:space="preserve">Relevant Coursework: </w:t>
-      </w:r>
-      <w:r>
-        <w:rPr>
-          <w:rFonts w:asciiTheme="minorHAnsi" w:eastAsia="Times New Roman" w:hAnsiTheme="minorHAnsi" w:cstheme="minorHAnsi"/>
-        </w:rPr>
-        <w:t>Mechanics of Solids and Fluids, Electricity and Magnetism, Data Structures</w:t>
-      </w:r>
-      <w:r>
-        <w:rPr>
-          <w:rFonts w:asciiTheme="minorHAnsi" w:eastAsia="Times New Roman" w:hAnsiTheme="minorHAnsi" w:cstheme="minorHAnsi"/>
-        </w:rPr>
-        <w:t xml:space="preserve"> 1 and 2</w:t>
-      </w:r>
-      <w:r>
-        <w:rPr>
-          <w:rFonts w:asciiTheme="minorHAnsi" w:eastAsia="Times New Roman" w:hAnsiTheme="minorHAnsi" w:cstheme="minorHAnsi"/>
-        </w:rPr>
-        <w:t xml:space="preserve">, C and C++ Programming, Java Programming, Computer </w:t>
-      </w:r>
-      <w:r>
-        <w:rPr>
-          <w:rFonts w:asciiTheme="minorHAnsi" w:eastAsia="Times New Roman" w:hAnsiTheme="minorHAnsi" w:cstheme="minorHAnsi"/>
-        </w:rPr>
-        <w:t>Architecture</w:t>
+        <w:t>Software Tools:</w:t>
+      </w:r>
+      <w:r>
+        <w:rPr>
+          <w:rFonts w:asciiTheme="minorHAnsi" w:eastAsia="Times New Roman" w:hAnsiTheme="minorHAnsi" w:cstheme="minorHAnsi"/>
+        </w:rPr>
+        <w:t xml:space="preserve"> Xcode, Vim, Git, REST API, JSON</w:t>
+      </w:r>
+      <w:r>
+        <w:rPr>
+          <w:rFonts w:asciiTheme="minorHAnsi" w:eastAsia="Times New Roman" w:hAnsiTheme="minorHAnsi" w:cstheme="minorHAnsi"/>
+        </w:rPr>
+        <w:t xml:space="preserve">, </w:t>
+      </w:r>
+      <w:r>
+        <w:rPr>
+          <w:rFonts w:asciiTheme="minorHAnsi" w:eastAsia="Times New Roman" w:hAnsiTheme="minorHAnsi" w:cstheme="minorHAnsi"/>
+        </w:rPr>
+        <w:t>Adobe</w:t>
+      </w:r>
+      <w:r>
+        <w:rPr>
+          <w:rFonts w:asciiTheme="minorHAnsi" w:eastAsia="Times New Roman" w:hAnsiTheme="minorHAnsi" w:cstheme="minorHAnsi"/>
+        </w:rPr>
+        <w:t xml:space="preserve"> Premiere Pro, </w:t>
+      </w:r>
+      <w:r>
+        <w:rPr>
+          <w:rFonts w:asciiTheme="minorHAnsi" w:eastAsia="Times New Roman" w:hAnsiTheme="minorHAnsi" w:cstheme="minorHAnsi"/>
+        </w:rPr>
+        <w:t>Supabase,</w:t>
+      </w:r>
+      <w:r>
+        <w:rPr>
+          <w:rFonts w:asciiTheme="minorHAnsi" w:eastAsia="Times New Roman" w:hAnsiTheme="minorHAnsi" w:cstheme="minorHAnsi"/>
+        </w:rPr>
+        <w:t xml:space="preserve"> Expo</w:t>
+      </w:r>
+      <w:r>
+        <w:rPr>
+          <w:rFonts w:asciiTheme="minorHAnsi" w:eastAsia="Times New Roman" w:hAnsiTheme="minorHAnsi" w:cstheme="minorHAnsi"/>
+        </w:rPr>
+        <w:t>, Docker</w:t>
+      </w:r>
+    </w:p>
+    <w:p>
+      <w:pPr>
+        <w:spacing w:line="240" w:lineRule="auto"/>
+        <w:contextualSpacing/>
+        <w:rPr>
+          <w:rFonts w:asciiTheme="minorHAnsi" w:eastAsia="Garamond" w:hAnsiTheme="minorHAnsi" w:cstheme="minorHAnsi"/>
+          <w:b/>
+        </w:rPr>
+      </w:pPr>
+    </w:p>
+    <w:p>
+      <w:pPr>
+        <w:spacing w:line="240" w:lineRule="auto"/>
+        <w:contextualSpacing/>
+        <w:rPr>
+          <w:rFonts w:asciiTheme="minorHAnsi" w:eastAsia="Garamond" w:hAnsiTheme="minorHAnsi" w:cstheme="minorHAnsi"/>
+          <w:b/>
+        </w:rPr>
+      </w:pPr>
+      <w:r>
+        <w:rPr>
+          <w:rFonts w:asciiTheme="minorHAnsi" w:eastAsia="Garamond" w:hAnsiTheme="minorHAnsi" w:cstheme="minorHAnsi"/>
+          <w:b/>
+        </w:rPr>
+        <w:t>PROGRAMMING PROJECTS</w:t>
+      </w:r>
+      <w:r>
+        <w:rPr>
+          <w:rFonts w:asciiTheme="minorHAnsi" w:eastAsia="Garamond" w:hAnsiTheme="minorHAnsi" w:cstheme="minorHAnsi"/>
+          <w:b/>
+        </w:rPr>
+        <w:tab/>
+      </w:r>
+      <w:r>
+        <w:rPr>
+          <w:rFonts w:asciiTheme="minorHAnsi" w:eastAsia="Garamond" w:hAnsiTheme="minorHAnsi" w:cstheme="minorHAnsi"/>
+          <w:b/>
+        </w:rPr>
+        <w:tab/>
+      </w:r>
+      <w:r>
+        <w:rPr>
+          <w:rFonts w:asciiTheme="minorHAnsi" w:eastAsia="Garamond" w:hAnsiTheme="minorHAnsi" w:cstheme="minorHAnsi"/>
+          <w:b/>
+        </w:rPr>
+        <w:tab/>
+      </w:r>
+      <w:r>
+        <w:rPr>
+          <w:rFonts w:asciiTheme="minorHAnsi" w:eastAsia="Garamond" w:hAnsiTheme="minorHAnsi" w:cstheme="minorHAnsi"/>
+          <w:b/>
+        </w:rPr>
+        <w:tab/>
+      </w:r>
+      <w:r>
+        <w:rPr>
+          <w:rFonts w:asciiTheme="minorHAnsi" w:eastAsia="Garamond" w:hAnsiTheme="minorHAnsi" w:cstheme="minorHAnsi"/>
+          <w:b/>
+        </w:rPr>
+        <w:tab/>
+        <w:t xml:space="preserve">      </w:t>
+      </w:r>
+    </w:p>
+    <w:p>
+      <w:pPr>
+        <w:spacing w:line="240" w:lineRule="auto"/>
+        <w:ind w:firstLine="720"/>
+        <w:contextualSpacing/>
+        <w:rPr>
+          <w:rFonts w:asciiTheme="minorHAnsi" w:eastAsia="Garamond" w:hAnsiTheme="minorHAnsi" w:cstheme="minorHAnsi"/>
+          <w:b/>
+        </w:rPr>
+      </w:pPr>
+      <w:bookmarkStart w:id="0" w:name="OLE_LINK1"/>
+      <w:bookmarkStart w:id="1" w:name="OLE_LINK2"/>
+      <w:r>
+        <w:rPr>
+          <w:rFonts w:asciiTheme="minorHAnsi" w:eastAsia="Garamond" w:hAnsiTheme="minorHAnsi" w:cstheme="minorHAnsi"/>
+          <w:b/>
+        </w:rPr>
+        <w:t>MESAConnect</w:t>
+      </w:r>
+      <w:r>
+        <w:rPr>
+          <w:rFonts w:asciiTheme="minorHAnsi" w:eastAsia="Garamond" w:hAnsiTheme="minorHAnsi" w:cstheme="minorHAnsi"/>
+          <w:b/>
+        </w:rPr>
+        <w:t xml:space="preserve">, </w:t>
+      </w:r>
+      <w:r>
+        <w:rPr>
+          <w:rFonts w:asciiTheme="minorHAnsi" w:eastAsia="Garamond" w:hAnsiTheme="minorHAnsi" w:cstheme="minorHAnsi"/>
+          <w:b/>
+        </w:rPr>
+        <w:t>Website and Social Media Service</w:t>
+      </w:r>
+      <w:r>
+        <w:rPr>
+          <w:rFonts w:asciiTheme="minorHAnsi" w:eastAsia="Garamond" w:hAnsiTheme="minorHAnsi" w:cstheme="minorHAnsi"/>
+          <w:b/>
+        </w:rPr>
+        <w:tab/>
+      </w:r>
+      <w:r>
+        <w:rPr>
+          <w:rFonts w:asciiTheme="minorHAnsi" w:eastAsia="Garamond" w:hAnsiTheme="minorHAnsi" w:cstheme="minorHAnsi"/>
+          <w:b/>
+        </w:rPr>
+        <w:tab/>
+      </w:r>
+      <w:r>
+        <w:rPr>
+          <w:rFonts w:asciiTheme="minorHAnsi" w:eastAsia="Garamond" w:hAnsiTheme="minorHAnsi" w:cstheme="minorHAnsi"/>
+        </w:rPr>
+        <w:tab/>
+      </w:r>
+      <w:r>
+        <w:rPr>
+          <w:rFonts w:asciiTheme="minorHAnsi" w:eastAsia="Garamond" w:hAnsiTheme="minorHAnsi" w:cstheme="minorHAnsi"/>
+          <w:b/>
+        </w:rPr>
+        <w:t xml:space="preserve">                                                  </w:t>
       </w:r>
     </w:p>
     <w:p>
@@ -536,267 +866,6 @@
         <w:contextualSpacing/>
         <w:rPr>
           <w:rFonts w:asciiTheme="minorHAnsi" w:eastAsia="Times New Roman" w:hAnsiTheme="minorHAnsi" w:cstheme="minorHAnsi"/>
-          <w:b/>
-        </w:rPr>
-      </w:pPr>
-    </w:p>
-    <w:p>
-      <w:pPr>
-        <w:spacing w:line="240" w:lineRule="auto"/>
-        <w:contextualSpacing/>
-        <w:rPr>
-          <w:rFonts w:asciiTheme="minorHAnsi" w:eastAsia="Garamond" w:hAnsiTheme="minorHAnsi" w:cstheme="minorHAnsi"/>
-          <w:b/>
-        </w:rPr>
-      </w:pPr>
-    </w:p>
-    <w:p>
-      <w:pPr>
-        <w:spacing w:line="240" w:lineRule="auto"/>
-        <w:contextualSpacing/>
-        <w:rPr>
-          <w:rFonts w:asciiTheme="minorHAnsi" w:eastAsia="Garamond" w:hAnsiTheme="minorHAnsi" w:cstheme="minorHAnsi"/>
-          <w:b/>
-        </w:rPr>
-      </w:pPr>
-      <w:r>
-        <w:rPr>
-          <w:rFonts w:asciiTheme="minorHAnsi" w:eastAsia="Garamond" w:hAnsiTheme="minorHAnsi" w:cstheme="minorHAnsi"/>
-          <w:b/>
-        </w:rPr>
-        <w:t>SKILLS</w:t>
-      </w:r>
-    </w:p>
-    <w:p>
-      <w:pPr>
-        <w:spacing w:line="240" w:lineRule="auto"/>
-        <w:ind w:firstLine="720"/>
-        <w:contextualSpacing/>
-        <w:rPr>
-          <w:rFonts w:asciiTheme="minorHAnsi" w:eastAsia="Garamond" w:hAnsiTheme="minorHAnsi" w:cstheme="minorHAnsi"/>
-          <w:b/>
-        </w:rPr>
-      </w:pPr>
-      <w:r>
-        <w:rPr>
-          <w:rFonts w:asciiTheme="minorHAnsi" w:eastAsia="Garamond" w:hAnsiTheme="minorHAnsi" w:cstheme="minorHAnsi"/>
-          <w:b/>
-        </w:rPr>
-        <w:t xml:space="preserve">Programming Languages: </w:t>
-      </w:r>
-      <w:r>
-        <w:rPr>
-          <w:rFonts w:asciiTheme="minorHAnsi" w:eastAsia="Garamond" w:hAnsiTheme="minorHAnsi" w:cstheme="minorHAnsi"/>
-        </w:rPr>
-        <w:t>C, C++, Java, Python, HTML, CSS, Java</w:t>
-      </w:r>
-      <w:r>
-        <w:rPr>
-          <w:rFonts w:asciiTheme="minorHAnsi" w:eastAsia="Garamond" w:hAnsiTheme="minorHAnsi" w:cstheme="minorHAnsi"/>
-        </w:rPr>
-        <w:t>S</w:t>
-      </w:r>
-      <w:r>
-        <w:rPr>
-          <w:rFonts w:asciiTheme="minorHAnsi" w:eastAsia="Garamond" w:hAnsiTheme="minorHAnsi" w:cstheme="minorHAnsi"/>
-        </w:rPr>
-        <w:t>cript, SQL</w:t>
-      </w:r>
-      <w:r>
-        <w:rPr>
-          <w:rFonts w:asciiTheme="minorHAnsi" w:eastAsia="Garamond" w:hAnsiTheme="minorHAnsi" w:cstheme="minorHAnsi"/>
-        </w:rPr>
-        <w:t>, PostgreSQL</w:t>
-      </w:r>
-      <w:r>
-        <w:rPr>
-          <w:rFonts w:asciiTheme="minorHAnsi" w:eastAsia="Garamond" w:hAnsiTheme="minorHAnsi" w:cstheme="minorHAnsi"/>
-        </w:rPr>
-        <w:t xml:space="preserve">, React, </w:t>
-      </w:r>
-      <w:proofErr w:type="spellStart"/>
-      <w:r>
-        <w:rPr>
-          <w:rFonts w:asciiTheme="minorHAnsi" w:eastAsia="Garamond" w:hAnsiTheme="minorHAnsi" w:cstheme="minorHAnsi"/>
-        </w:rPr>
-        <w:t>NextJS</w:t>
-      </w:r>
-      <w:proofErr w:type="spellEnd"/>
-    </w:p>
-    <w:p>
-      <w:pPr>
-        <w:spacing w:line="240" w:lineRule="auto"/>
-        <w:ind w:left="720"/>
-        <w:contextualSpacing/>
-        <w:rPr>
-          <w:rFonts w:asciiTheme="minorHAnsi" w:eastAsia="Times New Roman" w:hAnsiTheme="minorHAnsi" w:cstheme="minorHAnsi"/>
-        </w:rPr>
-      </w:pPr>
-      <w:r>
-        <w:rPr>
-          <w:rFonts w:asciiTheme="minorHAnsi" w:eastAsia="Times New Roman" w:hAnsiTheme="minorHAnsi" w:cstheme="minorHAnsi"/>
-          <w:b/>
-        </w:rPr>
-        <w:t>Software Tools:</w:t>
-      </w:r>
-      <w:r>
-        <w:rPr>
-          <w:rFonts w:asciiTheme="minorHAnsi" w:eastAsia="Times New Roman" w:hAnsiTheme="minorHAnsi" w:cstheme="minorHAnsi"/>
-        </w:rPr>
-        <w:t xml:space="preserve"> Xcode, Microsoft </w:t>
-      </w:r>
-      <w:r>
-        <w:rPr>
-          <w:rFonts w:asciiTheme="minorHAnsi" w:eastAsia="Times New Roman" w:hAnsiTheme="minorHAnsi" w:cstheme="minorHAnsi"/>
-        </w:rPr>
-        <w:t>365</w:t>
-      </w:r>
-      <w:r>
-        <w:rPr>
-          <w:rFonts w:asciiTheme="minorHAnsi" w:eastAsia="Times New Roman" w:hAnsiTheme="minorHAnsi" w:cstheme="minorHAnsi"/>
-        </w:rPr>
-        <w:t>, Vim, Git, REST API, JSON</w:t>
-      </w:r>
-      <w:r>
-        <w:rPr>
-          <w:rFonts w:asciiTheme="minorHAnsi" w:eastAsia="Times New Roman" w:hAnsiTheme="minorHAnsi" w:cstheme="minorHAnsi"/>
-        </w:rPr>
-        <w:t>, Adobe Premiere Pro, Davinci Resolve, Canva</w:t>
-      </w:r>
-    </w:p>
-    <w:p>
-      <w:pPr>
-        <w:spacing w:line="240" w:lineRule="auto"/>
-        <w:contextualSpacing/>
-        <w:rPr>
-          <w:rFonts w:asciiTheme="minorHAnsi" w:eastAsia="Garamond" w:hAnsiTheme="minorHAnsi" w:cstheme="minorHAnsi"/>
-          <w:b/>
-        </w:rPr>
-      </w:pPr>
-    </w:p>
-    <w:p>
-      <w:pPr>
-        <w:spacing w:line="240" w:lineRule="auto"/>
-        <w:contextualSpacing/>
-        <w:rPr>
-          <w:rFonts w:asciiTheme="minorHAnsi" w:eastAsia="Garamond" w:hAnsiTheme="minorHAnsi" w:cstheme="minorHAnsi"/>
-          <w:b/>
-        </w:rPr>
-      </w:pPr>
-      <w:r>
-        <w:rPr>
-          <w:rFonts w:asciiTheme="minorHAnsi" w:eastAsia="Garamond" w:hAnsiTheme="minorHAnsi" w:cstheme="minorHAnsi"/>
-          <w:b/>
-        </w:rPr>
-        <w:t>PROGRAMMING PROJECTS</w:t>
-      </w:r>
-      <w:r>
-        <w:rPr>
-          <w:rFonts w:asciiTheme="minorHAnsi" w:eastAsia="Garamond" w:hAnsiTheme="minorHAnsi" w:cstheme="minorHAnsi"/>
-          <w:b/>
-        </w:rPr>
-        <w:tab/>
-      </w:r>
-      <w:r>
-        <w:rPr>
-          <w:rFonts w:asciiTheme="minorHAnsi" w:eastAsia="Garamond" w:hAnsiTheme="minorHAnsi" w:cstheme="minorHAnsi"/>
-          <w:b/>
-        </w:rPr>
-        <w:tab/>
-      </w:r>
-      <w:r>
-        <w:rPr>
-          <w:rFonts w:asciiTheme="minorHAnsi" w:eastAsia="Garamond" w:hAnsiTheme="minorHAnsi" w:cstheme="minorHAnsi"/>
-          <w:b/>
-        </w:rPr>
-        <w:tab/>
-      </w:r>
-      <w:r>
-        <w:rPr>
-          <w:rFonts w:asciiTheme="minorHAnsi" w:eastAsia="Garamond" w:hAnsiTheme="minorHAnsi" w:cstheme="minorHAnsi"/>
-          <w:b/>
-        </w:rPr>
-        <w:tab/>
-      </w:r>
-      <w:r>
-        <w:rPr>
-          <w:rFonts w:asciiTheme="minorHAnsi" w:eastAsia="Garamond" w:hAnsiTheme="minorHAnsi" w:cstheme="minorHAnsi"/>
-          <w:b/>
-        </w:rPr>
-        <w:tab/>
-        <w:t xml:space="preserve">      </w:t>
-      </w:r>
-    </w:p>
-    <w:p>
-      <w:pPr>
-        <w:spacing w:line="240" w:lineRule="auto"/>
-        <w:ind w:firstLine="720"/>
-        <w:contextualSpacing/>
-        <w:rPr>
-          <w:rFonts w:asciiTheme="minorHAnsi" w:eastAsia="Garamond" w:hAnsiTheme="minorHAnsi" w:cstheme="minorHAnsi"/>
-          <w:b/>
-        </w:rPr>
-      </w:pPr>
-      <w:bookmarkStart w:id="0" w:name="OLE_LINK1"/>
-      <w:bookmarkStart w:id="1" w:name="OLE_LINK2"/>
-      <w:proofErr w:type="spellStart"/>
-      <w:r>
-        <w:rPr>
-          <w:rFonts w:asciiTheme="minorHAnsi" w:eastAsia="Garamond" w:hAnsiTheme="minorHAnsi" w:cstheme="minorHAnsi"/>
-          <w:b/>
-        </w:rPr>
-        <w:t>MESAConnect</w:t>
-      </w:r>
-      <w:proofErr w:type="spellEnd"/>
-      <w:r>
-        <w:rPr>
-          <w:rFonts w:asciiTheme="minorHAnsi" w:eastAsia="Garamond" w:hAnsiTheme="minorHAnsi" w:cstheme="minorHAnsi"/>
-          <w:b/>
-        </w:rPr>
-        <w:t xml:space="preserve">, </w:t>
-      </w:r>
-      <w:r>
-        <w:rPr>
-          <w:rFonts w:asciiTheme="minorHAnsi" w:eastAsia="Garamond" w:hAnsiTheme="minorHAnsi" w:cstheme="minorHAnsi"/>
-          <w:b/>
-        </w:rPr>
-        <w:t>Website and Social Media Service</w:t>
-      </w:r>
-      <w:r>
-        <w:rPr>
-          <w:rFonts w:asciiTheme="minorHAnsi" w:eastAsia="Garamond" w:hAnsiTheme="minorHAnsi" w:cstheme="minorHAnsi"/>
-          <w:b/>
-        </w:rPr>
-        <w:tab/>
-      </w:r>
-      <w:r>
-        <w:rPr>
-          <w:rFonts w:asciiTheme="minorHAnsi" w:eastAsia="Garamond" w:hAnsiTheme="minorHAnsi" w:cstheme="minorHAnsi"/>
-          <w:b/>
-        </w:rPr>
-        <w:tab/>
-      </w:r>
-      <w:r>
-        <w:rPr>
-          <w:rFonts w:asciiTheme="minorHAnsi" w:eastAsia="Garamond" w:hAnsiTheme="minorHAnsi" w:cstheme="minorHAnsi"/>
-        </w:rPr>
-        <w:tab/>
-      </w:r>
-      <w:r>
-        <w:rPr>
-          <w:rFonts w:asciiTheme="minorHAnsi" w:eastAsia="Garamond" w:hAnsiTheme="minorHAnsi" w:cstheme="minorHAnsi"/>
-          <w:b/>
-        </w:rPr>
-        <w:t xml:space="preserve">                                                  </w:t>
-      </w:r>
-    </w:p>
-    <w:p>
-      <w:pPr>
-        <w:spacing w:line="240" w:lineRule="auto"/>
-        <w:ind w:left="720"/>
-        <w:contextualSpacing/>
-        <w:rPr>
-          <w:rFonts w:asciiTheme="minorHAnsi" w:eastAsia="Times New Roman" w:hAnsiTheme="minorHAnsi" w:cstheme="minorHAnsi"/>
         </w:rPr>
       </w:pPr>
       <w:r>
@@ -809,35 +878,19 @@
         <w:rPr>
           <w:rFonts w:asciiTheme="minorHAnsi" w:eastAsia="Times New Roman" w:hAnsiTheme="minorHAnsi" w:cstheme="minorHAnsi"/>
         </w:rPr>
-        <w:t xml:space="preserve">React, </w:t>
-      </w:r>
-      <w:proofErr w:type="spellStart"/>
-      <w:r>
-        <w:rPr>
-          <w:rFonts w:asciiTheme="minorHAnsi" w:eastAsia="Times New Roman" w:hAnsiTheme="minorHAnsi" w:cstheme="minorHAnsi"/>
-        </w:rPr>
-        <w:t>NextJS</w:t>
-      </w:r>
-      <w:proofErr w:type="spellEnd"/>
-      <w:r>
-        <w:rPr>
-          <w:rFonts w:asciiTheme="minorHAnsi" w:eastAsia="Times New Roman" w:hAnsiTheme="minorHAnsi" w:cstheme="minorHAnsi"/>
-        </w:rPr>
-        <w:t xml:space="preserve">, </w:t>
-      </w:r>
-      <w:proofErr w:type="spellStart"/>
-      <w:r>
-        <w:rPr>
-          <w:rFonts w:asciiTheme="minorHAnsi" w:eastAsia="Times New Roman" w:hAnsiTheme="minorHAnsi" w:cstheme="minorHAnsi"/>
-        </w:rPr>
-        <w:t>Supabase</w:t>
-      </w:r>
-      <w:proofErr w:type="spellEnd"/>
-      <w:r>
-        <w:rPr>
-          <w:rFonts w:asciiTheme="minorHAnsi" w:eastAsia="Times New Roman" w:hAnsiTheme="minorHAnsi" w:cstheme="minorHAnsi"/>
-        </w:rPr>
-        <w:t>, Framer</w:t>
+        <w:t>React, Next</w:t>
+      </w:r>
+      <w:r>
+        <w:rPr>
+          <w:rFonts w:asciiTheme="minorHAnsi" w:eastAsia="Times New Roman" w:hAnsiTheme="minorHAnsi" w:cstheme="minorHAnsi"/>
+        </w:rPr>
+        <w:t>.</w:t>
+      </w:r>
+      <w:r>
+        <w:rPr>
+          <w:rFonts w:asciiTheme="minorHAnsi" w:eastAsia="Times New Roman" w:hAnsiTheme="minorHAnsi" w:cstheme="minorHAnsi"/>
+        </w:rPr>
+        <w:t>JS, Supabase, Framer</w:t>
       </w:r>
       <w:r>
         <w:rPr>
@@ -887,35 +940,19 @@
         <w:rPr>
           <w:rFonts w:asciiTheme="minorHAnsi" w:eastAsia="Times New Roman" w:hAnsiTheme="minorHAnsi" w:cstheme="minorHAnsi"/>
         </w:rPr>
-        <w:t xml:space="preserve">in </w:t>
-      </w:r>
-      <w:proofErr w:type="spellStart"/>
-      <w:r>
-        <w:rPr>
-          <w:rFonts w:asciiTheme="minorHAnsi" w:eastAsia="Times New Roman" w:hAnsiTheme="minorHAnsi" w:cstheme="minorHAnsi"/>
-        </w:rPr>
-        <w:t>NextJS</w:t>
-      </w:r>
-      <w:proofErr w:type="spellEnd"/>
-      <w:r>
-        <w:rPr>
-          <w:rFonts w:asciiTheme="minorHAnsi" w:eastAsia="Times New Roman" w:hAnsiTheme="minorHAnsi" w:cstheme="minorHAnsi"/>
-        </w:rPr>
-        <w:t xml:space="preserve"> on the frontend, </w:t>
-      </w:r>
-      <w:proofErr w:type="spellStart"/>
-      <w:r>
-        <w:rPr>
-          <w:rFonts w:asciiTheme="minorHAnsi" w:eastAsia="Times New Roman" w:hAnsiTheme="minorHAnsi" w:cstheme="minorHAnsi"/>
-        </w:rPr>
-        <w:t>Supabase</w:t>
-      </w:r>
-      <w:proofErr w:type="spellEnd"/>
-      <w:r>
-        <w:rPr>
-          <w:rFonts w:asciiTheme="minorHAnsi" w:eastAsia="Times New Roman" w:hAnsiTheme="minorHAnsi" w:cstheme="minorHAnsi"/>
-        </w:rPr>
-        <w:t xml:space="preserve"> </w:t>
+        <w:t>in Next</w:t>
+      </w:r>
+      <w:r>
+        <w:rPr>
+          <w:rFonts w:asciiTheme="minorHAnsi" w:eastAsia="Times New Roman" w:hAnsiTheme="minorHAnsi" w:cstheme="minorHAnsi"/>
+        </w:rPr>
+        <w:t>.</w:t>
+      </w:r>
+      <w:r>
+        <w:rPr>
+          <w:rFonts w:asciiTheme="minorHAnsi" w:eastAsia="Times New Roman" w:hAnsiTheme="minorHAnsi" w:cstheme="minorHAnsi"/>
+        </w:rPr>
+        <w:t xml:space="preserve">JS on the frontend, Supabase </w:t>
       </w:r>
       <w:r>
         <w:rPr>
@@ -947,21 +984,7 @@
         <w:rPr>
           <w:rFonts w:asciiTheme="minorHAnsi" w:eastAsia="Times New Roman" w:hAnsiTheme="minorHAnsi" w:cstheme="minorHAnsi"/>
         </w:rPr>
-        <w:t xml:space="preserve">Used </w:t>
-      </w:r>
-      <w:proofErr w:type="spellStart"/>
-      <w:r>
-        <w:rPr>
-          <w:rFonts w:asciiTheme="minorHAnsi" w:eastAsia="Times New Roman" w:hAnsiTheme="minorHAnsi" w:cstheme="minorHAnsi"/>
-        </w:rPr>
-        <w:t>Supabase</w:t>
-      </w:r>
-      <w:proofErr w:type="spellEnd"/>
-      <w:r>
-        <w:rPr>
-          <w:rFonts w:asciiTheme="minorHAnsi" w:eastAsia="Times New Roman" w:hAnsiTheme="minorHAnsi" w:cstheme="minorHAnsi"/>
-        </w:rPr>
-        <w:t xml:space="preserve"> to track and organize transfer pathway data, helping students identify requirements for their target universities</w:t>
+        <w:t>Used Supabase to track and organize transfer pathway data, helping students identify requirements for their target universities</w:t>
       </w:r>
       <w:r>
         <w:rPr>
@@ -987,25 +1010,7 @@
         <w:rPr>
           <w:rFonts w:asciiTheme="minorHAnsi" w:eastAsia="Times New Roman" w:hAnsiTheme="minorHAnsi" w:cstheme="minorHAnsi"/>
         </w:rPr>
-        <w:t>Built tools for MESA stuff to push out news</w:t>
-      </w:r>
-      <w:r>
-        <w:rPr>
-          <w:rFonts w:asciiTheme="minorHAnsi" w:eastAsia="Times New Roman" w:hAnsiTheme="minorHAnsi" w:cstheme="minorHAnsi"/>
-        </w:rPr>
-        <w:t xml:space="preserve"> </w:t>
-      </w:r>
-      <w:r>
-        <w:rPr>
-          <w:rFonts w:asciiTheme="minorHAnsi" w:eastAsia="Times New Roman" w:hAnsiTheme="minorHAnsi" w:cstheme="minorHAnsi"/>
-        </w:rPr>
-        <w:t>using a</w:t>
-      </w:r>
-      <w:r>
-        <w:rPr>
-          <w:rFonts w:asciiTheme="minorHAnsi" w:eastAsia="Times New Roman" w:hAnsiTheme="minorHAnsi" w:cstheme="minorHAnsi"/>
-        </w:rPr>
-        <w:t xml:space="preserve"> Rich Text Editor using Markdown for ease of creation</w:t>
+        <w:t>Built a Markdown-Based rich text publishing system for MESA Staff to create and distribute student announcements</w:t>
       </w:r>
       <w:r>
         <w:rPr>
@@ -1033,7 +1038,6 @@
           <w:b/>
         </w:rPr>
       </w:pPr>
-      <w:proofErr w:type="spellStart"/>
       <w:r>
         <w:rPr>
           <w:rFonts w:asciiTheme="minorHAnsi" w:eastAsia="Garamond" w:hAnsiTheme="minorHAnsi" w:cstheme="minorHAnsi"/>
@@ -1041,7 +1045,6 @@
         </w:rPr>
         <w:t>MESAMobile</w:t>
       </w:r>
-      <w:proofErr w:type="spellEnd"/>
       <w:r>
         <w:rPr>
           <w:rFonts w:asciiTheme="minorHAnsi" w:eastAsia="Garamond" w:hAnsiTheme="minorHAnsi" w:cstheme="minorHAnsi"/>
@@ -1138,14 +1141,12 @@
         </w:rPr>
         <w:t xml:space="preserve"> mobile companion app to </w:t>
       </w:r>
-      <w:proofErr w:type="spellStart"/>
-      <w:r>
-        <w:rPr>
-          <w:rFonts w:asciiTheme="minorHAnsi" w:eastAsia="Times New Roman" w:hAnsiTheme="minorHAnsi" w:cstheme="minorHAnsi"/>
-        </w:rPr>
-        <w:t>MESAConnect</w:t>
-      </w:r>
-      <w:proofErr w:type="spellEnd"/>
+      <w:r>
+        <w:rPr>
+          <w:rFonts w:asciiTheme="minorHAnsi" w:eastAsia="Times New Roman" w:hAnsiTheme="minorHAnsi" w:cstheme="minorHAnsi"/>
+        </w:rPr>
+        <w:t>MESA Connect</w:t>
+      </w:r>
       <w:r>
         <w:rPr>
           <w:rFonts w:asciiTheme="minorHAnsi" w:eastAsia="Times New Roman" w:hAnsiTheme="minorHAnsi" w:cstheme="minorHAnsi"/>
@@ -1170,51 +1171,7 @@
         <w:rPr>
           <w:rFonts w:asciiTheme="minorHAnsi" w:eastAsia="Times New Roman" w:hAnsiTheme="minorHAnsi" w:cstheme="minorHAnsi"/>
         </w:rPr>
-        <w:t xml:space="preserve">Apple Maps </w:t>
-      </w:r>
-      <w:r>
-        <w:rPr>
-          <w:rFonts w:asciiTheme="minorHAnsi" w:eastAsia="Times New Roman" w:hAnsiTheme="minorHAnsi" w:cstheme="minorHAnsi"/>
-        </w:rPr>
-        <w:t xml:space="preserve">used to </w:t>
-      </w:r>
-      <w:r>
-        <w:rPr>
-          <w:rFonts w:asciiTheme="minorHAnsi" w:eastAsia="Times New Roman" w:hAnsiTheme="minorHAnsi" w:cstheme="minorHAnsi"/>
-        </w:rPr>
-        <w:t>display university locations and information</w:t>
-      </w:r>
-      <w:r>
-        <w:rPr>
-          <w:rFonts w:asciiTheme="minorHAnsi" w:eastAsia="Times New Roman" w:hAnsiTheme="minorHAnsi" w:cstheme="minorHAnsi"/>
-        </w:rPr>
-        <w:t xml:space="preserve"> using the </w:t>
-      </w:r>
-      <w:proofErr w:type="spellStart"/>
-      <w:r>
-        <w:rPr>
-          <w:rFonts w:asciiTheme="minorHAnsi" w:eastAsia="Times New Roman" w:hAnsiTheme="minorHAnsi" w:cstheme="minorHAnsi"/>
-        </w:rPr>
-        <w:t>Axios</w:t>
-      </w:r>
-      <w:proofErr w:type="spellEnd"/>
-      <w:r>
-        <w:rPr>
-          <w:rFonts w:asciiTheme="minorHAnsi" w:eastAsia="Times New Roman" w:hAnsiTheme="minorHAnsi" w:cstheme="minorHAnsi"/>
-        </w:rPr>
-        <w:t xml:space="preserve"> and </w:t>
-      </w:r>
-      <w:r>
-        <w:rPr>
-          <w:rFonts w:asciiTheme="minorHAnsi" w:eastAsia="Times New Roman" w:hAnsiTheme="minorHAnsi" w:cstheme="minorHAnsi"/>
-        </w:rPr>
-        <w:t>REST API</w:t>
-      </w:r>
-      <w:r>
-        <w:rPr>
-          <w:rFonts w:asciiTheme="minorHAnsi" w:eastAsia="Times New Roman" w:hAnsiTheme="minorHAnsi" w:cstheme="minorHAnsi"/>
-        </w:rPr>
-        <w:t>.</w:t>
+        <w:t>Integrated Apple Maps with REST APIs to display university locations with transfer information.</w:t>
       </w:r>
     </w:p>
     <w:p>
@@ -1249,15 +1206,6 @@
         <w:t>.</w:t>
       </w:r>
     </w:p>
-    <w:p>
-      <w:pPr>
-        <w:spacing w:line="240" w:lineRule="auto"/>
-        <w:contextualSpacing/>
-        <w:rPr>
-          <w:rFonts w:asciiTheme="minorHAnsi" w:eastAsia="Times New Roman" w:hAnsiTheme="minorHAnsi" w:cstheme="minorHAnsi"/>
-        </w:rPr>
-      </w:pPr>
-    </w:p>
     <w:bookmarkEnd w:id="0"/>
     <w:bookmarkEnd w:id="1"/>
     <w:p>
@@ -1290,7 +1238,7 @@
     <w:p>
       <w:pPr>
         <w:spacing w:line="240" w:lineRule="auto"/>
-        <w:ind w:left="720"/>
+        <w:ind w:firstLine="720"/>
         <w:contextualSpacing/>
         <w:rPr>
           <w:rFonts w:asciiTheme="minorHAnsi" w:eastAsia="Times New Roman" w:hAnsiTheme="minorHAnsi" w:cstheme="minorHAnsi"/>
@@ -1299,22 +1247,6 @@
       <w:r>
         <w:rPr>
           <w:rFonts w:asciiTheme="minorHAnsi" w:eastAsia="Times New Roman" w:hAnsiTheme="minorHAnsi" w:cstheme="minorHAnsi"/>
-        </w:rPr>
-        <w:t>Demonstrated excellent teamwork, time management, customer service, and communication skills through the following employment:</w:t>
-      </w:r>
-    </w:p>
-    <w:p>
-      <w:pPr>
-        <w:spacing w:line="240" w:lineRule="auto"/>
-        <w:ind w:left="1440"/>
-        <w:contextualSpacing/>
-        <w:rPr>
-          <w:rFonts w:asciiTheme="minorHAnsi" w:eastAsia="Times New Roman" w:hAnsiTheme="minorHAnsi" w:cstheme="minorHAnsi"/>
-        </w:rPr>
-      </w:pPr>
-      <w:r>
-        <w:rPr>
-          <w:rFonts w:asciiTheme="minorHAnsi" w:eastAsia="Times New Roman" w:hAnsiTheme="minorHAnsi" w:cstheme="minorHAnsi"/>
           <w:b/>
         </w:rPr>
         <w:t xml:space="preserve">Lead Software Developer and </w:t>
@@ -1373,24 +1305,8 @@
         <w:rPr>
           <w:rFonts w:asciiTheme="minorHAnsi" w:eastAsia="Times New Roman" w:hAnsiTheme="minorHAnsi" w:cstheme="minorHAnsi"/>
         </w:rPr>
-        <w:t>(10 to 20 hours/week)</w:t>
-      </w:r>
-      <w:r>
-        <w:rPr>
-          <w:rFonts w:asciiTheme="minorHAnsi" w:eastAsia="Times New Roman" w:hAnsiTheme="minorHAnsi" w:cstheme="minorHAnsi"/>
-        </w:rPr>
         <w:tab/>
       </w:r>
-    </w:p>
-    <w:p>
-      <w:pPr>
-        <w:spacing w:line="240" w:lineRule="auto"/>
-        <w:ind w:left="1440"/>
-        <w:contextualSpacing/>
-        <w:rPr>
-          <w:rFonts w:asciiTheme="minorHAnsi" w:eastAsia="Times New Roman" w:hAnsiTheme="minorHAnsi" w:cstheme="minorHAnsi"/>
-        </w:rPr>
-      </w:pPr>
       <w:r>
         <w:rPr>
           <w:rFonts w:asciiTheme="minorHAnsi" w:eastAsia="Times New Roman" w:hAnsiTheme="minorHAnsi" w:cstheme="minorHAnsi"/>
@@ -1401,25 +1317,56 @@
         <w:rPr>
           <w:rFonts w:asciiTheme="minorHAnsi" w:eastAsia="Times New Roman" w:hAnsiTheme="minorHAnsi" w:cstheme="minorHAnsi"/>
         </w:rPr>
+        <w:tab/>
+      </w:r>
+      <w:r>
+        <w:rPr>
+          <w:rFonts w:asciiTheme="minorHAnsi" w:eastAsia="Times New Roman" w:hAnsiTheme="minorHAnsi" w:cstheme="minorHAnsi"/>
+        </w:rPr>
+        <w:tab/>
+        <w:t xml:space="preserve"> </w:t>
+      </w:r>
+      <w:r>
+        <w:rPr>
+          <w:rFonts w:asciiTheme="minorHAnsi" w:eastAsia="Times New Roman" w:hAnsiTheme="minorHAnsi" w:cstheme="minorHAnsi"/>
+        </w:rPr>
+        <w:t xml:space="preserve">   </w:t>
+      </w:r>
+      <w:r>
+        <w:rPr>
+          <w:rFonts w:asciiTheme="minorHAnsi" w:eastAsia="Times New Roman" w:hAnsiTheme="minorHAnsi" w:cstheme="minorHAnsi"/>
+        </w:rPr>
+        <w:t xml:space="preserve">  </w:t>
+      </w:r>
+      <w:r>
+        <w:rPr>
+          <w:rFonts w:asciiTheme="minorHAnsi" w:eastAsia="Times New Roman" w:hAnsiTheme="minorHAnsi" w:cstheme="minorHAnsi"/>
+        </w:rPr>
+        <w:t xml:space="preserve">Dec </w:t>
+      </w:r>
+      <w:r>
+        <w:rPr>
+          <w:rFonts w:asciiTheme="minorHAnsi" w:eastAsia="Times New Roman" w:hAnsiTheme="minorHAnsi" w:cstheme="minorHAnsi"/>
+        </w:rPr>
         <w:t>2023</w:t>
       </w:r>
       <w:r>
         <w:rPr>
           <w:rFonts w:asciiTheme="minorHAnsi" w:eastAsia="Times New Roman" w:hAnsiTheme="minorHAnsi" w:cstheme="minorHAnsi"/>
         </w:rPr>
-        <w:t xml:space="preserve"> </w:t>
-      </w:r>
-      <w:r>
-        <w:rPr>
-          <w:rFonts w:asciiTheme="minorHAnsi" w:eastAsia="Times New Roman" w:hAnsiTheme="minorHAnsi" w:cstheme="minorHAnsi"/>
-        </w:rPr>
         <w:t>–</w:t>
       </w:r>
       <w:r>
         <w:rPr>
           <w:rFonts w:asciiTheme="minorHAnsi" w:eastAsia="Times New Roman" w:hAnsiTheme="minorHAnsi" w:cstheme="minorHAnsi"/>
         </w:rPr>
-        <w:t xml:space="preserve"> 20</w:t>
+        <w:t xml:space="preserve">May </w:t>
+      </w:r>
+      <w:r>
+        <w:rPr>
+          <w:rFonts w:asciiTheme="minorHAnsi" w:eastAsia="Times New Roman" w:hAnsiTheme="minorHAnsi" w:cstheme="minorHAnsi"/>
+        </w:rPr>
+        <w:t>20</w:t>
       </w:r>
       <w:r>
         <w:rPr>
@@ -1447,7 +1394,61 @@
         <w:rPr>
           <w:rFonts w:asciiTheme="minorHAnsi" w:eastAsia="Garamond" w:hAnsiTheme="minorHAnsi" w:cstheme="minorHAnsi"/>
         </w:rPr>
-        <w:t>Tutored and lectured labs to students, such as React, SolidWorks, Unity.</w:t>
+        <w:t xml:space="preserve">Tutored and lectured labs </w:t>
+      </w:r>
+      <w:r>
+        <w:rPr>
+          <w:rFonts w:asciiTheme="minorHAnsi" w:eastAsia="Garamond" w:hAnsiTheme="minorHAnsi" w:cstheme="minorHAnsi"/>
+        </w:rPr>
+        <w:t xml:space="preserve">as part of the </w:t>
+      </w:r>
+      <w:r>
+        <w:rPr>
+          <w:rFonts w:asciiTheme="minorHAnsi" w:eastAsia="Garamond" w:hAnsiTheme="minorHAnsi" w:cstheme="minorHAnsi"/>
+        </w:rPr>
+        <w:t>Latinx</w:t>
+      </w:r>
+      <w:r>
+        <w:rPr>
+          <w:rFonts w:asciiTheme="minorHAnsi" w:eastAsia="Garamond" w:hAnsiTheme="minorHAnsi" w:cstheme="minorHAnsi"/>
+        </w:rPr>
+        <w:t xml:space="preserve"> program, which helped</w:t>
+      </w:r>
+      <w:r>
+        <w:rPr>
+          <w:rFonts w:asciiTheme="minorHAnsi" w:eastAsia="Garamond" w:hAnsiTheme="minorHAnsi" w:cstheme="minorHAnsi"/>
+        </w:rPr>
+        <w:t xml:space="preserve"> </w:t>
+      </w:r>
+      <w:r>
+        <w:rPr>
+          <w:rFonts w:asciiTheme="minorHAnsi" w:eastAsia="Garamond" w:hAnsiTheme="minorHAnsi" w:cstheme="minorHAnsi"/>
+        </w:rPr>
+        <w:t xml:space="preserve">incoming </w:t>
+      </w:r>
+      <w:r>
+        <w:rPr>
+          <w:rFonts w:asciiTheme="minorHAnsi" w:eastAsia="Garamond" w:hAnsiTheme="minorHAnsi" w:cstheme="minorHAnsi"/>
+        </w:rPr>
+        <w:t xml:space="preserve">students </w:t>
+      </w:r>
+      <w:r>
+        <w:rPr>
+          <w:rFonts w:asciiTheme="minorHAnsi" w:eastAsia="Garamond" w:hAnsiTheme="minorHAnsi" w:cstheme="minorHAnsi"/>
+        </w:rPr>
+        <w:t xml:space="preserve">from the Hispanic community </w:t>
+      </w:r>
+      <w:r>
+        <w:rPr>
+          <w:rFonts w:asciiTheme="minorHAnsi" w:eastAsia="Garamond" w:hAnsiTheme="minorHAnsi" w:cstheme="minorHAnsi"/>
+        </w:rPr>
+        <w:t>learn tools</w:t>
+      </w:r>
+      <w:r>
+        <w:rPr>
+          <w:rFonts w:asciiTheme="minorHAnsi" w:eastAsia="Garamond" w:hAnsiTheme="minorHAnsi" w:cstheme="minorHAnsi"/>
+        </w:rPr>
+        <w:t xml:space="preserve"> such as React, SolidWorks, Unity.</w:t>
       </w:r>
     </w:p>
     <w:p>
@@ -1491,16 +1492,16 @@
         <w:rPr>
           <w:rFonts w:asciiTheme="minorHAnsi" w:eastAsia="Garamond" w:hAnsiTheme="minorHAnsi" w:cstheme="minorHAnsi"/>
         </w:rPr>
-        <w:t>Worked on various projects, such as a mobile app for students, a website, as well as did work on the official MESA COC Website.</w:t>
+        <w:t>Worked on various projects as well as did work on the official MESA COC Website.</w:t>
       </w:r>
     </w:p>
     <w:p>
       <w:pPr>
         <w:spacing w:line="240" w:lineRule="auto"/>
-        <w:ind w:left="1440"/>
         <w:contextualSpacing/>
         <w:rPr>
-          <w:rFonts w:asciiTheme="minorHAnsi" w:eastAsia="Times New Roman" w:hAnsiTheme="minorHAnsi" w:cstheme="minorHAnsi"/>
+          <w:rFonts w:asciiTheme="minorHAnsi" w:eastAsia="Garamond" w:hAnsiTheme="minorHAnsi" w:cstheme="minorHAnsi"/>
+          <w:b/>
         </w:rPr>
       </w:pPr>
     </w:p>
@@ -1510,17 +1511,6 @@
         <w:contextualSpacing/>
         <w:rPr>
           <w:rFonts w:asciiTheme="minorHAnsi" w:eastAsia="Garamond" w:hAnsiTheme="minorHAnsi" w:cstheme="minorHAnsi"/>
-          <w:b/>
-        </w:rPr>
-      </w:pPr>
-    </w:p>
-    <w:p>
-      <w:pPr>
-        <w:spacing w:line="240" w:lineRule="auto"/>
-        <w:contextualSpacing/>
-        <w:rPr>
-          <w:rFonts w:asciiTheme="minorHAnsi" w:eastAsia="Garamond" w:hAnsiTheme="minorHAnsi" w:cstheme="minorHAnsi"/>
-          <w:b/>
         </w:rPr>
       </w:pPr>
       <w:r>
@@ -1529,6 +1519,12 @@
           <w:b/>
         </w:rPr>
         <w:t>CAMPUS INVOLVEMENT/VOLUNTEER WORK</w:t>
+      </w:r>
+      <w:r>
+        <w:rPr>
+          <w:rFonts w:asciiTheme="minorHAnsi" w:eastAsia="Garamond" w:hAnsiTheme="minorHAnsi" w:cstheme="minorHAnsi"/>
+        </w:rPr>
+        <w:tab/>
       </w:r>
     </w:p>
     <w:p>
@@ -1549,33 +1545,13 @@
           <w:b/>
           <w:bCs/>
         </w:rPr>
-        <w:t>MESA</w:t>
-      </w:r>
-      <w:r>
-        <w:rPr>
-          <w:rFonts w:asciiTheme="minorHAnsi" w:eastAsia="Garamond" w:hAnsiTheme="minorHAnsi" w:cstheme="minorHAnsi"/>
-          <w:b/>
-          <w:bCs/>
-        </w:rPr>
-        <w:t xml:space="preserve">, </w:t>
-      </w:r>
-      <w:r>
-        <w:rPr>
-          <w:rFonts w:asciiTheme="minorHAnsi" w:eastAsia="Garamond" w:hAnsiTheme="minorHAnsi" w:cstheme="minorHAnsi"/>
-        </w:rPr>
-        <w:t xml:space="preserve">Member and Intern            </w:t>
-      </w:r>
-      <w:r>
-        <w:rPr>
-          <w:rFonts w:asciiTheme="minorHAnsi" w:eastAsia="Garamond" w:hAnsiTheme="minorHAnsi" w:cstheme="minorHAnsi"/>
-        </w:rPr>
-        <w:tab/>
-      </w:r>
-      <w:r>
-        <w:rPr>
-          <w:rFonts w:asciiTheme="minorHAnsi" w:eastAsia="Garamond" w:hAnsiTheme="minorHAnsi" w:cstheme="minorHAnsi"/>
-        </w:rPr>
-        <w:tab/>
+        <w:t xml:space="preserve">HACKMESA, </w:t>
+      </w:r>
+      <w:r>
+        <w:rPr>
+          <w:rFonts w:asciiTheme="minorHAnsi" w:eastAsia="Garamond" w:hAnsiTheme="minorHAnsi" w:cstheme="minorHAnsi"/>
+        </w:rPr>
+        <w:t>Announcer and Lead Backend Engineer</w:t>
       </w:r>
       <w:r>
         <w:rPr>
@@ -1604,84 +1580,15 @@
       </w:r>
       <w:r>
         <w:rPr>
-          <w:rFonts w:asciiTheme="minorHAnsi" w:eastAsia="Times New Roman" w:hAnsiTheme="minorHAnsi" w:cstheme="minorHAnsi"/>
-        </w:rPr>
-        <w:t>Sep 2023-May 2026</w:t>
-      </w:r>
-    </w:p>
-    <w:p>
-      <w:pPr>
-        <w:tabs>
-          <w:tab w:val="left" w:pos="1080"/>
-        </w:tabs>
-        <w:spacing w:line="240" w:lineRule="auto"/>
-        <w:ind w:left="720"/>
-        <w:rPr>
-          <w:rFonts w:asciiTheme="minorHAnsi" w:eastAsia="Garamond" w:hAnsiTheme="minorHAnsi" w:cstheme="minorHAnsi"/>
-        </w:rPr>
-      </w:pPr>
-      <w:r>
-        <w:rPr>
-          <w:rFonts w:asciiTheme="minorHAnsi" w:eastAsia="Garamond" w:hAnsiTheme="minorHAnsi" w:cstheme="minorHAnsi"/>
-          <w:b/>
-          <w:bCs/>
-        </w:rPr>
-        <w:t>COC Tech Club</w:t>
-      </w:r>
-      <w:r>
-        <w:rPr>
-          <w:rFonts w:asciiTheme="minorHAnsi" w:eastAsia="Garamond" w:hAnsiTheme="minorHAnsi" w:cstheme="minorHAnsi"/>
-        </w:rPr>
-        <w:t>, President</w:t>
-      </w:r>
-      <w:r>
-        <w:rPr>
-          <w:rFonts w:asciiTheme="minorHAnsi" w:eastAsia="Garamond" w:hAnsiTheme="minorHAnsi" w:cstheme="minorHAnsi"/>
-        </w:rPr>
-        <w:t xml:space="preserve">                       </w:t>
-      </w:r>
-      <w:r>
-        <w:rPr>
-          <w:rFonts w:asciiTheme="minorHAnsi" w:eastAsia="Garamond" w:hAnsiTheme="minorHAnsi" w:cstheme="minorHAnsi"/>
-        </w:rPr>
-        <w:tab/>
-      </w:r>
-      <w:r>
-        <w:rPr>
-          <w:rFonts w:asciiTheme="minorHAnsi" w:eastAsia="Garamond" w:hAnsiTheme="minorHAnsi" w:cstheme="minorHAnsi"/>
-        </w:rPr>
-        <w:tab/>
-      </w:r>
-      <w:r>
-        <w:rPr>
-          <w:rFonts w:asciiTheme="minorHAnsi" w:eastAsia="Garamond" w:hAnsiTheme="minorHAnsi" w:cstheme="minorHAnsi"/>
-        </w:rPr>
-        <w:tab/>
-      </w:r>
-      <w:r>
-        <w:rPr>
-          <w:rFonts w:asciiTheme="minorHAnsi" w:eastAsia="Garamond" w:hAnsiTheme="minorHAnsi" w:cstheme="minorHAnsi"/>
-        </w:rPr>
-        <w:tab/>
-      </w:r>
-      <w:r>
-        <w:rPr>
-          <w:rFonts w:asciiTheme="minorHAnsi" w:eastAsia="Garamond" w:hAnsiTheme="minorHAnsi" w:cstheme="minorHAnsi"/>
-        </w:rPr>
-        <w:tab/>
-      </w:r>
-      <w:r>
-        <w:rPr>
-          <w:rFonts w:asciiTheme="minorHAnsi" w:eastAsia="Garamond" w:hAnsiTheme="minorHAnsi" w:cstheme="minorHAnsi"/>
-        </w:rPr>
-        <w:tab/>
-        <w:t xml:space="preserve">     </w:t>
-      </w:r>
-      <w:r>
-        <w:rPr>
-          <w:rFonts w:asciiTheme="minorHAnsi" w:eastAsia="Times New Roman" w:hAnsiTheme="minorHAnsi" w:cstheme="minorHAnsi"/>
-        </w:rPr>
-        <w:t>Aug 2023-May 2026</w:t>
+          <w:rFonts w:asciiTheme="minorHAnsi" w:eastAsia="Garamond" w:hAnsiTheme="minorHAnsi" w:cstheme="minorHAnsi"/>
+        </w:rPr>
+        <w:t xml:space="preserve">                   </w:t>
+      </w:r>
+      <w:r>
+        <w:rPr>
+          <w:rFonts w:asciiTheme="minorHAnsi" w:eastAsia="Garamond" w:hAnsiTheme="minorHAnsi" w:cstheme="minorHAnsi"/>
+        </w:rPr>
+        <w:t>Jan 2026-Apr 2026</w:t>
       </w:r>
     </w:p>
     <w:p>
@@ -1703,19 +1610,95 @@
         <w:rPr>
           <w:rFonts w:asciiTheme="minorHAnsi" w:eastAsia="Garamond" w:hAnsiTheme="minorHAnsi" w:cstheme="minorHAnsi"/>
         </w:rPr>
-        <w:t xml:space="preserve">Founding Member in the Club in 2023 as a </w:t>
-      </w:r>
-      <w:r>
-        <w:rPr>
-          <w:rFonts w:asciiTheme="minorHAnsi" w:eastAsia="Garamond" w:hAnsiTheme="minorHAnsi" w:cstheme="minorHAnsi"/>
-        </w:rPr>
-        <w:t>student</w:t>
-      </w:r>
-      <w:r>
-        <w:rPr>
-          <w:rFonts w:asciiTheme="minorHAnsi" w:eastAsia="Garamond" w:hAnsiTheme="minorHAnsi" w:cstheme="minorHAnsi"/>
-        </w:rPr>
-        <w:t>.</w:t>
+        <w:t>Oversaw making sure the backend was stable, supporting an event that was attended by over 100 community college students.</w:t>
+      </w:r>
+      <w:r>
+        <w:rPr>
+          <w:rFonts w:asciiTheme="minorHAnsi" w:eastAsia="Garamond" w:hAnsiTheme="minorHAnsi" w:cstheme="minorHAnsi"/>
+        </w:rPr>
+        <w:tab/>
+        <w:t xml:space="preserve">     </w:t>
+      </w:r>
+    </w:p>
+    <w:p>
+      <w:pPr>
+        <w:tabs>
+          <w:tab w:val="left" w:pos="1080"/>
+        </w:tabs>
+        <w:spacing w:line="240" w:lineRule="auto"/>
+        <w:ind w:left="720"/>
+        <w:rPr>
+          <w:rFonts w:asciiTheme="minorHAnsi" w:eastAsia="Garamond" w:hAnsiTheme="minorHAnsi" w:cstheme="minorHAnsi"/>
+        </w:rPr>
+      </w:pPr>
+      <w:r>
+        <w:rPr>
+          <w:rFonts w:asciiTheme="minorHAnsi" w:eastAsia="Garamond" w:hAnsiTheme="minorHAnsi" w:cstheme="minorHAnsi"/>
+          <w:b/>
+          <w:bCs/>
+        </w:rPr>
+        <w:t>COC Tech Club</w:t>
+      </w:r>
+      <w:r>
+        <w:rPr>
+          <w:rFonts w:asciiTheme="minorHAnsi" w:eastAsia="Garamond" w:hAnsiTheme="minorHAnsi" w:cstheme="minorHAnsi"/>
+        </w:rPr>
+        <w:t>, President</w:t>
+      </w:r>
+      <w:r>
+        <w:rPr>
+          <w:rFonts w:asciiTheme="minorHAnsi" w:eastAsia="Garamond" w:hAnsiTheme="minorHAnsi" w:cstheme="minorHAnsi"/>
+        </w:rPr>
+        <w:t xml:space="preserve">                       </w:t>
+      </w:r>
+      <w:r>
+        <w:rPr>
+          <w:rFonts w:asciiTheme="minorHAnsi" w:eastAsia="Garamond" w:hAnsiTheme="minorHAnsi" w:cstheme="minorHAnsi"/>
+        </w:rPr>
+        <w:tab/>
+      </w:r>
+      <w:r>
+        <w:rPr>
+          <w:rFonts w:asciiTheme="minorHAnsi" w:eastAsia="Garamond" w:hAnsiTheme="minorHAnsi" w:cstheme="minorHAnsi"/>
+        </w:rPr>
+        <w:tab/>
+      </w:r>
+      <w:r>
+        <w:rPr>
+          <w:rFonts w:asciiTheme="minorHAnsi" w:eastAsia="Garamond" w:hAnsiTheme="minorHAnsi" w:cstheme="minorHAnsi"/>
+        </w:rPr>
+        <w:tab/>
+      </w:r>
+      <w:r>
+        <w:rPr>
+          <w:rFonts w:asciiTheme="minorHAnsi" w:eastAsia="Garamond" w:hAnsiTheme="minorHAnsi" w:cstheme="minorHAnsi"/>
+        </w:rPr>
+        <w:tab/>
+      </w:r>
+      <w:r>
+        <w:rPr>
+          <w:rFonts w:asciiTheme="minorHAnsi" w:eastAsia="Garamond" w:hAnsiTheme="minorHAnsi" w:cstheme="minorHAnsi"/>
+        </w:rPr>
+        <w:tab/>
+      </w:r>
+      <w:r>
+        <w:rPr>
+          <w:rFonts w:asciiTheme="minorHAnsi" w:eastAsia="Garamond" w:hAnsiTheme="minorHAnsi" w:cstheme="minorHAnsi"/>
+        </w:rPr>
+        <w:tab/>
+        <w:t xml:space="preserve">     </w:t>
+      </w:r>
+      <w:r>
+        <w:rPr>
+          <w:rFonts w:asciiTheme="minorHAnsi" w:eastAsia="Garamond" w:hAnsiTheme="minorHAnsi" w:cstheme="minorHAnsi"/>
+        </w:rPr>
+        <w:t xml:space="preserve">                </w:t>
+      </w:r>
+      <w:r>
+        <w:rPr>
+          <w:rFonts w:asciiTheme="minorHAnsi" w:eastAsia="Times New Roman" w:hAnsiTheme="minorHAnsi" w:cstheme="minorHAnsi"/>
+        </w:rPr>
+        <w:t>Aug 2023-May 2026</w:t>
       </w:r>
     </w:p>
     <w:p>
@@ -1737,36 +1720,19 @@
         <w:rPr>
           <w:rFonts w:asciiTheme="minorHAnsi" w:eastAsia="Garamond" w:hAnsiTheme="minorHAnsi" w:cstheme="minorHAnsi"/>
         </w:rPr>
-        <w:t>2024-2025 school year volunteered as a Web Development Lead.</w:t>
-      </w:r>
-    </w:p>
-    <w:p>
-      <w:pPr>
-        <w:pStyle w:val="ListParagraph"/>
-        <w:numPr>
-          <w:ilvl w:val="0"/>
-          <w:numId w:val="21"/>
-        </w:numPr>
-        <w:tabs>
-          <w:tab w:val="left" w:pos="1080"/>
-        </w:tabs>
-        <w:spacing w:line="240" w:lineRule="auto"/>
-        <w:rPr>
-          <w:rFonts w:asciiTheme="minorHAnsi" w:eastAsia="Garamond" w:hAnsiTheme="minorHAnsi" w:cstheme="minorHAnsi"/>
-        </w:rPr>
-      </w:pPr>
-      <w:r>
-        <w:rPr>
-          <w:rFonts w:asciiTheme="minorHAnsi" w:eastAsia="Garamond" w:hAnsiTheme="minorHAnsi" w:cstheme="minorHAnsi"/>
-        </w:rPr>
-        <w:lastRenderedPageBreak/>
-        <w:t>2025-2026 became the President of the club</w:t>
-      </w:r>
-      <w:r>
-        <w:rPr>
-          <w:rFonts w:asciiTheme="minorHAnsi" w:eastAsia="Garamond" w:hAnsiTheme="minorHAnsi" w:cstheme="minorHAnsi"/>
-        </w:rPr>
-        <w:t>.</w:t>
+        <w:t xml:space="preserve">Founding Member in the Club in 2023 as a student, </w:t>
+      </w:r>
+      <w:r>
+        <w:rPr>
+          <w:rFonts w:asciiTheme="minorHAnsi" w:eastAsia="Garamond" w:hAnsiTheme="minorHAnsi" w:cstheme="minorHAnsi"/>
+        </w:rPr>
+        <w:t>2025-2026 became the President of the clu</w:t>
+      </w:r>
+      <w:r>
+        <w:rPr>
+          <w:rFonts w:asciiTheme="minorHAnsi" w:eastAsia="Garamond" w:hAnsiTheme="minorHAnsi" w:cstheme="minorHAnsi"/>
+        </w:rPr>
+        <w:t>b, spearheading dozens of members leading to our strongest attendance.</w:t>
       </w:r>
     </w:p>
     <w:p>
@@ -1845,7 +1811,19 @@
         <w:rPr>
           <w:rFonts w:asciiTheme="minorHAnsi" w:eastAsia="Times New Roman" w:hAnsiTheme="minorHAnsi" w:cstheme="minorHAnsi"/>
         </w:rPr>
-        <w:t xml:space="preserve"> Aug 2025-Feb 2026</w:t>
+        <w:t xml:space="preserve"> </w:t>
+      </w:r>
+      <w:r>
+        <w:rPr>
+          <w:rFonts w:asciiTheme="minorHAnsi" w:eastAsia="Times New Roman" w:hAnsiTheme="minorHAnsi" w:cstheme="minorHAnsi"/>
+        </w:rPr>
+        <w:t xml:space="preserve">                  </w:t>
+      </w:r>
+      <w:r>
+        <w:rPr>
+          <w:rFonts w:asciiTheme="minorHAnsi" w:eastAsia="Times New Roman" w:hAnsiTheme="minorHAnsi" w:cstheme="minorHAnsi"/>
+        </w:rPr>
+        <w:t>Aug 2025-Feb 2026</w:t>
       </w:r>
     </w:p>
     <w:p>
@@ -1870,160 +1848,6 @@
         </w:rPr>
         <w:t>Competed at the speech competition in December 2025 at Mt. Sac College, Pomona.</w:t>
       </w:r>
-    </w:p>
-    <w:p>
-      <w:pPr>
-        <w:tabs>
-          <w:tab w:val="left" w:pos="1080"/>
-        </w:tabs>
-        <w:spacing w:line="240" w:lineRule="auto"/>
-        <w:ind w:left="720"/>
-        <w:contextualSpacing/>
-        <w:rPr>
-          <w:rFonts w:asciiTheme="minorHAnsi" w:eastAsia="Garamond" w:hAnsiTheme="minorHAnsi" w:cstheme="minorHAnsi"/>
-        </w:rPr>
-      </w:pPr>
-      <w:r>
-        <w:rPr>
-          <w:rFonts w:asciiTheme="minorHAnsi" w:eastAsia="Garamond" w:hAnsiTheme="minorHAnsi" w:cstheme="minorHAnsi"/>
-          <w:b/>
-          <w:bCs/>
-        </w:rPr>
-        <w:t xml:space="preserve">HACKMESA, </w:t>
-      </w:r>
-      <w:r>
-        <w:rPr>
-          <w:rFonts w:asciiTheme="minorHAnsi" w:eastAsia="Garamond" w:hAnsiTheme="minorHAnsi" w:cstheme="minorHAnsi"/>
-        </w:rPr>
-        <w:t>Announcer and Lead Backend Engineer</w:t>
-      </w:r>
-      <w:r>
-        <w:rPr>
-          <w:rFonts w:asciiTheme="minorHAnsi" w:eastAsia="Garamond" w:hAnsiTheme="minorHAnsi" w:cstheme="minorHAnsi"/>
-        </w:rPr>
-        <w:tab/>
-      </w:r>
-      <w:r>
-        <w:rPr>
-          <w:rFonts w:asciiTheme="minorHAnsi" w:eastAsia="Garamond" w:hAnsiTheme="minorHAnsi" w:cstheme="minorHAnsi"/>
-        </w:rPr>
-        <w:tab/>
-      </w:r>
-      <w:r>
-        <w:rPr>
-          <w:rFonts w:asciiTheme="minorHAnsi" w:eastAsia="Garamond" w:hAnsiTheme="minorHAnsi" w:cstheme="minorHAnsi"/>
-        </w:rPr>
-        <w:tab/>
-      </w:r>
-      <w:r>
-        <w:rPr>
-          <w:rFonts w:asciiTheme="minorHAnsi" w:eastAsia="Garamond" w:hAnsiTheme="minorHAnsi" w:cstheme="minorHAnsi"/>
-        </w:rPr>
-        <w:tab/>
-        <w:t xml:space="preserve">     Jan 2026-Apr 2026</w:t>
-      </w:r>
-    </w:p>
-    <w:p>
-      <w:pPr>
-        <w:pStyle w:val="ListParagraph"/>
-        <w:numPr>
-          <w:ilvl w:val="0"/>
-          <w:numId w:val="21"/>
-        </w:numPr>
-        <w:tabs>
-          <w:tab w:val="left" w:pos="1080"/>
-        </w:tabs>
-        <w:spacing w:line="240" w:lineRule="auto"/>
-        <w:rPr>
-          <w:rFonts w:asciiTheme="minorHAnsi" w:eastAsia="Garamond" w:hAnsiTheme="minorHAnsi" w:cstheme="minorHAnsi"/>
-        </w:rPr>
-      </w:pPr>
-      <w:r>
-        <w:rPr>
-          <w:rFonts w:asciiTheme="minorHAnsi" w:eastAsia="Garamond" w:hAnsiTheme="minorHAnsi" w:cstheme="minorHAnsi"/>
-        </w:rPr>
-        <w:t xml:space="preserve">Helped organize a hackathon for community college students at the LAAC; </w:t>
-      </w:r>
-      <w:r>
-        <w:rPr>
-          <w:rFonts w:asciiTheme="minorHAnsi" w:eastAsia="Garamond" w:hAnsiTheme="minorHAnsi" w:cstheme="minorHAnsi"/>
-        </w:rPr>
-        <w:t>attendance of over 100 students.</w:t>
-      </w:r>
-    </w:p>
-    <w:p>
-      <w:pPr>
-        <w:pStyle w:val="ListParagraph"/>
-        <w:numPr>
-          <w:ilvl w:val="0"/>
-          <w:numId w:val="21"/>
-        </w:numPr>
-        <w:tabs>
-          <w:tab w:val="left" w:pos="1080"/>
-        </w:tabs>
-        <w:spacing w:line="240" w:lineRule="auto"/>
-        <w:rPr>
-          <w:rFonts w:asciiTheme="minorHAnsi" w:eastAsia="Garamond" w:hAnsiTheme="minorHAnsi" w:cstheme="minorHAnsi"/>
-        </w:rPr>
-      </w:pPr>
-      <w:proofErr w:type="gramStart"/>
-      <w:r>
-        <w:rPr>
-          <w:rFonts w:asciiTheme="minorHAnsi" w:eastAsia="Garamond" w:hAnsiTheme="minorHAnsi" w:cstheme="minorHAnsi"/>
-        </w:rPr>
-        <w:t>Was in charge of</w:t>
-      </w:r>
-      <w:proofErr w:type="gramEnd"/>
-      <w:r>
-        <w:rPr>
-          <w:rFonts w:asciiTheme="minorHAnsi" w:eastAsia="Garamond" w:hAnsiTheme="minorHAnsi" w:cstheme="minorHAnsi"/>
-        </w:rPr>
-        <w:t xml:space="preserve"> making sure the backend was stable.</w:t>
-      </w:r>
-    </w:p>
-    <w:p>
-      <w:pPr>
-        <w:pStyle w:val="ListParagraph"/>
-        <w:numPr>
-          <w:ilvl w:val="0"/>
-          <w:numId w:val="21"/>
-        </w:numPr>
-        <w:tabs>
-          <w:tab w:val="left" w:pos="1080"/>
-        </w:tabs>
-        <w:spacing w:line="240" w:lineRule="auto"/>
-        <w:rPr>
-          <w:rFonts w:asciiTheme="minorHAnsi" w:eastAsia="Garamond" w:hAnsiTheme="minorHAnsi" w:cstheme="minorHAnsi"/>
-        </w:rPr>
-      </w:pPr>
-      <w:r>
-        <w:rPr>
-          <w:rFonts w:asciiTheme="minorHAnsi" w:eastAsia="Garamond" w:hAnsiTheme="minorHAnsi" w:cstheme="minorHAnsi"/>
-        </w:rPr>
-        <w:t>Did some of the announcement work during the hackathon.</w:t>
-      </w:r>
-    </w:p>
-    <w:p>
-      <w:pPr>
-        <w:tabs>
-          <w:tab w:val="left" w:pos="1080"/>
-        </w:tabs>
-        <w:spacing w:line="240" w:lineRule="auto"/>
-        <w:rPr>
-          <w:rFonts w:asciiTheme="minorHAnsi" w:eastAsia="Garamond" w:hAnsiTheme="minorHAnsi" w:cstheme="minorHAnsi"/>
-        </w:rPr>
-      </w:pPr>
-    </w:p>
-    <w:p>
-      <w:pPr>
-        <w:tabs>
-          <w:tab w:val="left" w:pos="1080"/>
-        </w:tabs>
-        <w:spacing w:line="240" w:lineRule="auto"/>
-        <w:rPr>
-          <w:rFonts w:asciiTheme="minorHAnsi" w:eastAsia="Garamond" w:hAnsiTheme="minorHAnsi" w:cstheme="minorHAnsi"/>
-        </w:rPr>
-      </w:pPr>
     </w:p>
     <w:sectPr>
       <w:pgSz w:w="12240" w:h="15840"/>

</xml_diff>

<commit_message>
Color Scheme and Font Changes + new nav
</commit_message>
<xml_diff>
--- a/public/Resume.docx
+++ b/public/Resume.docx
@@ -7,7 +7,7 @@
         <w:spacing w:line="240" w:lineRule="auto"/>
         <w:jc w:val="center"/>
         <w:rPr>
-          <w:rFonts w:ascii="Arial Black" w:eastAsia="Garamond" w:hAnsi="Arial Black" w:cs="Garamond"/>
+          <w:rFonts w:ascii="Times New Roman" w:eastAsia="Garamond" w:hAnsi="Times New Roman" w:cs="Times New Roman"/>
           <w:b/>
           <w:sz w:val="32"/>
           <w:szCs w:val="32"/>
@@ -19,7 +19,7 @@
         <w:spacing w:line="240" w:lineRule="auto"/>
         <w:jc w:val="center"/>
         <w:rPr>
-          <w:rFonts w:asciiTheme="minorHAnsi" w:eastAsia="Garamond" w:hAnsiTheme="minorHAnsi" w:cstheme="minorHAnsi"/>
+          <w:rFonts w:ascii="Times New Roman" w:eastAsia="Garamond" w:hAnsi="Times New Roman" w:cs="Times New Roman"/>
           <w:b/>
           <w:sz w:val="36"/>
           <w:szCs w:val="36"/>
@@ -27,7 +27,7 @@
       </w:pPr>
       <w:r>
         <w:rPr>
-          <w:rFonts w:asciiTheme="minorHAnsi" w:eastAsia="Garamond" w:hAnsiTheme="minorHAnsi" w:cstheme="minorHAnsi"/>
+          <w:rFonts w:ascii="Times New Roman" w:eastAsia="Garamond" w:hAnsi="Times New Roman" w:cs="Times New Roman"/>
           <w:b/>
           <w:sz w:val="36"/>
           <w:szCs w:val="36"/>
@@ -40,86 +40,90 @@
         <w:spacing w:line="240" w:lineRule="auto"/>
         <w:jc w:val="center"/>
         <w:rPr>
-          <w:rFonts w:asciiTheme="minorHAnsi" w:eastAsia="Times New Roman" w:hAnsiTheme="minorHAnsi" w:cstheme="minorHAnsi"/>
+          <w:rFonts w:ascii="Times New Roman" w:eastAsia="Times New Roman" w:hAnsi="Times New Roman" w:cs="Times New Roman"/>
         </w:rPr>
       </w:pPr>
       <w:hyperlink r:id="rId5" w:history="1">
         <w:r>
           <w:rPr>
             <w:rStyle w:val="Hyperlink"/>
-            <w:rFonts w:asciiTheme="minorHAnsi" w:eastAsia="Times New Roman" w:hAnsiTheme="minorHAnsi" w:cstheme="minorHAnsi"/>
+            <w:rFonts w:ascii="Times New Roman" w:eastAsia="Times New Roman" w:hAnsi="Times New Roman" w:cs="Times New Roman"/>
           </w:rPr>
           <w:t>jrashtia@calpoly.edu</w:t>
         </w:r>
       </w:hyperlink>
       <w:r>
         <w:rPr>
-          <w:rFonts w:asciiTheme="minorHAnsi" w:eastAsia="Times New Roman" w:hAnsiTheme="minorHAnsi" w:cstheme="minorHAnsi"/>
+          <w:rFonts w:ascii="Times New Roman" w:eastAsia="Times New Roman" w:hAnsi="Times New Roman" w:cs="Times New Roman"/>
         </w:rPr>
         <w:t xml:space="preserve"> | </w:t>
       </w:r>
       <w:r>
         <w:rPr>
-          <w:rFonts w:asciiTheme="minorHAnsi" w:eastAsia="Times New Roman" w:hAnsiTheme="minorHAnsi" w:cstheme="minorHAnsi"/>
+          <w:rFonts w:ascii="Times New Roman" w:eastAsia="Times New Roman" w:hAnsi="Times New Roman" w:cs="Times New Roman"/>
         </w:rPr>
         <w:t>661.510.0261</w:t>
       </w:r>
       <w:r>
         <w:rPr>
-          <w:rFonts w:asciiTheme="minorHAnsi" w:eastAsia="Times New Roman" w:hAnsiTheme="minorHAnsi" w:cstheme="minorHAnsi"/>
+          <w:rFonts w:ascii="Times New Roman" w:eastAsia="Times New Roman" w:hAnsi="Times New Roman" w:cs="Times New Roman"/>
         </w:rPr>
         <w:t xml:space="preserve"> | </w:t>
       </w:r>
       <w:r>
         <w:rPr>
-          <w:rFonts w:asciiTheme="minorHAnsi" w:eastAsia="Times New Roman" w:hAnsiTheme="minorHAnsi" w:cstheme="minorHAnsi"/>
+          <w:rFonts w:ascii="Times New Roman" w:eastAsia="Times New Roman" w:hAnsi="Times New Roman" w:cs="Times New Roman"/>
         </w:rPr>
         <w:t>github.com/</w:t>
       </w:r>
-      <w:r>
-        <w:rPr>
-          <w:rFonts w:asciiTheme="minorHAnsi" w:eastAsia="Times New Roman" w:hAnsiTheme="minorHAnsi" w:cstheme="minorHAnsi"/>
+      <w:proofErr w:type="spellStart"/>
+      <w:r>
+        <w:rPr>
+          <w:rFonts w:ascii="Times New Roman" w:eastAsia="Times New Roman" w:hAnsi="Times New Roman" w:cs="Times New Roman"/>
         </w:rPr>
         <w:t>joshrashtian</w:t>
       </w:r>
-      <w:r>
-        <w:rPr>
-          <w:rFonts w:asciiTheme="minorHAnsi" w:eastAsia="Times New Roman" w:hAnsiTheme="minorHAnsi" w:cstheme="minorHAnsi"/>
+      <w:proofErr w:type="spellEnd"/>
+      <w:r>
+        <w:rPr>
+          <w:rFonts w:ascii="Times New Roman" w:eastAsia="Times New Roman" w:hAnsi="Times New Roman" w:cs="Times New Roman"/>
         </w:rPr>
         <w:t xml:space="preserve"> | linked</w:t>
       </w:r>
       <w:r>
         <w:rPr>
-          <w:rFonts w:asciiTheme="minorHAnsi" w:eastAsia="Times New Roman" w:hAnsiTheme="minorHAnsi" w:cstheme="minorHAnsi"/>
+          <w:rFonts w:ascii="Times New Roman" w:eastAsia="Times New Roman" w:hAnsi="Times New Roman" w:cs="Times New Roman"/>
         </w:rPr>
         <w:t>i</w:t>
       </w:r>
       <w:r>
         <w:rPr>
-          <w:rFonts w:asciiTheme="minorHAnsi" w:eastAsia="Times New Roman" w:hAnsiTheme="minorHAnsi" w:cstheme="minorHAnsi"/>
+          <w:rFonts w:ascii="Times New Roman" w:eastAsia="Times New Roman" w:hAnsi="Times New Roman" w:cs="Times New Roman"/>
         </w:rPr>
         <w:t>n.com/in/</w:t>
       </w:r>
-      <w:r>
-        <w:rPr>
-          <w:rFonts w:asciiTheme="minorHAnsi" w:eastAsia="Times New Roman" w:hAnsiTheme="minorHAnsi" w:cstheme="minorHAnsi"/>
+      <w:proofErr w:type="spellStart"/>
+      <w:r>
+        <w:rPr>
+          <w:rFonts w:ascii="Times New Roman" w:eastAsia="Times New Roman" w:hAnsi="Times New Roman" w:cs="Times New Roman"/>
         </w:rPr>
         <w:t>joshrashtian</w:t>
       </w:r>
+      <w:proofErr w:type="spellEnd"/>
     </w:p>
     <w:p>
       <w:pPr>
         <w:spacing w:line="240" w:lineRule="auto"/>
         <w:jc w:val="center"/>
         <w:rPr>
-          <w:rFonts w:asciiTheme="minorHAnsi" w:eastAsia="Garamond" w:hAnsiTheme="minorHAnsi" w:cstheme="minorHAnsi"/>
+          <w:rFonts w:ascii="Times New Roman" w:eastAsia="Garamond" w:hAnsi="Times New Roman" w:cs="Times New Roman"/>
           <w:b/>
           <w:u w:val="single"/>
         </w:rPr>
       </w:pPr>
       <w:r>
         <w:rPr>
-          <w:rFonts w:asciiTheme="minorHAnsi" w:hAnsiTheme="minorHAnsi" w:cstheme="minorHAnsi"/>
+          <w:rFonts w:ascii="Times New Roman" w:hAnsi="Times New Roman" w:cs="Times New Roman"/>
           <w:noProof/>
         </w:rPr>
         <w:pict w14:anchorId="7327208B">
@@ -132,12 +136,12 @@
         <w:spacing w:line="240" w:lineRule="auto"/>
         <w:contextualSpacing/>
         <w:rPr>
-          <w:rFonts w:asciiTheme="minorHAnsi" w:eastAsia="Garamond" w:hAnsiTheme="minorHAnsi" w:cstheme="minorHAnsi"/>
-        </w:rPr>
-      </w:pPr>
-      <w:r>
-        <w:rPr>
-          <w:rFonts w:asciiTheme="minorHAnsi" w:eastAsia="Garamond" w:hAnsiTheme="minorHAnsi" w:cstheme="minorHAnsi"/>
+          <w:rFonts w:ascii="Times New Roman" w:eastAsia="Garamond" w:hAnsi="Times New Roman" w:cs="Times New Roman"/>
+        </w:rPr>
+      </w:pPr>
+      <w:r>
+        <w:rPr>
+          <w:rFonts w:ascii="Times New Roman" w:eastAsia="Garamond" w:hAnsi="Times New Roman" w:cs="Times New Roman"/>
           <w:b/>
         </w:rPr>
         <w:t>EDUCATION</w:t>
@@ -149,38 +153,46 @@
         <w:ind w:firstLine="720"/>
         <w:contextualSpacing/>
         <w:rPr>
-          <w:rFonts w:asciiTheme="minorHAnsi" w:eastAsia="Garamond" w:hAnsiTheme="minorHAnsi" w:cstheme="minorHAnsi"/>
-        </w:rPr>
-      </w:pPr>
-      <w:r>
-        <w:rPr>
-          <w:rFonts w:asciiTheme="minorHAnsi" w:eastAsia="Garamond" w:hAnsiTheme="minorHAnsi" w:cstheme="minorHAnsi"/>
-        </w:rPr>
-        <w:t>California Polytechnic State University, San Luis Obispo (Cal Poly)</w:t>
-      </w:r>
-      <w:r>
-        <w:rPr>
-          <w:rFonts w:asciiTheme="minorHAnsi" w:eastAsia="Garamond" w:hAnsiTheme="minorHAnsi" w:cstheme="minorHAnsi"/>
-        </w:rPr>
-        <w:t xml:space="preserve">                                             </w:t>
-      </w:r>
-      <w:r>
-        <w:rPr>
-          <w:rFonts w:asciiTheme="minorHAnsi" w:eastAsia="Garamond" w:hAnsiTheme="minorHAnsi" w:cstheme="minorHAnsi"/>
+          <w:rFonts w:ascii="Times New Roman" w:eastAsia="Garamond" w:hAnsi="Times New Roman" w:cs="Times New Roman"/>
+        </w:rPr>
+      </w:pPr>
+      <w:r>
+        <w:rPr>
+          <w:rFonts w:ascii="Times New Roman" w:eastAsia="Garamond" w:hAnsi="Times New Roman" w:cs="Times New Roman"/>
+        </w:rPr>
+        <w:t xml:space="preserve">California Polytechnic State University, San Luis Obispo (Cal </w:t>
+      </w:r>
+      <w:proofErr w:type="gramStart"/>
+      <w:r>
+        <w:rPr>
+          <w:rFonts w:ascii="Times New Roman" w:eastAsia="Garamond" w:hAnsi="Times New Roman" w:cs="Times New Roman"/>
+        </w:rPr>
+        <w:t>Poly)</w:t>
+      </w:r>
+      <w:r>
+        <w:rPr>
+          <w:rFonts w:ascii="Times New Roman" w:eastAsia="Garamond" w:hAnsi="Times New Roman" w:cs="Times New Roman"/>
+        </w:rPr>
+        <w:t xml:space="preserve">   </w:t>
+      </w:r>
+      <w:proofErr w:type="gramEnd"/>
+      <w:r>
+        <w:rPr>
+          <w:rFonts w:ascii="Times New Roman" w:eastAsia="Garamond" w:hAnsi="Times New Roman" w:cs="Times New Roman"/>
+        </w:rPr>
+        <w:t xml:space="preserve">                                          </w:t>
+      </w:r>
+      <w:r>
+        <w:rPr>
+          <w:rFonts w:ascii="Times New Roman" w:eastAsia="Garamond" w:hAnsi="Times New Roman" w:cs="Times New Roman"/>
         </w:rPr>
         <w:t xml:space="preserve">    </w:t>
       </w:r>
       <w:r>
         <w:rPr>
-          <w:rFonts w:asciiTheme="minorHAnsi" w:eastAsia="Times New Roman" w:hAnsiTheme="minorHAnsi" w:cstheme="minorHAnsi"/>
-        </w:rPr>
-        <w:t>Aug</w:t>
-      </w:r>
-      <w:r>
-        <w:rPr>
-          <w:rFonts w:asciiTheme="minorHAnsi" w:eastAsia="Times New Roman" w:hAnsiTheme="minorHAnsi" w:cstheme="minorHAnsi"/>
-        </w:rPr>
-        <w:t xml:space="preserve"> 2026-June 2028</w:t>
+          <w:rFonts w:ascii="Times New Roman" w:eastAsia="Times New Roman" w:hAnsi="Times New Roman" w:cs="Times New Roman"/>
+        </w:rPr>
+        <w:t>Aug 2026-June 2028</w:t>
       </w:r>
     </w:p>
     <w:p>
@@ -189,79 +201,74 @@
         <w:ind w:firstLine="720"/>
         <w:contextualSpacing/>
         <w:rPr>
-          <w:rFonts w:asciiTheme="minorHAnsi" w:eastAsia="Times New Roman" w:hAnsiTheme="minorHAnsi" w:cstheme="minorHAnsi"/>
+          <w:rFonts w:ascii="Times New Roman" w:eastAsia="Times New Roman" w:hAnsi="Times New Roman" w:cs="Times New Roman"/>
           <w:b/>
           <w:i/>
         </w:rPr>
       </w:pPr>
       <w:r>
         <w:rPr>
-          <w:rFonts w:asciiTheme="minorHAnsi" w:eastAsia="Times New Roman" w:hAnsiTheme="minorHAnsi" w:cstheme="minorHAnsi"/>
+          <w:rFonts w:ascii="Times New Roman" w:eastAsia="Times New Roman" w:hAnsi="Times New Roman" w:cs="Times New Roman"/>
           <w:b/>
         </w:rPr>
         <w:t xml:space="preserve">Bachelor of Science </w:t>
       </w:r>
       <w:r>
         <w:rPr>
-          <w:rFonts w:asciiTheme="minorHAnsi" w:eastAsia="Times New Roman" w:hAnsiTheme="minorHAnsi" w:cstheme="minorHAnsi"/>
+          <w:rFonts w:ascii="Times New Roman" w:eastAsia="Times New Roman" w:hAnsi="Times New Roman" w:cs="Times New Roman"/>
           <w:b/>
         </w:rPr>
         <w:t xml:space="preserve">Degree </w:t>
       </w:r>
       <w:r>
         <w:rPr>
-          <w:rFonts w:asciiTheme="minorHAnsi" w:eastAsia="Times New Roman" w:hAnsiTheme="minorHAnsi" w:cstheme="minorHAnsi"/>
+          <w:rFonts w:ascii="Times New Roman" w:eastAsia="Times New Roman" w:hAnsi="Times New Roman" w:cs="Times New Roman"/>
           <w:b/>
         </w:rPr>
         <w:t>in</w:t>
       </w:r>
       <w:r>
         <w:rPr>
-          <w:rFonts w:asciiTheme="minorHAnsi" w:eastAsia="Times New Roman" w:hAnsiTheme="minorHAnsi" w:cstheme="minorHAnsi"/>
+          <w:rFonts w:ascii="Times New Roman" w:eastAsia="Times New Roman" w:hAnsi="Times New Roman" w:cs="Times New Roman"/>
         </w:rPr>
         <w:t xml:space="preserve"> </w:t>
       </w:r>
       <w:r>
         <w:rPr>
-          <w:rFonts w:asciiTheme="minorHAnsi" w:eastAsia="Garamond" w:hAnsiTheme="minorHAnsi" w:cstheme="minorHAnsi"/>
+          <w:rFonts w:ascii="Times New Roman" w:eastAsia="Garamond" w:hAnsi="Times New Roman" w:cs="Times New Roman"/>
           <w:b/>
         </w:rPr>
         <w:t>Computer Science</w:t>
       </w:r>
       <w:r>
         <w:rPr>
-          <w:rFonts w:asciiTheme="minorHAnsi" w:eastAsia="Times New Roman" w:hAnsiTheme="minorHAnsi" w:cstheme="minorHAnsi"/>
+          <w:rFonts w:ascii="Times New Roman" w:eastAsia="Times New Roman" w:hAnsi="Times New Roman" w:cs="Times New Roman"/>
         </w:rPr>
         <w:tab/>
       </w:r>
       <w:r>
         <w:rPr>
-          <w:rFonts w:asciiTheme="minorHAnsi" w:eastAsia="Times New Roman" w:hAnsiTheme="minorHAnsi" w:cstheme="minorHAnsi"/>
+          <w:rFonts w:ascii="Times New Roman" w:eastAsia="Times New Roman" w:hAnsi="Times New Roman" w:cs="Times New Roman"/>
         </w:rPr>
         <w:tab/>
       </w:r>
       <w:r>
         <w:rPr>
-          <w:rFonts w:asciiTheme="minorHAnsi" w:eastAsia="Times New Roman" w:hAnsiTheme="minorHAnsi" w:cstheme="minorHAnsi"/>
+          <w:rFonts w:ascii="Times New Roman" w:eastAsia="Times New Roman" w:hAnsi="Times New Roman" w:cs="Times New Roman"/>
         </w:rPr>
         <w:tab/>
       </w:r>
       <w:r>
         <w:rPr>
-          <w:rFonts w:asciiTheme="minorHAnsi" w:eastAsia="Times New Roman" w:hAnsiTheme="minorHAnsi" w:cstheme="minorHAnsi"/>
+          <w:rFonts w:ascii="Times New Roman" w:eastAsia="Times New Roman" w:hAnsi="Times New Roman" w:cs="Times New Roman"/>
         </w:rPr>
         <w:tab/>
       </w:r>
       <w:r>
         <w:rPr>
-          <w:rFonts w:asciiTheme="minorHAnsi" w:eastAsia="Times New Roman" w:hAnsiTheme="minorHAnsi" w:cstheme="minorHAnsi"/>
+          <w:rFonts w:ascii="Times New Roman" w:eastAsia="Times New Roman" w:hAnsi="Times New Roman" w:cs="Times New Roman"/>
         </w:rPr>
         <w:tab/>
-      </w:r>
-      <w:r>
-        <w:rPr>
-          <w:rFonts w:asciiTheme="minorHAnsi" w:eastAsia="Times New Roman" w:hAnsiTheme="minorHAnsi" w:cstheme="minorHAnsi"/>
-        </w:rPr>
         <w:t xml:space="preserve"> </w:t>
       </w:r>
     </w:p>
@@ -271,31 +278,31 @@
         <w:ind w:left="720"/>
         <w:contextualSpacing/>
         <w:rPr>
-          <w:rFonts w:asciiTheme="minorHAnsi" w:eastAsia="Times New Roman" w:hAnsiTheme="minorHAnsi" w:cstheme="minorHAnsi"/>
-        </w:rPr>
-      </w:pPr>
-      <w:r>
-        <w:rPr>
-          <w:rFonts w:asciiTheme="minorHAnsi" w:eastAsia="Times New Roman" w:hAnsiTheme="minorHAnsi" w:cstheme="minorHAnsi"/>
+          <w:rFonts w:ascii="Times New Roman" w:eastAsia="Times New Roman" w:hAnsi="Times New Roman" w:cs="Times New Roman"/>
+        </w:rPr>
+      </w:pPr>
+      <w:r>
+        <w:rPr>
+          <w:rFonts w:ascii="Times New Roman" w:eastAsia="Times New Roman" w:hAnsi="Times New Roman" w:cs="Times New Roman"/>
           <w:b/>
         </w:rPr>
         <w:t xml:space="preserve">Relevant Coursework: </w:t>
       </w:r>
       <w:r>
         <w:rPr>
-          <w:rFonts w:asciiTheme="minorHAnsi" w:eastAsia="Times New Roman" w:hAnsiTheme="minorHAnsi" w:cstheme="minorHAnsi"/>
+          <w:rFonts w:ascii="Times New Roman" w:eastAsia="Times New Roman" w:hAnsi="Times New Roman" w:cs="Times New Roman"/>
         </w:rPr>
         <w:t xml:space="preserve">System Software Mechanics, </w:t>
       </w:r>
       <w:r>
         <w:rPr>
-          <w:rFonts w:asciiTheme="minorHAnsi" w:eastAsia="Times New Roman" w:hAnsiTheme="minorHAnsi" w:cstheme="minorHAnsi"/>
+          <w:rFonts w:ascii="Times New Roman" w:eastAsia="Times New Roman" w:hAnsi="Times New Roman" w:cs="Times New Roman"/>
         </w:rPr>
         <w:t>Introduction to Databases</w:t>
       </w:r>
       <w:r>
         <w:rPr>
-          <w:rFonts w:asciiTheme="minorHAnsi" w:eastAsia="Times New Roman" w:hAnsiTheme="minorHAnsi" w:cstheme="minorHAnsi"/>
+          <w:rFonts w:ascii="Times New Roman" w:eastAsia="Times New Roman" w:hAnsi="Times New Roman" w:cs="Times New Roman"/>
         </w:rPr>
         <w:t>, Engineering Statistics</w:t>
       </w:r>
@@ -305,7 +312,7 @@
         <w:spacing w:line="240" w:lineRule="auto"/>
         <w:contextualSpacing/>
         <w:rPr>
-          <w:rFonts w:asciiTheme="minorHAnsi" w:eastAsia="Garamond" w:hAnsiTheme="minorHAnsi" w:cstheme="minorHAnsi"/>
+          <w:rFonts w:ascii="Times New Roman" w:eastAsia="Garamond" w:hAnsi="Times New Roman" w:cs="Times New Roman"/>
           <w:b/>
         </w:rPr>
       </w:pPr>
@@ -316,73 +323,73 @@
         <w:ind w:firstLine="720"/>
         <w:contextualSpacing/>
         <w:rPr>
-          <w:rFonts w:asciiTheme="minorHAnsi" w:eastAsia="Garamond" w:hAnsiTheme="minorHAnsi" w:cstheme="minorHAnsi"/>
-          <w:b/>
-        </w:rPr>
-      </w:pPr>
-      <w:r>
-        <w:rPr>
-          <w:rFonts w:asciiTheme="minorHAnsi" w:eastAsia="Garamond" w:hAnsiTheme="minorHAnsi" w:cstheme="minorHAnsi"/>
+          <w:rFonts w:ascii="Times New Roman" w:eastAsia="Garamond" w:hAnsi="Times New Roman" w:cs="Times New Roman"/>
+          <w:b/>
+        </w:rPr>
+      </w:pPr>
+      <w:r>
+        <w:rPr>
+          <w:rFonts w:ascii="Times New Roman" w:eastAsia="Garamond" w:hAnsi="Times New Roman" w:cs="Times New Roman"/>
         </w:rPr>
         <w:t>College of the Canyons, Valencia</w:t>
       </w:r>
       <w:r>
         <w:rPr>
-          <w:rFonts w:asciiTheme="minorHAnsi" w:eastAsia="Garamond" w:hAnsiTheme="minorHAnsi" w:cstheme="minorHAnsi"/>
+          <w:rFonts w:ascii="Times New Roman" w:eastAsia="Garamond" w:hAnsi="Times New Roman" w:cs="Times New Roman"/>
         </w:rPr>
         <w:tab/>
       </w:r>
       <w:r>
         <w:rPr>
-          <w:rFonts w:asciiTheme="minorHAnsi" w:eastAsia="Garamond" w:hAnsiTheme="minorHAnsi" w:cstheme="minorHAnsi"/>
+          <w:rFonts w:ascii="Times New Roman" w:eastAsia="Garamond" w:hAnsi="Times New Roman" w:cs="Times New Roman"/>
         </w:rPr>
         <w:tab/>
       </w:r>
       <w:r>
         <w:rPr>
-          <w:rFonts w:asciiTheme="minorHAnsi" w:eastAsia="Garamond" w:hAnsiTheme="minorHAnsi" w:cstheme="minorHAnsi"/>
+          <w:rFonts w:ascii="Times New Roman" w:eastAsia="Garamond" w:hAnsi="Times New Roman" w:cs="Times New Roman"/>
         </w:rPr>
         <w:tab/>
       </w:r>
       <w:r>
         <w:rPr>
-          <w:rFonts w:asciiTheme="minorHAnsi" w:eastAsia="Garamond" w:hAnsiTheme="minorHAnsi" w:cstheme="minorHAnsi"/>
+          <w:rFonts w:ascii="Times New Roman" w:eastAsia="Garamond" w:hAnsi="Times New Roman" w:cs="Times New Roman"/>
         </w:rPr>
         <w:tab/>
       </w:r>
       <w:r>
         <w:rPr>
-          <w:rFonts w:asciiTheme="minorHAnsi" w:eastAsia="Garamond" w:hAnsiTheme="minorHAnsi" w:cstheme="minorHAnsi"/>
+          <w:rFonts w:ascii="Times New Roman" w:eastAsia="Garamond" w:hAnsi="Times New Roman" w:cs="Times New Roman"/>
         </w:rPr>
         <w:tab/>
       </w:r>
       <w:r>
         <w:rPr>
-          <w:rFonts w:asciiTheme="minorHAnsi" w:eastAsia="Garamond" w:hAnsiTheme="minorHAnsi" w:cstheme="minorHAnsi"/>
+          <w:rFonts w:ascii="Times New Roman" w:eastAsia="Garamond" w:hAnsi="Times New Roman" w:cs="Times New Roman"/>
         </w:rPr>
         <w:tab/>
       </w:r>
       <w:r>
         <w:rPr>
-          <w:rFonts w:asciiTheme="minorHAnsi" w:eastAsia="Garamond" w:hAnsiTheme="minorHAnsi" w:cstheme="minorHAnsi"/>
+          <w:rFonts w:ascii="Times New Roman" w:eastAsia="Garamond" w:hAnsi="Times New Roman" w:cs="Times New Roman"/>
         </w:rPr>
         <w:t xml:space="preserve">                </w:t>
       </w:r>
       <w:r>
         <w:rPr>
-          <w:rFonts w:asciiTheme="minorHAnsi" w:eastAsia="Garamond" w:hAnsiTheme="minorHAnsi" w:cstheme="minorHAnsi"/>
+          <w:rFonts w:ascii="Times New Roman" w:eastAsia="Garamond" w:hAnsi="Times New Roman" w:cs="Times New Roman"/>
         </w:rPr>
         <w:t xml:space="preserve">    </w:t>
       </w:r>
       <w:r>
         <w:rPr>
-          <w:rFonts w:asciiTheme="minorHAnsi" w:eastAsia="Times New Roman" w:hAnsiTheme="minorHAnsi" w:cstheme="minorHAnsi"/>
+          <w:rFonts w:ascii="Times New Roman" w:eastAsia="Times New Roman" w:hAnsi="Times New Roman" w:cs="Times New Roman"/>
         </w:rPr>
         <w:t>June 2023-June 2026</w:t>
       </w:r>
       <w:r>
         <w:rPr>
-          <w:rFonts w:asciiTheme="minorHAnsi" w:eastAsia="Garamond" w:hAnsiTheme="minorHAnsi" w:cstheme="minorHAnsi"/>
+          <w:rFonts w:ascii="Times New Roman" w:eastAsia="Garamond" w:hAnsi="Times New Roman" w:cs="Times New Roman"/>
         </w:rPr>
         <w:t xml:space="preserve">                   </w:t>
       </w:r>
@@ -393,105 +400,99 @@
         <w:ind w:firstLine="720"/>
         <w:contextualSpacing/>
         <w:rPr>
-          <w:rFonts w:asciiTheme="minorHAnsi" w:eastAsia="Times New Roman" w:hAnsiTheme="minorHAnsi" w:cstheme="minorHAnsi"/>
+          <w:rFonts w:ascii="Times New Roman" w:eastAsia="Times New Roman" w:hAnsi="Times New Roman" w:cs="Times New Roman"/>
           <w:b/>
           <w:i/>
         </w:rPr>
       </w:pPr>
       <w:r>
         <w:rPr>
-          <w:rFonts w:asciiTheme="minorHAnsi" w:eastAsia="Times New Roman" w:hAnsiTheme="minorHAnsi" w:cstheme="minorHAnsi"/>
+          <w:rFonts w:ascii="Times New Roman" w:eastAsia="Times New Roman" w:hAnsi="Times New Roman" w:cs="Times New Roman"/>
           <w:b/>
         </w:rPr>
         <w:t>A.S.</w:t>
       </w:r>
       <w:r>
         <w:rPr>
-          <w:rFonts w:asciiTheme="minorHAnsi" w:eastAsia="Times New Roman" w:hAnsiTheme="minorHAnsi" w:cstheme="minorHAnsi"/>
+          <w:rFonts w:ascii="Times New Roman" w:eastAsia="Times New Roman" w:hAnsi="Times New Roman" w:cs="Times New Roman"/>
           <w:b/>
         </w:rPr>
         <w:t xml:space="preserve"> in Computer Science, </w:t>
       </w:r>
       <w:r>
         <w:rPr>
-          <w:rFonts w:asciiTheme="minorHAnsi" w:eastAsia="Times New Roman" w:hAnsiTheme="minorHAnsi" w:cstheme="minorHAnsi"/>
+          <w:rFonts w:ascii="Times New Roman" w:eastAsia="Times New Roman" w:hAnsi="Times New Roman" w:cs="Times New Roman"/>
           <w:b/>
         </w:rPr>
         <w:t xml:space="preserve">A.S. in </w:t>
       </w:r>
       <w:r>
         <w:rPr>
-          <w:rFonts w:asciiTheme="minorHAnsi" w:eastAsia="Times New Roman" w:hAnsiTheme="minorHAnsi" w:cstheme="minorHAnsi"/>
+          <w:rFonts w:ascii="Times New Roman" w:eastAsia="Times New Roman" w:hAnsi="Times New Roman" w:cs="Times New Roman"/>
           <w:b/>
         </w:rPr>
         <w:t xml:space="preserve">Physics and </w:t>
       </w:r>
       <w:r>
         <w:rPr>
-          <w:rFonts w:asciiTheme="minorHAnsi" w:eastAsia="Times New Roman" w:hAnsiTheme="minorHAnsi" w:cstheme="minorHAnsi"/>
+          <w:rFonts w:ascii="Times New Roman" w:eastAsia="Times New Roman" w:hAnsi="Times New Roman" w:cs="Times New Roman"/>
           <w:b/>
         </w:rPr>
         <w:t xml:space="preserve">A.S. </w:t>
       </w:r>
       <w:r>
         <w:rPr>
-          <w:rFonts w:asciiTheme="minorHAnsi" w:eastAsia="Times New Roman" w:hAnsiTheme="minorHAnsi" w:cstheme="minorHAnsi"/>
+          <w:rFonts w:ascii="Times New Roman" w:eastAsia="Times New Roman" w:hAnsi="Times New Roman" w:cs="Times New Roman"/>
           <w:b/>
         </w:rPr>
         <w:t>Mathematics</w:t>
       </w:r>
       <w:r>
         <w:rPr>
-          <w:rFonts w:asciiTheme="minorHAnsi" w:eastAsia="Times New Roman" w:hAnsiTheme="minorHAnsi" w:cstheme="minorHAnsi"/>
+          <w:rFonts w:ascii="Times New Roman" w:eastAsia="Times New Roman" w:hAnsi="Times New Roman" w:cs="Times New Roman"/>
         </w:rPr>
         <w:tab/>
       </w:r>
       <w:r>
         <w:rPr>
-          <w:rFonts w:asciiTheme="minorHAnsi" w:eastAsia="Times New Roman" w:hAnsiTheme="minorHAnsi" w:cstheme="minorHAnsi"/>
+          <w:rFonts w:ascii="Times New Roman" w:eastAsia="Times New Roman" w:hAnsi="Times New Roman" w:cs="Times New Roman"/>
         </w:rPr>
         <w:tab/>
       </w:r>
       <w:r>
         <w:rPr>
-          <w:rFonts w:asciiTheme="minorHAnsi" w:eastAsia="Times New Roman" w:hAnsiTheme="minorHAnsi" w:cstheme="minorHAnsi"/>
+          <w:rFonts w:ascii="Times New Roman" w:eastAsia="Times New Roman" w:hAnsi="Times New Roman" w:cs="Times New Roman"/>
         </w:rPr>
         <w:tab/>
         <w:t xml:space="preserve">               </w:t>
       </w:r>
       <w:r>
         <w:rPr>
-          <w:rFonts w:asciiTheme="minorHAnsi" w:eastAsia="Times New Roman" w:hAnsiTheme="minorHAnsi" w:cstheme="minorHAnsi"/>
+          <w:rFonts w:ascii="Times New Roman" w:eastAsia="Times New Roman" w:hAnsi="Times New Roman" w:cs="Times New Roman"/>
         </w:rPr>
         <w:t xml:space="preserve">                    </w:t>
       </w:r>
       <w:r>
         <w:rPr>
-          <w:rFonts w:asciiTheme="minorHAnsi" w:eastAsia="Times New Roman" w:hAnsiTheme="minorHAnsi" w:cstheme="minorHAnsi"/>
+          <w:rFonts w:ascii="Times New Roman" w:eastAsia="Times New Roman" w:hAnsi="Times New Roman" w:cs="Times New Roman"/>
         </w:rPr>
         <w:t xml:space="preserve">     </w:t>
       </w:r>
       <w:r>
         <w:rPr>
-          <w:rFonts w:asciiTheme="minorHAnsi" w:eastAsia="Times New Roman" w:hAnsiTheme="minorHAnsi" w:cstheme="minorHAnsi"/>
+          <w:rFonts w:ascii="Times New Roman" w:eastAsia="Times New Roman" w:hAnsi="Times New Roman" w:cs="Times New Roman"/>
         </w:rPr>
         <w:t>GPA:</w:t>
       </w:r>
       <w:r>
         <w:rPr>
-          <w:rFonts w:asciiTheme="minorHAnsi" w:eastAsia="Garamond" w:hAnsiTheme="minorHAnsi" w:cstheme="minorHAnsi"/>
-        </w:rPr>
-        <w:t xml:space="preserve"> 3.6</w:t>
-      </w:r>
-      <w:r>
-        <w:rPr>
-          <w:rFonts w:asciiTheme="minorHAnsi" w:eastAsia="Garamond" w:hAnsiTheme="minorHAnsi" w:cstheme="minorHAnsi"/>
-        </w:rPr>
-        <w:t>2</w:t>
-      </w:r>
-      <w:r>
-        <w:rPr>
-          <w:rFonts w:asciiTheme="minorHAnsi" w:eastAsia="Times New Roman" w:hAnsiTheme="minorHAnsi" w:cstheme="minorHAnsi"/>
+          <w:rFonts w:ascii="Times New Roman" w:eastAsia="Garamond" w:hAnsi="Times New Roman" w:cs="Times New Roman"/>
+        </w:rPr>
+        <w:t xml:space="preserve"> 3.62</w:t>
+      </w:r>
+      <w:r>
+        <w:rPr>
+          <w:rFonts w:ascii="Times New Roman" w:eastAsia="Times New Roman" w:hAnsi="Times New Roman" w:cs="Times New Roman"/>
         </w:rPr>
         <w:tab/>
       </w:r>
@@ -502,43 +503,43 @@
         <w:ind w:left="720"/>
         <w:contextualSpacing/>
         <w:rPr>
-          <w:rFonts w:asciiTheme="minorHAnsi" w:eastAsia="Times New Roman" w:hAnsiTheme="minorHAnsi" w:cstheme="minorHAnsi"/>
-        </w:rPr>
-      </w:pPr>
-      <w:r>
-        <w:rPr>
-          <w:rFonts w:asciiTheme="minorHAnsi" w:eastAsia="Times New Roman" w:hAnsiTheme="minorHAnsi" w:cstheme="minorHAnsi"/>
+          <w:rFonts w:ascii="Times New Roman" w:eastAsia="Times New Roman" w:hAnsi="Times New Roman" w:cs="Times New Roman"/>
+        </w:rPr>
+      </w:pPr>
+      <w:r>
+        <w:rPr>
+          <w:rFonts w:ascii="Times New Roman" w:eastAsia="Times New Roman" w:hAnsi="Times New Roman" w:cs="Times New Roman"/>
           <w:b/>
         </w:rPr>
         <w:t xml:space="preserve">Relevant Coursework: </w:t>
       </w:r>
       <w:r>
         <w:rPr>
-          <w:rFonts w:asciiTheme="minorHAnsi" w:eastAsia="Times New Roman" w:hAnsiTheme="minorHAnsi" w:cstheme="minorHAnsi"/>
+          <w:rFonts w:ascii="Times New Roman" w:eastAsia="Times New Roman" w:hAnsi="Times New Roman" w:cs="Times New Roman"/>
         </w:rPr>
         <w:t>Electricity and Magnetism, Data Structures</w:t>
       </w:r>
       <w:r>
         <w:rPr>
-          <w:rFonts w:asciiTheme="minorHAnsi" w:eastAsia="Times New Roman" w:hAnsiTheme="minorHAnsi" w:cstheme="minorHAnsi"/>
+          <w:rFonts w:ascii="Times New Roman" w:eastAsia="Times New Roman" w:hAnsi="Times New Roman" w:cs="Times New Roman"/>
         </w:rPr>
         <w:t xml:space="preserve"> 1 and 2</w:t>
       </w:r>
       <w:r>
         <w:rPr>
-          <w:rFonts w:asciiTheme="minorHAnsi" w:eastAsia="Times New Roman" w:hAnsiTheme="minorHAnsi" w:cstheme="minorHAnsi"/>
+          <w:rFonts w:ascii="Times New Roman" w:eastAsia="Times New Roman" w:hAnsi="Times New Roman" w:cs="Times New Roman"/>
         </w:rPr>
         <w:t>,</w:t>
       </w:r>
       <w:r>
         <w:rPr>
-          <w:rFonts w:asciiTheme="minorHAnsi" w:eastAsia="Times New Roman" w:hAnsiTheme="minorHAnsi" w:cstheme="minorHAnsi"/>
+          <w:rFonts w:ascii="Times New Roman" w:eastAsia="Times New Roman" w:hAnsi="Times New Roman" w:cs="Times New Roman"/>
         </w:rPr>
         <w:t xml:space="preserve"> </w:t>
       </w:r>
       <w:r>
         <w:rPr>
-          <w:rFonts w:asciiTheme="minorHAnsi" w:eastAsia="Times New Roman" w:hAnsiTheme="minorHAnsi" w:cstheme="minorHAnsi"/>
+          <w:rFonts w:ascii="Times New Roman" w:eastAsia="Times New Roman" w:hAnsi="Times New Roman" w:cs="Times New Roman"/>
         </w:rPr>
         <w:t>C++ Programming, Java Programming</w:t>
       </w:r>
@@ -548,7 +549,7 @@
         <w:spacing w:line="240" w:lineRule="auto"/>
         <w:contextualSpacing/>
         <w:rPr>
-          <w:rFonts w:asciiTheme="minorHAnsi" w:eastAsia="Garamond" w:hAnsiTheme="minorHAnsi" w:cstheme="minorHAnsi"/>
+          <w:rFonts w:ascii="Times New Roman" w:eastAsia="Garamond" w:hAnsi="Times New Roman" w:cs="Times New Roman"/>
           <w:b/>
         </w:rPr>
       </w:pPr>
@@ -558,13 +559,13 @@
         <w:spacing w:line="240" w:lineRule="auto"/>
         <w:contextualSpacing/>
         <w:rPr>
-          <w:rFonts w:asciiTheme="minorHAnsi" w:eastAsia="Garamond" w:hAnsiTheme="minorHAnsi" w:cstheme="minorHAnsi"/>
-          <w:b/>
-        </w:rPr>
-      </w:pPr>
-      <w:r>
-        <w:rPr>
-          <w:rFonts w:asciiTheme="minorHAnsi" w:eastAsia="Garamond" w:hAnsiTheme="minorHAnsi" w:cstheme="minorHAnsi"/>
+          <w:rFonts w:ascii="Times New Roman" w:eastAsia="Garamond" w:hAnsi="Times New Roman" w:cs="Times New Roman"/>
+          <w:b/>
+        </w:rPr>
+      </w:pPr>
+      <w:r>
+        <w:rPr>
+          <w:rFonts w:ascii="Times New Roman" w:eastAsia="Garamond" w:hAnsi="Times New Roman" w:cs="Times New Roman"/>
           <w:b/>
         </w:rPr>
         <w:t>SKILLS</w:t>
@@ -576,43 +577,43 @@
         <w:ind w:firstLine="720"/>
         <w:contextualSpacing/>
         <w:rPr>
-          <w:rFonts w:asciiTheme="minorHAnsi" w:eastAsia="Garamond" w:hAnsiTheme="minorHAnsi" w:cstheme="minorHAnsi"/>
-        </w:rPr>
-      </w:pPr>
-      <w:r>
-        <w:rPr>
-          <w:rFonts w:asciiTheme="minorHAnsi" w:eastAsia="Garamond" w:hAnsiTheme="minorHAnsi" w:cstheme="minorHAnsi"/>
+          <w:rFonts w:ascii="Times New Roman" w:eastAsia="Garamond" w:hAnsi="Times New Roman" w:cs="Times New Roman"/>
+        </w:rPr>
+      </w:pPr>
+      <w:r>
+        <w:rPr>
+          <w:rFonts w:ascii="Times New Roman" w:eastAsia="Garamond" w:hAnsi="Times New Roman" w:cs="Times New Roman"/>
           <w:b/>
         </w:rPr>
         <w:t xml:space="preserve">Programming Languages: </w:t>
       </w:r>
       <w:r>
         <w:rPr>
-          <w:rFonts w:asciiTheme="minorHAnsi" w:eastAsia="Garamond" w:hAnsiTheme="minorHAnsi" w:cstheme="minorHAnsi"/>
+          <w:rFonts w:ascii="Times New Roman" w:eastAsia="Garamond" w:hAnsi="Times New Roman" w:cs="Times New Roman"/>
         </w:rPr>
         <w:t>C, C++, Java, Python, HTML, CSS, Java</w:t>
       </w:r>
       <w:r>
         <w:rPr>
-          <w:rFonts w:asciiTheme="minorHAnsi" w:eastAsia="Garamond" w:hAnsiTheme="minorHAnsi" w:cstheme="minorHAnsi"/>
+          <w:rFonts w:ascii="Times New Roman" w:eastAsia="Garamond" w:hAnsi="Times New Roman" w:cs="Times New Roman"/>
         </w:rPr>
         <w:t>S</w:t>
       </w:r>
       <w:r>
         <w:rPr>
-          <w:rFonts w:asciiTheme="minorHAnsi" w:eastAsia="Garamond" w:hAnsiTheme="minorHAnsi" w:cstheme="minorHAnsi"/>
+          <w:rFonts w:ascii="Times New Roman" w:eastAsia="Garamond" w:hAnsi="Times New Roman" w:cs="Times New Roman"/>
         </w:rPr>
         <w:t>cript, SQL</w:t>
       </w:r>
       <w:r>
         <w:rPr>
-          <w:rFonts w:asciiTheme="minorHAnsi" w:eastAsia="Garamond" w:hAnsiTheme="minorHAnsi" w:cstheme="minorHAnsi"/>
+          <w:rFonts w:ascii="Times New Roman" w:eastAsia="Garamond" w:hAnsi="Times New Roman" w:cs="Times New Roman"/>
         </w:rPr>
         <w:t>, PostgreSQL</w:t>
       </w:r>
       <w:r>
         <w:rPr>
-          <w:rFonts w:asciiTheme="minorHAnsi" w:eastAsia="Garamond" w:hAnsiTheme="minorHAnsi" w:cstheme="minorHAnsi"/>
+          <w:rFonts w:ascii="Times New Roman" w:eastAsia="Garamond" w:hAnsi="Times New Roman" w:cs="Times New Roman"/>
         </w:rPr>
         <w:t xml:space="preserve">, </w:t>
       </w:r>
@@ -623,13 +624,13 @@
         <w:ind w:firstLine="720"/>
         <w:contextualSpacing/>
         <w:rPr>
-          <w:rFonts w:asciiTheme="minorHAnsi" w:eastAsia="Garamond" w:hAnsiTheme="minorHAnsi" w:cstheme="minorHAnsi"/>
-          <w:b/>
-        </w:rPr>
-      </w:pPr>
-      <w:r>
-        <w:rPr>
-          <w:rFonts w:asciiTheme="minorHAnsi" w:eastAsia="Garamond" w:hAnsiTheme="minorHAnsi" w:cstheme="minorHAnsi"/>
+          <w:rFonts w:ascii="Times New Roman" w:eastAsia="Garamond" w:hAnsi="Times New Roman" w:cs="Times New Roman"/>
+          <w:b/>
+        </w:rPr>
+      </w:pPr>
+      <w:r>
+        <w:rPr>
+          <w:rFonts w:ascii="Times New Roman" w:eastAsia="Garamond" w:hAnsi="Times New Roman" w:cs="Times New Roman"/>
           <w:b/>
           <w:bCs/>
         </w:rPr>
@@ -637,7 +638,7 @@
       </w:r>
       <w:r>
         <w:rPr>
-          <w:rFonts w:asciiTheme="minorHAnsi" w:eastAsia="Garamond" w:hAnsiTheme="minorHAnsi" w:cstheme="minorHAnsi"/>
+          <w:rFonts w:ascii="Times New Roman" w:eastAsia="Garamond" w:hAnsi="Times New Roman" w:cs="Times New Roman"/>
           <w:b/>
           <w:bCs/>
         </w:rPr>
@@ -645,7 +646,7 @@
       </w:r>
       <w:r>
         <w:rPr>
-          <w:rFonts w:asciiTheme="minorHAnsi" w:eastAsia="Garamond" w:hAnsiTheme="minorHAnsi" w:cstheme="minorHAnsi"/>
+          <w:rFonts w:ascii="Times New Roman" w:eastAsia="Garamond" w:hAnsi="Times New Roman" w:cs="Times New Roman"/>
           <w:b/>
           <w:bCs/>
         </w:rPr>
@@ -653,28 +654,36 @@
       </w:r>
       <w:r>
         <w:rPr>
-          <w:rFonts w:asciiTheme="minorHAnsi" w:eastAsia="Garamond" w:hAnsiTheme="minorHAnsi" w:cstheme="minorHAnsi"/>
+          <w:rFonts w:ascii="Times New Roman" w:eastAsia="Garamond" w:hAnsi="Times New Roman" w:cs="Times New Roman"/>
         </w:rPr>
         <w:t>React, Next</w:t>
       </w:r>
       <w:r>
         <w:rPr>
-          <w:rFonts w:asciiTheme="minorHAnsi" w:eastAsia="Garamond" w:hAnsiTheme="minorHAnsi" w:cstheme="minorHAnsi"/>
+          <w:rFonts w:ascii="Times New Roman" w:eastAsia="Garamond" w:hAnsi="Times New Roman" w:cs="Times New Roman"/>
         </w:rPr>
         <w:t>.</w:t>
       </w:r>
       <w:r>
         <w:rPr>
-          <w:rFonts w:asciiTheme="minorHAnsi" w:eastAsia="Garamond" w:hAnsiTheme="minorHAnsi" w:cstheme="minorHAnsi"/>
+          <w:rFonts w:ascii="Times New Roman" w:eastAsia="Garamond" w:hAnsi="Times New Roman" w:cs="Times New Roman"/>
         </w:rPr>
         <w:t>J</w:t>
       </w:r>
       <w:r>
         <w:rPr>
-          <w:rFonts w:asciiTheme="minorHAnsi" w:eastAsia="Garamond" w:hAnsiTheme="minorHAnsi" w:cstheme="minorHAnsi"/>
-        </w:rPr>
-        <w:t>S, React Native, NestJS</w:t>
-      </w:r>
+          <w:rFonts w:ascii="Times New Roman" w:eastAsia="Garamond" w:hAnsi="Times New Roman" w:cs="Times New Roman"/>
+        </w:rPr>
+        <w:t xml:space="preserve">S, React Native, </w:t>
+      </w:r>
+      <w:proofErr w:type="spellStart"/>
+      <w:r>
+        <w:rPr>
+          <w:rFonts w:ascii="Times New Roman" w:eastAsia="Garamond" w:hAnsi="Times New Roman" w:cs="Times New Roman"/>
+        </w:rPr>
+        <w:t>NestJS</w:t>
+      </w:r>
+      <w:proofErr w:type="spellEnd"/>
     </w:p>
     <w:p>
       <w:pPr>
@@ -682,55 +691,55 @@
         <w:ind w:left="720"/>
         <w:contextualSpacing/>
         <w:rPr>
-          <w:rFonts w:asciiTheme="minorHAnsi" w:eastAsia="Times New Roman" w:hAnsiTheme="minorHAnsi" w:cstheme="minorHAnsi"/>
-        </w:rPr>
-      </w:pPr>
-      <w:r>
-        <w:rPr>
-          <w:rFonts w:asciiTheme="minorHAnsi" w:eastAsia="Times New Roman" w:hAnsiTheme="minorHAnsi" w:cstheme="minorHAnsi"/>
+          <w:rFonts w:ascii="Times New Roman" w:eastAsia="Times New Roman" w:hAnsi="Times New Roman" w:cs="Times New Roman"/>
+        </w:rPr>
+      </w:pPr>
+      <w:r>
+        <w:rPr>
+          <w:rFonts w:ascii="Times New Roman" w:eastAsia="Times New Roman" w:hAnsi="Times New Roman" w:cs="Times New Roman"/>
           <w:b/>
         </w:rPr>
         <w:t>Software Tools:</w:t>
       </w:r>
       <w:r>
         <w:rPr>
-          <w:rFonts w:asciiTheme="minorHAnsi" w:eastAsia="Times New Roman" w:hAnsiTheme="minorHAnsi" w:cstheme="minorHAnsi"/>
+          <w:rFonts w:ascii="Times New Roman" w:eastAsia="Times New Roman" w:hAnsi="Times New Roman" w:cs="Times New Roman"/>
         </w:rPr>
         <w:t xml:space="preserve"> Xcode, Vim, Git, REST API, JSON</w:t>
       </w:r>
       <w:r>
         <w:rPr>
-          <w:rFonts w:asciiTheme="minorHAnsi" w:eastAsia="Times New Roman" w:hAnsiTheme="minorHAnsi" w:cstheme="minorHAnsi"/>
+          <w:rFonts w:ascii="Times New Roman" w:eastAsia="Times New Roman" w:hAnsi="Times New Roman" w:cs="Times New Roman"/>
         </w:rPr>
         <w:t xml:space="preserve">, </w:t>
       </w:r>
       <w:r>
         <w:rPr>
-          <w:rFonts w:asciiTheme="minorHAnsi" w:eastAsia="Times New Roman" w:hAnsiTheme="minorHAnsi" w:cstheme="minorHAnsi"/>
+          <w:rFonts w:ascii="Times New Roman" w:eastAsia="Times New Roman" w:hAnsi="Times New Roman" w:cs="Times New Roman"/>
         </w:rPr>
         <w:t>Adobe</w:t>
       </w:r>
       <w:r>
         <w:rPr>
-          <w:rFonts w:asciiTheme="minorHAnsi" w:eastAsia="Times New Roman" w:hAnsiTheme="minorHAnsi" w:cstheme="minorHAnsi"/>
+          <w:rFonts w:ascii="Times New Roman" w:eastAsia="Times New Roman" w:hAnsi="Times New Roman" w:cs="Times New Roman"/>
         </w:rPr>
         <w:t xml:space="preserve"> Premiere Pro, </w:t>
       </w:r>
       <w:r>
         <w:rPr>
-          <w:rFonts w:asciiTheme="minorHAnsi" w:eastAsia="Times New Roman" w:hAnsiTheme="minorHAnsi" w:cstheme="minorHAnsi"/>
+          <w:rFonts w:ascii="Times New Roman" w:eastAsia="Times New Roman" w:hAnsi="Times New Roman" w:cs="Times New Roman"/>
         </w:rPr>
         <w:t>Supabase,</w:t>
       </w:r>
       <w:r>
         <w:rPr>
-          <w:rFonts w:asciiTheme="minorHAnsi" w:eastAsia="Times New Roman" w:hAnsiTheme="minorHAnsi" w:cstheme="minorHAnsi"/>
+          <w:rFonts w:ascii="Times New Roman" w:eastAsia="Times New Roman" w:hAnsi="Times New Roman" w:cs="Times New Roman"/>
         </w:rPr>
         <w:t xml:space="preserve"> Expo</w:t>
       </w:r>
       <w:r>
         <w:rPr>
-          <w:rFonts w:asciiTheme="minorHAnsi" w:eastAsia="Times New Roman" w:hAnsiTheme="minorHAnsi" w:cstheme="minorHAnsi"/>
+          <w:rFonts w:ascii="Times New Roman" w:eastAsia="Times New Roman" w:hAnsi="Times New Roman" w:cs="Times New Roman"/>
         </w:rPr>
         <w:t>, Docker</w:t>
       </w:r>
@@ -740,7 +749,7 @@
         <w:spacing w:line="240" w:lineRule="auto"/>
         <w:contextualSpacing/>
         <w:rPr>
-          <w:rFonts w:asciiTheme="minorHAnsi" w:eastAsia="Garamond" w:hAnsiTheme="minorHAnsi" w:cstheme="minorHAnsi"/>
+          <w:rFonts w:ascii="Times New Roman" w:eastAsia="Garamond" w:hAnsi="Times New Roman" w:cs="Times New Roman"/>
           <w:b/>
         </w:rPr>
       </w:pPr>
@@ -750,48 +759,48 @@
         <w:spacing w:line="240" w:lineRule="auto"/>
         <w:contextualSpacing/>
         <w:rPr>
-          <w:rFonts w:asciiTheme="minorHAnsi" w:eastAsia="Garamond" w:hAnsiTheme="minorHAnsi" w:cstheme="minorHAnsi"/>
-          <w:b/>
-        </w:rPr>
-      </w:pPr>
-      <w:r>
-        <w:rPr>
-          <w:rFonts w:asciiTheme="minorHAnsi" w:eastAsia="Garamond" w:hAnsiTheme="minorHAnsi" w:cstheme="minorHAnsi"/>
+          <w:rFonts w:ascii="Times New Roman" w:eastAsia="Garamond" w:hAnsi="Times New Roman" w:cs="Times New Roman"/>
+          <w:b/>
+        </w:rPr>
+      </w:pPr>
+      <w:r>
+        <w:rPr>
+          <w:rFonts w:ascii="Times New Roman" w:eastAsia="Garamond" w:hAnsi="Times New Roman" w:cs="Times New Roman"/>
           <w:b/>
         </w:rPr>
         <w:t>PROGRAMMING PROJECTS</w:t>
       </w:r>
       <w:r>
         <w:rPr>
-          <w:rFonts w:asciiTheme="minorHAnsi" w:eastAsia="Garamond" w:hAnsiTheme="minorHAnsi" w:cstheme="minorHAnsi"/>
+          <w:rFonts w:ascii="Times New Roman" w:eastAsia="Garamond" w:hAnsi="Times New Roman" w:cs="Times New Roman"/>
           <w:b/>
         </w:rPr>
         <w:tab/>
       </w:r>
       <w:r>
         <w:rPr>
-          <w:rFonts w:asciiTheme="minorHAnsi" w:eastAsia="Garamond" w:hAnsiTheme="minorHAnsi" w:cstheme="minorHAnsi"/>
+          <w:rFonts w:ascii="Times New Roman" w:eastAsia="Garamond" w:hAnsi="Times New Roman" w:cs="Times New Roman"/>
           <w:b/>
         </w:rPr>
         <w:tab/>
       </w:r>
       <w:r>
         <w:rPr>
-          <w:rFonts w:asciiTheme="minorHAnsi" w:eastAsia="Garamond" w:hAnsiTheme="minorHAnsi" w:cstheme="minorHAnsi"/>
+          <w:rFonts w:ascii="Times New Roman" w:eastAsia="Garamond" w:hAnsi="Times New Roman" w:cs="Times New Roman"/>
           <w:b/>
         </w:rPr>
         <w:tab/>
       </w:r>
       <w:r>
         <w:rPr>
-          <w:rFonts w:asciiTheme="minorHAnsi" w:eastAsia="Garamond" w:hAnsiTheme="minorHAnsi" w:cstheme="minorHAnsi"/>
+          <w:rFonts w:ascii="Times New Roman" w:eastAsia="Garamond" w:hAnsi="Times New Roman" w:cs="Times New Roman"/>
           <w:b/>
         </w:rPr>
         <w:tab/>
       </w:r>
       <w:r>
         <w:rPr>
-          <w:rFonts w:asciiTheme="minorHAnsi" w:eastAsia="Garamond" w:hAnsiTheme="minorHAnsi" w:cstheme="minorHAnsi"/>
+          <w:rFonts w:ascii="Times New Roman" w:eastAsia="Garamond" w:hAnsi="Times New Roman" w:cs="Times New Roman"/>
           <w:b/>
         </w:rPr>
         <w:tab/>
@@ -804,56 +813,58 @@
         <w:ind w:firstLine="720"/>
         <w:contextualSpacing/>
         <w:rPr>
-          <w:rFonts w:asciiTheme="minorHAnsi" w:eastAsia="Garamond" w:hAnsiTheme="minorHAnsi" w:cstheme="minorHAnsi"/>
+          <w:rFonts w:ascii="Times New Roman" w:eastAsia="Garamond" w:hAnsi="Times New Roman" w:cs="Times New Roman"/>
           <w:b/>
         </w:rPr>
       </w:pPr>
       <w:bookmarkStart w:id="0" w:name="OLE_LINK1"/>
       <w:bookmarkStart w:id="1" w:name="OLE_LINK2"/>
-      <w:r>
-        <w:rPr>
-          <w:rFonts w:asciiTheme="minorHAnsi" w:eastAsia="Garamond" w:hAnsiTheme="minorHAnsi" w:cstheme="minorHAnsi"/>
+      <w:proofErr w:type="spellStart"/>
+      <w:r>
+        <w:rPr>
+          <w:rFonts w:ascii="Times New Roman" w:eastAsia="Garamond" w:hAnsi="Times New Roman" w:cs="Times New Roman"/>
           <w:b/>
         </w:rPr>
         <w:t>MESAConnect</w:t>
       </w:r>
-      <w:r>
-        <w:rPr>
-          <w:rFonts w:asciiTheme="minorHAnsi" w:eastAsia="Garamond" w:hAnsiTheme="minorHAnsi" w:cstheme="minorHAnsi"/>
+      <w:proofErr w:type="spellEnd"/>
+      <w:r>
+        <w:rPr>
+          <w:rFonts w:ascii="Times New Roman" w:eastAsia="Garamond" w:hAnsi="Times New Roman" w:cs="Times New Roman"/>
           <w:b/>
         </w:rPr>
         <w:t xml:space="preserve">, </w:t>
       </w:r>
       <w:r>
         <w:rPr>
-          <w:rFonts w:asciiTheme="minorHAnsi" w:eastAsia="Garamond" w:hAnsiTheme="minorHAnsi" w:cstheme="minorHAnsi"/>
+          <w:rFonts w:ascii="Times New Roman" w:eastAsia="Garamond" w:hAnsi="Times New Roman" w:cs="Times New Roman"/>
           <w:b/>
         </w:rPr>
         <w:t>Website and Social Media Service</w:t>
       </w:r>
       <w:r>
         <w:rPr>
-          <w:rFonts w:asciiTheme="minorHAnsi" w:eastAsia="Garamond" w:hAnsiTheme="minorHAnsi" w:cstheme="minorHAnsi"/>
+          <w:rFonts w:ascii="Times New Roman" w:eastAsia="Garamond" w:hAnsi="Times New Roman" w:cs="Times New Roman"/>
           <w:b/>
         </w:rPr>
         <w:tab/>
       </w:r>
       <w:r>
         <w:rPr>
-          <w:rFonts w:asciiTheme="minorHAnsi" w:eastAsia="Garamond" w:hAnsiTheme="minorHAnsi" w:cstheme="minorHAnsi"/>
+          <w:rFonts w:ascii="Times New Roman" w:eastAsia="Garamond" w:hAnsi="Times New Roman" w:cs="Times New Roman"/>
           <w:b/>
         </w:rPr>
         <w:tab/>
       </w:r>
       <w:r>
         <w:rPr>
-          <w:rFonts w:asciiTheme="minorHAnsi" w:eastAsia="Garamond" w:hAnsiTheme="minorHAnsi" w:cstheme="minorHAnsi"/>
+          <w:rFonts w:ascii="Times New Roman" w:eastAsia="Garamond" w:hAnsi="Times New Roman" w:cs="Times New Roman"/>
         </w:rPr>
         <w:tab/>
       </w:r>
       <w:r>
         <w:rPr>
-          <w:rFonts w:asciiTheme="minorHAnsi" w:eastAsia="Garamond" w:hAnsiTheme="minorHAnsi" w:cstheme="minorHAnsi"/>
+          <w:rFonts w:ascii="Times New Roman" w:eastAsia="Garamond" w:hAnsi="Times New Roman" w:cs="Times New Roman"/>
           <w:b/>
         </w:rPr>
         <w:t xml:space="preserve">                                                  </w:t>
@@ -865,36 +876,36 @@
         <w:ind w:left="720"/>
         <w:contextualSpacing/>
         <w:rPr>
-          <w:rFonts w:asciiTheme="minorHAnsi" w:eastAsia="Times New Roman" w:hAnsiTheme="minorHAnsi" w:cstheme="minorHAnsi"/>
-        </w:rPr>
-      </w:pPr>
-      <w:r>
-        <w:rPr>
-          <w:rFonts w:asciiTheme="minorHAnsi" w:eastAsia="Times New Roman" w:hAnsiTheme="minorHAnsi" w:cstheme="minorHAnsi"/>
+          <w:rFonts w:ascii="Times New Roman" w:eastAsia="Times New Roman" w:hAnsi="Times New Roman" w:cs="Times New Roman"/>
+        </w:rPr>
+      </w:pPr>
+      <w:r>
+        <w:rPr>
+          <w:rFonts w:ascii="Times New Roman" w:eastAsia="Times New Roman" w:hAnsi="Times New Roman" w:cs="Times New Roman"/>
         </w:rPr>
         <w:t xml:space="preserve">Languages and Tools Utilized: </w:t>
       </w:r>
       <w:r>
         <w:rPr>
-          <w:rFonts w:asciiTheme="minorHAnsi" w:eastAsia="Times New Roman" w:hAnsiTheme="minorHAnsi" w:cstheme="minorHAnsi"/>
+          <w:rFonts w:ascii="Times New Roman" w:eastAsia="Times New Roman" w:hAnsi="Times New Roman" w:cs="Times New Roman"/>
         </w:rPr>
         <w:t>React, Next</w:t>
       </w:r>
       <w:r>
         <w:rPr>
-          <w:rFonts w:asciiTheme="minorHAnsi" w:eastAsia="Times New Roman" w:hAnsiTheme="minorHAnsi" w:cstheme="minorHAnsi"/>
+          <w:rFonts w:ascii="Times New Roman" w:eastAsia="Times New Roman" w:hAnsi="Times New Roman" w:cs="Times New Roman"/>
         </w:rPr>
         <w:t>.</w:t>
       </w:r>
       <w:r>
         <w:rPr>
-          <w:rFonts w:asciiTheme="minorHAnsi" w:eastAsia="Times New Roman" w:hAnsiTheme="minorHAnsi" w:cstheme="minorHAnsi"/>
+          <w:rFonts w:ascii="Times New Roman" w:eastAsia="Times New Roman" w:hAnsi="Times New Roman" w:cs="Times New Roman"/>
         </w:rPr>
         <w:t>JS, Supabase, Framer</w:t>
       </w:r>
       <w:r>
         <w:rPr>
-          <w:rFonts w:asciiTheme="minorHAnsi" w:eastAsia="Times New Roman" w:hAnsiTheme="minorHAnsi" w:cstheme="minorHAnsi"/>
+          <w:rFonts w:ascii="Times New Roman" w:eastAsia="Times New Roman" w:hAnsi="Times New Roman" w:cs="Times New Roman"/>
         </w:rPr>
         <w:t xml:space="preserve"> Motion</w:t>
       </w:r>
@@ -909,60 +920,60 @@
         <w:ind w:left="1080"/>
         <w:contextualSpacing/>
         <w:rPr>
-          <w:rFonts w:asciiTheme="minorHAnsi" w:eastAsia="Times New Roman" w:hAnsiTheme="minorHAnsi" w:cstheme="minorHAnsi"/>
-        </w:rPr>
-      </w:pPr>
-      <w:r>
-        <w:rPr>
-          <w:rFonts w:asciiTheme="minorHAnsi" w:eastAsia="Times New Roman" w:hAnsiTheme="minorHAnsi" w:cstheme="minorHAnsi"/>
+          <w:rFonts w:ascii="Times New Roman" w:eastAsia="Times New Roman" w:hAnsi="Times New Roman" w:cs="Times New Roman"/>
+        </w:rPr>
+      </w:pPr>
+      <w:r>
+        <w:rPr>
+          <w:rFonts w:ascii="Times New Roman" w:eastAsia="Times New Roman" w:hAnsi="Times New Roman" w:cs="Times New Roman"/>
         </w:rPr>
         <w:t>Created a</w:t>
       </w:r>
       <w:r>
         <w:rPr>
-          <w:rFonts w:asciiTheme="minorHAnsi" w:eastAsia="Times New Roman" w:hAnsiTheme="minorHAnsi" w:cstheme="minorHAnsi"/>
+          <w:rFonts w:ascii="Times New Roman" w:eastAsia="Times New Roman" w:hAnsi="Times New Roman" w:cs="Times New Roman"/>
         </w:rPr>
         <w:t xml:space="preserve"> </w:t>
       </w:r>
       <w:r>
         <w:rPr>
-          <w:rFonts w:asciiTheme="minorHAnsi" w:eastAsia="Times New Roman" w:hAnsiTheme="minorHAnsi" w:cstheme="minorHAnsi"/>
+          <w:rFonts w:ascii="Times New Roman" w:eastAsia="Times New Roman" w:hAnsi="Times New Roman" w:cs="Times New Roman"/>
         </w:rPr>
         <w:t>web</w:t>
       </w:r>
       <w:r>
         <w:rPr>
-          <w:rFonts w:asciiTheme="minorHAnsi" w:eastAsia="Times New Roman" w:hAnsiTheme="minorHAnsi" w:cstheme="minorHAnsi"/>
+          <w:rFonts w:ascii="Times New Roman" w:eastAsia="Times New Roman" w:hAnsi="Times New Roman" w:cs="Times New Roman"/>
         </w:rPr>
         <w:t xml:space="preserve"> Social Media Service </w:t>
       </w:r>
       <w:r>
         <w:rPr>
-          <w:rFonts w:asciiTheme="minorHAnsi" w:eastAsia="Times New Roman" w:hAnsiTheme="minorHAnsi" w:cstheme="minorHAnsi"/>
+          <w:rFonts w:ascii="Times New Roman" w:eastAsia="Times New Roman" w:hAnsi="Times New Roman" w:cs="Times New Roman"/>
         </w:rPr>
         <w:t>in Next</w:t>
       </w:r>
       <w:r>
         <w:rPr>
-          <w:rFonts w:asciiTheme="minorHAnsi" w:eastAsia="Times New Roman" w:hAnsiTheme="minorHAnsi" w:cstheme="minorHAnsi"/>
+          <w:rFonts w:ascii="Times New Roman" w:eastAsia="Times New Roman" w:hAnsi="Times New Roman" w:cs="Times New Roman"/>
         </w:rPr>
         <w:t>.</w:t>
       </w:r>
       <w:r>
         <w:rPr>
-          <w:rFonts w:asciiTheme="minorHAnsi" w:eastAsia="Times New Roman" w:hAnsiTheme="minorHAnsi" w:cstheme="minorHAnsi"/>
+          <w:rFonts w:ascii="Times New Roman" w:eastAsia="Times New Roman" w:hAnsi="Times New Roman" w:cs="Times New Roman"/>
         </w:rPr>
         <w:t xml:space="preserve">JS on the frontend, Supabase </w:t>
       </w:r>
       <w:r>
         <w:rPr>
-          <w:rFonts w:asciiTheme="minorHAnsi" w:eastAsia="Times New Roman" w:hAnsiTheme="minorHAnsi" w:cstheme="minorHAnsi"/>
+          <w:rFonts w:ascii="Times New Roman" w:eastAsia="Times New Roman" w:hAnsi="Times New Roman" w:cs="Times New Roman"/>
         </w:rPr>
         <w:t>handling the auth, database and backend</w:t>
       </w:r>
       <w:r>
         <w:rPr>
-          <w:rFonts w:asciiTheme="minorHAnsi" w:eastAsia="Times New Roman" w:hAnsiTheme="minorHAnsi" w:cstheme="minorHAnsi"/>
+          <w:rFonts w:ascii="Times New Roman" w:eastAsia="Times New Roman" w:hAnsi="Times New Roman" w:cs="Times New Roman"/>
         </w:rPr>
         <w:t>.</w:t>
       </w:r>
@@ -977,20 +988,14 @@
         <w:ind w:left="1080"/>
         <w:contextualSpacing/>
         <w:rPr>
-          <w:rFonts w:asciiTheme="minorHAnsi" w:eastAsia="Times New Roman" w:hAnsiTheme="minorHAnsi" w:cstheme="minorHAnsi"/>
-        </w:rPr>
-      </w:pPr>
-      <w:r>
-        <w:rPr>
-          <w:rFonts w:asciiTheme="minorHAnsi" w:eastAsia="Times New Roman" w:hAnsiTheme="minorHAnsi" w:cstheme="minorHAnsi"/>
-        </w:rPr>
-        <w:t>Used Supabase to track and organize transfer pathway data, helping students identify requirements for their target universities</w:t>
-      </w:r>
-      <w:r>
-        <w:rPr>
-          <w:rFonts w:asciiTheme="minorHAnsi" w:eastAsia="Times New Roman" w:hAnsiTheme="minorHAnsi" w:cstheme="minorHAnsi"/>
-        </w:rPr>
-        <w:t>.</w:t>
+          <w:rFonts w:ascii="Times New Roman" w:eastAsia="Times New Roman" w:hAnsi="Times New Roman" w:cs="Times New Roman"/>
+        </w:rPr>
+      </w:pPr>
+      <w:r>
+        <w:rPr>
+          <w:rFonts w:ascii="Times New Roman" w:eastAsia="Times New Roman" w:hAnsi="Times New Roman" w:cs="Times New Roman"/>
+        </w:rPr>
+        <w:t>Used Supabase to track and organize transfer pathway data, helping students identify requirements for their target universities.</w:t>
       </w:r>
     </w:p>
     <w:p>
@@ -1003,18 +1008,18 @@
         <w:ind w:left="1080"/>
         <w:contextualSpacing/>
         <w:rPr>
-          <w:rFonts w:asciiTheme="minorHAnsi" w:eastAsia="Times New Roman" w:hAnsiTheme="minorHAnsi" w:cstheme="minorHAnsi"/>
-        </w:rPr>
-      </w:pPr>
-      <w:r>
-        <w:rPr>
-          <w:rFonts w:asciiTheme="minorHAnsi" w:eastAsia="Times New Roman" w:hAnsiTheme="minorHAnsi" w:cstheme="minorHAnsi"/>
+          <w:rFonts w:ascii="Times New Roman" w:eastAsia="Times New Roman" w:hAnsi="Times New Roman" w:cs="Times New Roman"/>
+        </w:rPr>
+      </w:pPr>
+      <w:r>
+        <w:rPr>
+          <w:rFonts w:ascii="Times New Roman" w:eastAsia="Times New Roman" w:hAnsi="Times New Roman" w:cs="Times New Roman"/>
         </w:rPr>
         <w:t>Built a Markdown-Based rich text publishing system for MESA Staff to create and distribute student announcements</w:t>
       </w:r>
       <w:r>
         <w:rPr>
-          <w:rFonts w:asciiTheme="minorHAnsi" w:eastAsia="Times New Roman" w:hAnsiTheme="minorHAnsi" w:cstheme="minorHAnsi"/>
+          <w:rFonts w:ascii="Times New Roman" w:eastAsia="Times New Roman" w:hAnsi="Times New Roman" w:cs="Times New Roman"/>
         </w:rPr>
         <w:t>.</w:t>
       </w:r>
@@ -1024,7 +1029,7 @@
         <w:spacing w:line="240" w:lineRule="auto"/>
         <w:contextualSpacing/>
         <w:rPr>
-          <w:rFonts w:asciiTheme="minorHAnsi" w:eastAsia="Times New Roman" w:hAnsiTheme="minorHAnsi" w:cstheme="minorHAnsi"/>
+          <w:rFonts w:ascii="Times New Roman" w:eastAsia="Times New Roman" w:hAnsi="Times New Roman" w:cs="Times New Roman"/>
         </w:rPr>
       </w:pPr>
     </w:p>
@@ -1034,61 +1039,56 @@
         <w:ind w:firstLine="720"/>
         <w:contextualSpacing/>
         <w:rPr>
-          <w:rFonts w:asciiTheme="minorHAnsi" w:eastAsia="Garamond" w:hAnsiTheme="minorHAnsi" w:cstheme="minorHAnsi"/>
-          <w:b/>
-        </w:rPr>
-      </w:pPr>
-      <w:r>
-        <w:rPr>
-          <w:rFonts w:asciiTheme="minorHAnsi" w:eastAsia="Garamond" w:hAnsiTheme="minorHAnsi" w:cstheme="minorHAnsi"/>
+          <w:rFonts w:ascii="Times New Roman" w:eastAsia="Garamond" w:hAnsi="Times New Roman" w:cs="Times New Roman"/>
+          <w:b/>
+        </w:rPr>
+      </w:pPr>
+      <w:proofErr w:type="spellStart"/>
+      <w:r>
+        <w:rPr>
+          <w:rFonts w:ascii="Times New Roman" w:eastAsia="Garamond" w:hAnsi="Times New Roman" w:cs="Times New Roman"/>
           <w:b/>
         </w:rPr>
         <w:t>MESAMobile</w:t>
       </w:r>
-      <w:r>
-        <w:rPr>
-          <w:rFonts w:asciiTheme="minorHAnsi" w:eastAsia="Garamond" w:hAnsiTheme="minorHAnsi" w:cstheme="minorHAnsi"/>
-          <w:b/>
-        </w:rPr>
-        <w:t xml:space="preserve">, </w:t>
-      </w:r>
-      <w:r>
-        <w:rPr>
-          <w:rFonts w:asciiTheme="minorHAnsi" w:eastAsia="Garamond" w:hAnsiTheme="minorHAnsi" w:cstheme="minorHAnsi"/>
-          <w:b/>
-        </w:rPr>
-        <w:t>iOS</w:t>
-      </w:r>
-      <w:r>
-        <w:rPr>
-          <w:rFonts w:asciiTheme="minorHAnsi" w:eastAsia="Garamond" w:hAnsiTheme="minorHAnsi" w:cstheme="minorHAnsi"/>
+      <w:proofErr w:type="spellEnd"/>
+      <w:r>
+        <w:rPr>
+          <w:rFonts w:ascii="Times New Roman" w:eastAsia="Garamond" w:hAnsi="Times New Roman" w:cs="Times New Roman"/>
+          <w:b/>
+        </w:rPr>
+        <w:t>, iOS</w:t>
+      </w:r>
+      <w:r>
+        <w:rPr>
+          <w:rFonts w:ascii="Times New Roman" w:eastAsia="Garamond" w:hAnsi="Times New Roman" w:cs="Times New Roman"/>
           <w:b/>
         </w:rPr>
         <w:t xml:space="preserve"> App</w:t>
       </w:r>
       <w:r>
         <w:rPr>
-          <w:rFonts w:asciiTheme="minorHAnsi" w:eastAsia="Garamond" w:hAnsiTheme="minorHAnsi" w:cstheme="minorHAnsi"/>
+          <w:rFonts w:ascii="Times New Roman" w:eastAsia="Garamond" w:hAnsi="Times New Roman" w:cs="Times New Roman"/>
           <w:b/>
         </w:rPr>
         <w:tab/>
       </w:r>
       <w:r>
         <w:rPr>
-          <w:rFonts w:asciiTheme="minorHAnsi" w:eastAsia="Garamond" w:hAnsiTheme="minorHAnsi" w:cstheme="minorHAnsi"/>
+          <w:rFonts w:ascii="Times New Roman" w:eastAsia="Garamond" w:hAnsi="Times New Roman" w:cs="Times New Roman"/>
           <w:b/>
         </w:rPr>
         <w:tab/>
       </w:r>
       <w:r>
         <w:rPr>
-          <w:rFonts w:asciiTheme="minorHAnsi" w:eastAsia="Garamond" w:hAnsiTheme="minorHAnsi" w:cstheme="minorHAnsi"/>
+          <w:rFonts w:ascii="Times New Roman" w:eastAsia="Garamond" w:hAnsi="Times New Roman" w:cs="Times New Roman"/>
         </w:rPr>
         <w:tab/>
       </w:r>
       <w:r>
         <w:rPr>
-          <w:rFonts w:asciiTheme="minorHAnsi" w:eastAsia="Garamond" w:hAnsiTheme="minorHAnsi" w:cstheme="minorHAnsi"/>
+          <w:rFonts w:ascii="Times New Roman" w:eastAsia="Garamond" w:hAnsi="Times New Roman" w:cs="Times New Roman"/>
           <w:b/>
         </w:rPr>
         <w:t xml:space="preserve">                                                  </w:t>
@@ -1100,20 +1100,14 @@
         <w:ind w:left="720"/>
         <w:contextualSpacing/>
         <w:rPr>
-          <w:rFonts w:asciiTheme="minorHAnsi" w:eastAsia="Times New Roman" w:hAnsiTheme="minorHAnsi" w:cstheme="minorHAnsi"/>
-        </w:rPr>
-      </w:pPr>
-      <w:r>
-        <w:rPr>
-          <w:rFonts w:asciiTheme="minorHAnsi" w:eastAsia="Times New Roman" w:hAnsiTheme="minorHAnsi" w:cstheme="minorHAnsi"/>
-        </w:rPr>
-        <w:t xml:space="preserve">Languages and Tools Utilized: </w:t>
-      </w:r>
-      <w:r>
-        <w:rPr>
-          <w:rFonts w:asciiTheme="minorHAnsi" w:eastAsia="Times New Roman" w:hAnsiTheme="minorHAnsi" w:cstheme="minorHAnsi"/>
-        </w:rPr>
-        <w:t>React Native, Expo</w:t>
+          <w:rFonts w:ascii="Times New Roman" w:eastAsia="Times New Roman" w:hAnsi="Times New Roman" w:cs="Times New Roman"/>
+        </w:rPr>
+      </w:pPr>
+      <w:r>
+        <w:rPr>
+          <w:rFonts w:ascii="Times New Roman" w:eastAsia="Times New Roman" w:hAnsi="Times New Roman" w:cs="Times New Roman"/>
+        </w:rPr>
+        <w:t>Languages and Tools Utilized: React Native, Expo</w:t>
       </w:r>
     </w:p>
     <w:p>
@@ -1126,30 +1120,24 @@
         <w:ind w:left="1080"/>
         <w:contextualSpacing/>
         <w:rPr>
-          <w:rFonts w:asciiTheme="minorHAnsi" w:eastAsia="Times New Roman" w:hAnsiTheme="minorHAnsi" w:cstheme="minorHAnsi"/>
-        </w:rPr>
-      </w:pPr>
-      <w:r>
-        <w:rPr>
-          <w:rFonts w:asciiTheme="minorHAnsi" w:eastAsia="Times New Roman" w:hAnsiTheme="minorHAnsi" w:cstheme="minorHAnsi"/>
-        </w:rPr>
-        <w:t>Created a</w:t>
-      </w:r>
-      <w:r>
-        <w:rPr>
-          <w:rFonts w:asciiTheme="minorHAnsi" w:eastAsia="Times New Roman" w:hAnsiTheme="minorHAnsi" w:cstheme="minorHAnsi"/>
-        </w:rPr>
-        <w:t xml:space="preserve"> mobile companion app to </w:t>
-      </w:r>
-      <w:r>
-        <w:rPr>
-          <w:rFonts w:asciiTheme="minorHAnsi" w:eastAsia="Times New Roman" w:hAnsiTheme="minorHAnsi" w:cstheme="minorHAnsi"/>
+          <w:rFonts w:ascii="Times New Roman" w:eastAsia="Times New Roman" w:hAnsi="Times New Roman" w:cs="Times New Roman"/>
+        </w:rPr>
+      </w:pPr>
+      <w:r>
+        <w:rPr>
+          <w:rFonts w:ascii="Times New Roman" w:eastAsia="Times New Roman" w:hAnsi="Times New Roman" w:cs="Times New Roman"/>
+        </w:rPr>
+        <w:t xml:space="preserve">Created a mobile companion app to </w:t>
+      </w:r>
+      <w:r>
+        <w:rPr>
+          <w:rFonts w:ascii="Times New Roman" w:eastAsia="Times New Roman" w:hAnsi="Times New Roman" w:cs="Times New Roman"/>
         </w:rPr>
         <w:t>MESA Connect</w:t>
       </w:r>
       <w:r>
         <w:rPr>
-          <w:rFonts w:asciiTheme="minorHAnsi" w:eastAsia="Times New Roman" w:hAnsiTheme="minorHAnsi" w:cstheme="minorHAnsi"/>
+          <w:rFonts w:ascii="Times New Roman" w:eastAsia="Times New Roman" w:hAnsi="Times New Roman" w:cs="Times New Roman"/>
         </w:rPr>
         <w:t xml:space="preserve"> using Expo and React Native.</w:t>
       </w:r>
@@ -1164,12 +1152,12 @@
         <w:ind w:left="1080"/>
         <w:contextualSpacing/>
         <w:rPr>
-          <w:rFonts w:asciiTheme="minorHAnsi" w:eastAsia="Times New Roman" w:hAnsiTheme="minorHAnsi" w:cstheme="minorHAnsi"/>
-        </w:rPr>
-      </w:pPr>
-      <w:r>
-        <w:rPr>
-          <w:rFonts w:asciiTheme="minorHAnsi" w:eastAsia="Times New Roman" w:hAnsiTheme="minorHAnsi" w:cstheme="minorHAnsi"/>
+          <w:rFonts w:ascii="Times New Roman" w:eastAsia="Times New Roman" w:hAnsi="Times New Roman" w:cs="Times New Roman"/>
+        </w:rPr>
+      </w:pPr>
+      <w:r>
+        <w:rPr>
+          <w:rFonts w:ascii="Times New Roman" w:eastAsia="Times New Roman" w:hAnsi="Times New Roman" w:cs="Times New Roman"/>
         </w:rPr>
         <w:t>Integrated Apple Maps with REST APIs to display university locations with transfer information.</w:t>
       </w:r>
@@ -1184,24 +1172,24 @@
         <w:ind w:left="1080"/>
         <w:contextualSpacing/>
         <w:rPr>
-          <w:rFonts w:asciiTheme="minorHAnsi" w:eastAsia="Times New Roman" w:hAnsiTheme="minorHAnsi" w:cstheme="minorHAnsi"/>
-        </w:rPr>
-      </w:pPr>
-      <w:r>
-        <w:rPr>
-          <w:rFonts w:asciiTheme="minorHAnsi" w:eastAsia="Times New Roman" w:hAnsiTheme="minorHAnsi" w:cstheme="minorHAnsi"/>
+          <w:rFonts w:ascii="Times New Roman" w:eastAsia="Times New Roman" w:hAnsi="Times New Roman" w:cs="Times New Roman"/>
+        </w:rPr>
+      </w:pPr>
+      <w:r>
+        <w:rPr>
+          <w:rFonts w:ascii="Times New Roman" w:eastAsia="Times New Roman" w:hAnsi="Times New Roman" w:cs="Times New Roman"/>
         </w:rPr>
         <w:t xml:space="preserve">RLS-backed messaging system that allows </w:t>
       </w:r>
       <w:r>
         <w:rPr>
-          <w:rFonts w:asciiTheme="minorHAnsi" w:eastAsia="Times New Roman" w:hAnsiTheme="minorHAnsi" w:cstheme="minorHAnsi"/>
+          <w:rFonts w:ascii="Times New Roman" w:eastAsia="Times New Roman" w:hAnsi="Times New Roman" w:cs="Times New Roman"/>
         </w:rPr>
         <w:t>students to connect and plan study sessions</w:t>
       </w:r>
       <w:r>
         <w:rPr>
-          <w:rFonts w:asciiTheme="minorHAnsi" w:eastAsia="Times New Roman" w:hAnsiTheme="minorHAnsi" w:cstheme="minorHAnsi"/>
+          <w:rFonts w:ascii="Times New Roman" w:eastAsia="Times New Roman" w:hAnsi="Times New Roman" w:cs="Times New Roman"/>
         </w:rPr>
         <w:t>.</w:t>
       </w:r>
@@ -1213,7 +1201,7 @@
         <w:spacing w:line="240" w:lineRule="auto"/>
         <w:contextualSpacing/>
         <w:rPr>
-          <w:rFonts w:asciiTheme="minorHAnsi" w:eastAsia="Garamond" w:hAnsiTheme="minorHAnsi" w:cstheme="minorHAnsi"/>
+          <w:rFonts w:ascii="Times New Roman" w:eastAsia="Garamond" w:hAnsi="Times New Roman" w:cs="Times New Roman"/>
           <w:b/>
         </w:rPr>
       </w:pPr>
@@ -1223,13 +1211,13 @@
         <w:spacing w:line="240" w:lineRule="auto"/>
         <w:contextualSpacing/>
         <w:rPr>
-          <w:rFonts w:asciiTheme="minorHAnsi" w:eastAsia="Garamond" w:hAnsiTheme="minorHAnsi" w:cstheme="minorHAnsi"/>
-          <w:b/>
-        </w:rPr>
-      </w:pPr>
-      <w:r>
-        <w:rPr>
-          <w:rFonts w:asciiTheme="minorHAnsi" w:eastAsia="Garamond" w:hAnsiTheme="minorHAnsi" w:cstheme="minorHAnsi"/>
+          <w:rFonts w:ascii="Times New Roman" w:eastAsia="Garamond" w:hAnsi="Times New Roman" w:cs="Times New Roman"/>
+          <w:b/>
+        </w:rPr>
+      </w:pPr>
+      <w:r>
+        <w:rPr>
+          <w:rFonts w:ascii="Times New Roman" w:eastAsia="Garamond" w:hAnsi="Times New Roman" w:cs="Times New Roman"/>
           <w:b/>
         </w:rPr>
         <w:t>WORK EXPERIENCE</w:t>
@@ -1241,136 +1229,136 @@
         <w:ind w:firstLine="720"/>
         <w:contextualSpacing/>
         <w:rPr>
-          <w:rFonts w:asciiTheme="minorHAnsi" w:eastAsia="Times New Roman" w:hAnsiTheme="minorHAnsi" w:cstheme="minorHAnsi"/>
-        </w:rPr>
-      </w:pPr>
-      <w:r>
-        <w:rPr>
-          <w:rFonts w:asciiTheme="minorHAnsi" w:eastAsia="Times New Roman" w:hAnsiTheme="minorHAnsi" w:cstheme="minorHAnsi"/>
+          <w:rFonts w:ascii="Times New Roman" w:eastAsia="Times New Roman" w:hAnsi="Times New Roman" w:cs="Times New Roman"/>
+        </w:rPr>
+      </w:pPr>
+      <w:r>
+        <w:rPr>
+          <w:rFonts w:ascii="Times New Roman" w:eastAsia="Times New Roman" w:hAnsi="Times New Roman" w:cs="Times New Roman"/>
           <w:b/>
         </w:rPr>
         <w:t xml:space="preserve">Lead Software Developer and </w:t>
       </w:r>
       <w:r>
         <w:rPr>
-          <w:rFonts w:asciiTheme="minorHAnsi" w:eastAsia="Times New Roman" w:hAnsiTheme="minorHAnsi" w:cstheme="minorHAnsi"/>
+          <w:rFonts w:ascii="Times New Roman" w:eastAsia="Times New Roman" w:hAnsi="Times New Roman" w:cs="Times New Roman"/>
           <w:b/>
         </w:rPr>
         <w:t>Tutor</w:t>
       </w:r>
       <w:r>
         <w:rPr>
-          <w:rFonts w:asciiTheme="minorHAnsi" w:eastAsia="Times New Roman" w:hAnsiTheme="minorHAnsi" w:cstheme="minorHAnsi"/>
+          <w:rFonts w:ascii="Times New Roman" w:eastAsia="Times New Roman" w:hAnsi="Times New Roman" w:cs="Times New Roman"/>
           <w:b/>
         </w:rPr>
         <w:t xml:space="preserve"> </w:t>
       </w:r>
       <w:r>
         <w:rPr>
-          <w:rFonts w:asciiTheme="minorHAnsi" w:eastAsia="Times New Roman" w:hAnsiTheme="minorHAnsi" w:cstheme="minorHAnsi"/>
+          <w:rFonts w:ascii="Times New Roman" w:eastAsia="Times New Roman" w:hAnsi="Times New Roman" w:cs="Times New Roman"/>
         </w:rPr>
         <w:t xml:space="preserve">– </w:t>
       </w:r>
       <w:r>
         <w:rPr>
-          <w:rFonts w:asciiTheme="minorHAnsi" w:eastAsia="Times New Roman" w:hAnsiTheme="minorHAnsi" w:cstheme="minorHAnsi"/>
+          <w:rFonts w:ascii="Times New Roman" w:eastAsia="Times New Roman" w:hAnsi="Times New Roman" w:cs="Times New Roman"/>
         </w:rPr>
         <w:t>MESA</w:t>
       </w:r>
       <w:r>
         <w:rPr>
-          <w:rFonts w:asciiTheme="minorHAnsi" w:eastAsia="Times New Roman" w:hAnsiTheme="minorHAnsi" w:cstheme="minorHAnsi"/>
+          <w:rFonts w:ascii="Times New Roman" w:eastAsia="Times New Roman" w:hAnsi="Times New Roman" w:cs="Times New Roman"/>
         </w:rPr>
         <w:t xml:space="preserve">, </w:t>
       </w:r>
       <w:r>
         <w:rPr>
-          <w:rFonts w:asciiTheme="minorHAnsi" w:eastAsia="Times New Roman" w:hAnsiTheme="minorHAnsi" w:cstheme="minorHAnsi"/>
+          <w:rFonts w:ascii="Times New Roman" w:eastAsia="Times New Roman" w:hAnsi="Times New Roman" w:cs="Times New Roman"/>
         </w:rPr>
         <w:t>Valencia</w:t>
       </w:r>
       <w:r>
         <w:rPr>
-          <w:rFonts w:asciiTheme="minorHAnsi" w:eastAsia="Times New Roman" w:hAnsiTheme="minorHAnsi" w:cstheme="minorHAnsi"/>
+          <w:rFonts w:ascii="Times New Roman" w:eastAsia="Times New Roman" w:hAnsi="Times New Roman" w:cs="Times New Roman"/>
         </w:rPr>
         <w:t>, CA</w:t>
       </w:r>
       <w:r>
         <w:rPr>
-          <w:rFonts w:asciiTheme="minorHAnsi" w:eastAsia="Times New Roman" w:hAnsiTheme="minorHAnsi" w:cstheme="minorHAnsi"/>
+          <w:rFonts w:ascii="Times New Roman" w:eastAsia="Times New Roman" w:hAnsi="Times New Roman" w:cs="Times New Roman"/>
         </w:rPr>
         <w:t xml:space="preserve"> </w:t>
       </w:r>
       <w:r>
         <w:rPr>
-          <w:rFonts w:asciiTheme="minorHAnsi" w:eastAsia="Times New Roman" w:hAnsiTheme="minorHAnsi" w:cstheme="minorHAnsi"/>
+          <w:rFonts w:ascii="Times New Roman" w:eastAsia="Times New Roman" w:hAnsi="Times New Roman" w:cs="Times New Roman"/>
         </w:rPr>
         <w:tab/>
       </w:r>
       <w:r>
         <w:rPr>
-          <w:rFonts w:asciiTheme="minorHAnsi" w:eastAsia="Times New Roman" w:hAnsiTheme="minorHAnsi" w:cstheme="minorHAnsi"/>
+          <w:rFonts w:ascii="Times New Roman" w:eastAsia="Times New Roman" w:hAnsi="Times New Roman" w:cs="Times New Roman"/>
         </w:rPr>
         <w:tab/>
       </w:r>
       <w:r>
         <w:rPr>
-          <w:rFonts w:asciiTheme="minorHAnsi" w:eastAsia="Times New Roman" w:hAnsiTheme="minorHAnsi" w:cstheme="minorHAnsi"/>
+          <w:rFonts w:ascii="Times New Roman" w:eastAsia="Times New Roman" w:hAnsi="Times New Roman" w:cs="Times New Roman"/>
         </w:rPr>
         <w:tab/>
       </w:r>
       <w:r>
         <w:rPr>
-          <w:rFonts w:asciiTheme="minorHAnsi" w:eastAsia="Times New Roman" w:hAnsiTheme="minorHAnsi" w:cstheme="minorHAnsi"/>
+          <w:rFonts w:ascii="Times New Roman" w:eastAsia="Times New Roman" w:hAnsi="Times New Roman" w:cs="Times New Roman"/>
         </w:rPr>
         <w:tab/>
         <w:t xml:space="preserve"> </w:t>
       </w:r>
       <w:r>
         <w:rPr>
-          <w:rFonts w:asciiTheme="minorHAnsi" w:eastAsia="Times New Roman" w:hAnsiTheme="minorHAnsi" w:cstheme="minorHAnsi"/>
+          <w:rFonts w:ascii="Times New Roman" w:eastAsia="Times New Roman" w:hAnsi="Times New Roman" w:cs="Times New Roman"/>
         </w:rPr>
         <w:t xml:space="preserve">   </w:t>
       </w:r>
       <w:r>
         <w:rPr>
-          <w:rFonts w:asciiTheme="minorHAnsi" w:eastAsia="Times New Roman" w:hAnsiTheme="minorHAnsi" w:cstheme="minorHAnsi"/>
+          <w:rFonts w:ascii="Times New Roman" w:eastAsia="Times New Roman" w:hAnsi="Times New Roman" w:cs="Times New Roman"/>
         </w:rPr>
         <w:t xml:space="preserve">  </w:t>
       </w:r>
       <w:r>
         <w:rPr>
-          <w:rFonts w:asciiTheme="minorHAnsi" w:eastAsia="Times New Roman" w:hAnsiTheme="minorHAnsi" w:cstheme="minorHAnsi"/>
+          <w:rFonts w:ascii="Times New Roman" w:eastAsia="Times New Roman" w:hAnsi="Times New Roman" w:cs="Times New Roman"/>
         </w:rPr>
         <w:t xml:space="preserve">Dec </w:t>
       </w:r>
       <w:r>
         <w:rPr>
-          <w:rFonts w:asciiTheme="minorHAnsi" w:eastAsia="Times New Roman" w:hAnsiTheme="minorHAnsi" w:cstheme="minorHAnsi"/>
+          <w:rFonts w:ascii="Times New Roman" w:eastAsia="Times New Roman" w:hAnsi="Times New Roman" w:cs="Times New Roman"/>
         </w:rPr>
         <w:t>2023</w:t>
       </w:r>
       <w:r>
         <w:rPr>
-          <w:rFonts w:asciiTheme="minorHAnsi" w:eastAsia="Times New Roman" w:hAnsiTheme="minorHAnsi" w:cstheme="minorHAnsi"/>
+          <w:rFonts w:ascii="Times New Roman" w:eastAsia="Times New Roman" w:hAnsi="Times New Roman" w:cs="Times New Roman"/>
         </w:rPr>
         <w:t>–</w:t>
       </w:r>
       <w:r>
         <w:rPr>
-          <w:rFonts w:asciiTheme="minorHAnsi" w:eastAsia="Times New Roman" w:hAnsiTheme="minorHAnsi" w:cstheme="minorHAnsi"/>
+          <w:rFonts w:ascii="Times New Roman" w:eastAsia="Times New Roman" w:hAnsi="Times New Roman" w:cs="Times New Roman"/>
         </w:rPr>
         <w:t xml:space="preserve">May </w:t>
       </w:r>
       <w:r>
         <w:rPr>
-          <w:rFonts w:asciiTheme="minorHAnsi" w:eastAsia="Times New Roman" w:hAnsiTheme="minorHAnsi" w:cstheme="minorHAnsi"/>
+          <w:rFonts w:ascii="Times New Roman" w:eastAsia="Times New Roman" w:hAnsi="Times New Roman" w:cs="Times New Roman"/>
         </w:rPr>
         <w:t>20</w:t>
       </w:r>
       <w:r>
         <w:rPr>
-          <w:rFonts w:asciiTheme="minorHAnsi" w:eastAsia="Times New Roman" w:hAnsiTheme="minorHAnsi" w:cstheme="minorHAnsi"/>
+          <w:rFonts w:ascii="Times New Roman" w:eastAsia="Times New Roman" w:hAnsi="Times New Roman" w:cs="Times New Roman"/>
         </w:rPr>
         <w:t>26</w:t>
       </w:r>
@@ -1387,66 +1375,66 @@
         </w:tabs>
         <w:spacing w:line="240" w:lineRule="auto"/>
         <w:rPr>
-          <w:rFonts w:asciiTheme="minorHAnsi" w:eastAsia="Garamond" w:hAnsiTheme="minorHAnsi" w:cstheme="minorHAnsi"/>
-        </w:rPr>
-      </w:pPr>
-      <w:r>
-        <w:rPr>
-          <w:rFonts w:asciiTheme="minorHAnsi" w:eastAsia="Garamond" w:hAnsiTheme="minorHAnsi" w:cstheme="minorHAnsi"/>
+          <w:rFonts w:ascii="Times New Roman" w:eastAsia="Garamond" w:hAnsi="Times New Roman" w:cs="Times New Roman"/>
+        </w:rPr>
+      </w:pPr>
+      <w:r>
+        <w:rPr>
+          <w:rFonts w:ascii="Times New Roman" w:eastAsia="Garamond" w:hAnsi="Times New Roman" w:cs="Times New Roman"/>
         </w:rPr>
         <w:t xml:space="preserve">Tutored and lectured labs </w:t>
       </w:r>
       <w:r>
         <w:rPr>
-          <w:rFonts w:asciiTheme="minorHAnsi" w:eastAsia="Garamond" w:hAnsiTheme="minorHAnsi" w:cstheme="minorHAnsi"/>
+          <w:rFonts w:ascii="Times New Roman" w:eastAsia="Garamond" w:hAnsi="Times New Roman" w:cs="Times New Roman"/>
         </w:rPr>
         <w:t xml:space="preserve">as part of the </w:t>
       </w:r>
       <w:r>
         <w:rPr>
-          <w:rFonts w:asciiTheme="minorHAnsi" w:eastAsia="Garamond" w:hAnsiTheme="minorHAnsi" w:cstheme="minorHAnsi"/>
+          <w:rFonts w:ascii="Times New Roman" w:eastAsia="Garamond" w:hAnsi="Times New Roman" w:cs="Times New Roman"/>
         </w:rPr>
         <w:t>Latinx</w:t>
       </w:r>
       <w:r>
         <w:rPr>
-          <w:rFonts w:asciiTheme="minorHAnsi" w:eastAsia="Garamond" w:hAnsiTheme="minorHAnsi" w:cstheme="minorHAnsi"/>
+          <w:rFonts w:ascii="Times New Roman" w:eastAsia="Garamond" w:hAnsi="Times New Roman" w:cs="Times New Roman"/>
         </w:rPr>
         <w:t xml:space="preserve"> program, which helped</w:t>
       </w:r>
       <w:r>
         <w:rPr>
-          <w:rFonts w:asciiTheme="minorHAnsi" w:eastAsia="Garamond" w:hAnsiTheme="minorHAnsi" w:cstheme="minorHAnsi"/>
+          <w:rFonts w:ascii="Times New Roman" w:eastAsia="Garamond" w:hAnsi="Times New Roman" w:cs="Times New Roman"/>
         </w:rPr>
         <w:t xml:space="preserve"> </w:t>
       </w:r>
       <w:r>
         <w:rPr>
-          <w:rFonts w:asciiTheme="minorHAnsi" w:eastAsia="Garamond" w:hAnsiTheme="minorHAnsi" w:cstheme="minorHAnsi"/>
+          <w:rFonts w:ascii="Times New Roman" w:eastAsia="Garamond" w:hAnsi="Times New Roman" w:cs="Times New Roman"/>
         </w:rPr>
         <w:t xml:space="preserve">incoming </w:t>
       </w:r>
       <w:r>
         <w:rPr>
-          <w:rFonts w:asciiTheme="minorHAnsi" w:eastAsia="Garamond" w:hAnsiTheme="minorHAnsi" w:cstheme="minorHAnsi"/>
+          <w:rFonts w:ascii="Times New Roman" w:eastAsia="Garamond" w:hAnsi="Times New Roman" w:cs="Times New Roman"/>
         </w:rPr>
         <w:t xml:space="preserve">students </w:t>
       </w:r>
       <w:r>
         <w:rPr>
-          <w:rFonts w:asciiTheme="minorHAnsi" w:eastAsia="Garamond" w:hAnsiTheme="minorHAnsi" w:cstheme="minorHAnsi"/>
+          <w:rFonts w:ascii="Times New Roman" w:eastAsia="Garamond" w:hAnsi="Times New Roman" w:cs="Times New Roman"/>
         </w:rPr>
         <w:t xml:space="preserve">from the Hispanic community </w:t>
       </w:r>
       <w:r>
         <w:rPr>
-          <w:rFonts w:asciiTheme="minorHAnsi" w:eastAsia="Garamond" w:hAnsiTheme="minorHAnsi" w:cstheme="minorHAnsi"/>
+          <w:rFonts w:ascii="Times New Roman" w:eastAsia="Garamond" w:hAnsi="Times New Roman" w:cs="Times New Roman"/>
         </w:rPr>
         <w:t>learn tools</w:t>
       </w:r>
       <w:r>
         <w:rPr>
-          <w:rFonts w:asciiTheme="minorHAnsi" w:eastAsia="Garamond" w:hAnsiTheme="minorHAnsi" w:cstheme="minorHAnsi"/>
+          <w:rFonts w:ascii="Times New Roman" w:eastAsia="Garamond" w:hAnsi="Times New Roman" w:cs="Times New Roman"/>
         </w:rPr>
         <w:t xml:space="preserve"> such as React, SolidWorks, Unity.</w:t>
       </w:r>
@@ -1463,12 +1451,12 @@
         </w:tabs>
         <w:spacing w:line="240" w:lineRule="auto"/>
         <w:rPr>
-          <w:rFonts w:asciiTheme="minorHAnsi" w:eastAsia="Garamond" w:hAnsiTheme="minorHAnsi" w:cstheme="minorHAnsi"/>
-        </w:rPr>
-      </w:pPr>
-      <w:r>
-        <w:rPr>
-          <w:rFonts w:asciiTheme="minorHAnsi" w:eastAsia="Garamond" w:hAnsiTheme="minorHAnsi" w:cstheme="minorHAnsi"/>
+          <w:rFonts w:ascii="Times New Roman" w:eastAsia="Garamond" w:hAnsi="Times New Roman" w:cs="Times New Roman"/>
+        </w:rPr>
+      </w:pPr>
+      <w:r>
+        <w:rPr>
+          <w:rFonts w:ascii="Times New Roman" w:eastAsia="Garamond" w:hAnsi="Times New Roman" w:cs="Times New Roman"/>
         </w:rPr>
         <w:t>Helped develop projects and labs for students outside of STEM to do as a gateway into the field.</w:t>
       </w:r>
@@ -1485,12 +1473,12 @@
         </w:tabs>
         <w:spacing w:line="240" w:lineRule="auto"/>
         <w:rPr>
-          <w:rFonts w:asciiTheme="minorHAnsi" w:eastAsia="Garamond" w:hAnsiTheme="minorHAnsi" w:cstheme="minorHAnsi"/>
-        </w:rPr>
-      </w:pPr>
-      <w:r>
-        <w:rPr>
-          <w:rFonts w:asciiTheme="minorHAnsi" w:eastAsia="Garamond" w:hAnsiTheme="minorHAnsi" w:cstheme="minorHAnsi"/>
+          <w:rFonts w:ascii="Times New Roman" w:eastAsia="Garamond" w:hAnsi="Times New Roman" w:cs="Times New Roman"/>
+        </w:rPr>
+      </w:pPr>
+      <w:r>
+        <w:rPr>
+          <w:rFonts w:ascii="Times New Roman" w:eastAsia="Garamond" w:hAnsi="Times New Roman" w:cs="Times New Roman"/>
         </w:rPr>
         <w:t>Worked on various projects as well as did work on the official MESA COC Website.</w:t>
       </w:r>
@@ -1500,7 +1488,7 @@
         <w:spacing w:line="240" w:lineRule="auto"/>
         <w:contextualSpacing/>
         <w:rPr>
-          <w:rFonts w:asciiTheme="minorHAnsi" w:eastAsia="Garamond" w:hAnsiTheme="minorHAnsi" w:cstheme="minorHAnsi"/>
+          <w:rFonts w:ascii="Times New Roman" w:eastAsia="Garamond" w:hAnsi="Times New Roman" w:cs="Times New Roman"/>
           <w:b/>
         </w:rPr>
       </w:pPr>
@@ -1510,19 +1498,19 @@
         <w:spacing w:line="240" w:lineRule="auto"/>
         <w:contextualSpacing/>
         <w:rPr>
-          <w:rFonts w:asciiTheme="minorHAnsi" w:eastAsia="Garamond" w:hAnsiTheme="minorHAnsi" w:cstheme="minorHAnsi"/>
-        </w:rPr>
-      </w:pPr>
-      <w:r>
-        <w:rPr>
-          <w:rFonts w:asciiTheme="minorHAnsi" w:eastAsia="Garamond" w:hAnsiTheme="minorHAnsi" w:cstheme="minorHAnsi"/>
+          <w:rFonts w:ascii="Times New Roman" w:eastAsia="Garamond" w:hAnsi="Times New Roman" w:cs="Times New Roman"/>
+        </w:rPr>
+      </w:pPr>
+      <w:r>
+        <w:rPr>
+          <w:rFonts w:ascii="Times New Roman" w:eastAsia="Garamond" w:hAnsi="Times New Roman" w:cs="Times New Roman"/>
           <w:b/>
         </w:rPr>
         <w:t>CAMPUS INVOLVEMENT/VOLUNTEER WORK</w:t>
       </w:r>
       <w:r>
         <w:rPr>
-          <w:rFonts w:asciiTheme="minorHAnsi" w:eastAsia="Garamond" w:hAnsiTheme="minorHAnsi" w:cstheme="minorHAnsi"/>
+          <w:rFonts w:ascii="Times New Roman" w:eastAsia="Garamond" w:hAnsi="Times New Roman" w:cs="Times New Roman"/>
         </w:rPr>
         <w:tab/>
       </w:r>
@@ -1536,12 +1524,12 @@
         <w:ind w:left="720"/>
         <w:contextualSpacing/>
         <w:rPr>
-          <w:rFonts w:asciiTheme="minorHAnsi" w:eastAsia="Garamond" w:hAnsiTheme="minorHAnsi" w:cstheme="minorHAnsi"/>
-        </w:rPr>
-      </w:pPr>
-      <w:r>
-        <w:rPr>
-          <w:rFonts w:asciiTheme="minorHAnsi" w:eastAsia="Garamond" w:hAnsiTheme="minorHAnsi" w:cstheme="minorHAnsi"/>
+          <w:rFonts w:ascii="Times New Roman" w:eastAsia="Garamond" w:hAnsi="Times New Roman" w:cs="Times New Roman"/>
+        </w:rPr>
+      </w:pPr>
+      <w:r>
+        <w:rPr>
+          <w:rFonts w:ascii="Times New Roman" w:eastAsia="Garamond" w:hAnsi="Times New Roman" w:cs="Times New Roman"/>
           <w:b/>
           <w:bCs/>
         </w:rPr>
@@ -1549,44 +1537,44 @@
       </w:r>
       <w:r>
         <w:rPr>
-          <w:rFonts w:asciiTheme="minorHAnsi" w:eastAsia="Garamond" w:hAnsiTheme="minorHAnsi" w:cstheme="minorHAnsi"/>
+          <w:rFonts w:ascii="Times New Roman" w:eastAsia="Garamond" w:hAnsi="Times New Roman" w:cs="Times New Roman"/>
         </w:rPr>
         <w:t>Announcer and Lead Backend Engineer</w:t>
       </w:r>
       <w:r>
         <w:rPr>
-          <w:rFonts w:asciiTheme="minorHAnsi" w:eastAsia="Garamond" w:hAnsiTheme="minorHAnsi" w:cstheme="minorHAnsi"/>
+          <w:rFonts w:ascii="Times New Roman" w:eastAsia="Garamond" w:hAnsi="Times New Roman" w:cs="Times New Roman"/>
         </w:rPr>
         <w:tab/>
       </w:r>
       <w:r>
         <w:rPr>
-          <w:rFonts w:asciiTheme="minorHAnsi" w:eastAsia="Garamond" w:hAnsiTheme="minorHAnsi" w:cstheme="minorHAnsi"/>
+          <w:rFonts w:ascii="Times New Roman" w:eastAsia="Garamond" w:hAnsi="Times New Roman" w:cs="Times New Roman"/>
         </w:rPr>
         <w:tab/>
       </w:r>
       <w:r>
         <w:rPr>
-          <w:rFonts w:asciiTheme="minorHAnsi" w:eastAsia="Garamond" w:hAnsiTheme="minorHAnsi" w:cstheme="minorHAnsi"/>
+          <w:rFonts w:ascii="Times New Roman" w:eastAsia="Garamond" w:hAnsi="Times New Roman" w:cs="Times New Roman"/>
         </w:rPr>
         <w:tab/>
       </w:r>
       <w:r>
         <w:rPr>
-          <w:rFonts w:asciiTheme="minorHAnsi" w:eastAsia="Garamond" w:hAnsiTheme="minorHAnsi" w:cstheme="minorHAnsi"/>
+          <w:rFonts w:ascii="Times New Roman" w:eastAsia="Garamond" w:hAnsi="Times New Roman" w:cs="Times New Roman"/>
         </w:rPr>
         <w:tab/>
         <w:t xml:space="preserve">     </w:t>
       </w:r>
       <w:r>
         <w:rPr>
-          <w:rFonts w:asciiTheme="minorHAnsi" w:eastAsia="Garamond" w:hAnsiTheme="minorHAnsi" w:cstheme="minorHAnsi"/>
+          <w:rFonts w:ascii="Times New Roman" w:eastAsia="Garamond" w:hAnsi="Times New Roman" w:cs="Times New Roman"/>
         </w:rPr>
         <w:t xml:space="preserve">                   </w:t>
       </w:r>
       <w:r>
         <w:rPr>
-          <w:rFonts w:asciiTheme="minorHAnsi" w:eastAsia="Garamond" w:hAnsiTheme="minorHAnsi" w:cstheme="minorHAnsi"/>
+          <w:rFonts w:ascii="Times New Roman" w:eastAsia="Garamond" w:hAnsi="Times New Roman" w:cs="Times New Roman"/>
         </w:rPr>
         <w:t>Jan 2026-Apr 2026</w:t>
       </w:r>
@@ -1603,18 +1591,18 @@
         </w:tabs>
         <w:spacing w:line="240" w:lineRule="auto"/>
         <w:rPr>
-          <w:rFonts w:asciiTheme="minorHAnsi" w:eastAsia="Garamond" w:hAnsiTheme="minorHAnsi" w:cstheme="minorHAnsi"/>
-        </w:rPr>
-      </w:pPr>
-      <w:r>
-        <w:rPr>
-          <w:rFonts w:asciiTheme="minorHAnsi" w:eastAsia="Garamond" w:hAnsiTheme="minorHAnsi" w:cstheme="minorHAnsi"/>
+          <w:rFonts w:ascii="Times New Roman" w:eastAsia="Garamond" w:hAnsi="Times New Roman" w:cs="Times New Roman"/>
+        </w:rPr>
+      </w:pPr>
+      <w:r>
+        <w:rPr>
+          <w:rFonts w:ascii="Times New Roman" w:eastAsia="Garamond" w:hAnsi="Times New Roman" w:cs="Times New Roman"/>
         </w:rPr>
         <w:t>Oversaw making sure the backend was stable, supporting an event that was attended by over 100 community college students.</w:t>
       </w:r>
       <w:r>
         <w:rPr>
-          <w:rFonts w:asciiTheme="minorHAnsi" w:eastAsia="Garamond" w:hAnsiTheme="minorHAnsi" w:cstheme="minorHAnsi"/>
+          <w:rFonts w:ascii="Times New Roman" w:eastAsia="Garamond" w:hAnsi="Times New Roman" w:cs="Times New Roman"/>
         </w:rPr>
         <w:tab/>
         <w:t xml:space="preserve">     </w:t>
@@ -1628,12 +1616,12 @@
         <w:spacing w:line="240" w:lineRule="auto"/>
         <w:ind w:left="720"/>
         <w:rPr>
-          <w:rFonts w:asciiTheme="minorHAnsi" w:eastAsia="Garamond" w:hAnsiTheme="minorHAnsi" w:cstheme="minorHAnsi"/>
-        </w:rPr>
-      </w:pPr>
-      <w:r>
-        <w:rPr>
-          <w:rFonts w:asciiTheme="minorHAnsi" w:eastAsia="Garamond" w:hAnsiTheme="minorHAnsi" w:cstheme="minorHAnsi"/>
+          <w:rFonts w:ascii="Times New Roman" w:eastAsia="Garamond" w:hAnsi="Times New Roman" w:cs="Times New Roman"/>
+        </w:rPr>
+      </w:pPr>
+      <w:r>
+        <w:rPr>
+          <w:rFonts w:ascii="Times New Roman" w:eastAsia="Garamond" w:hAnsi="Times New Roman" w:cs="Times New Roman"/>
           <w:b/>
           <w:bCs/>
         </w:rPr>
@@ -1641,62 +1629,62 @@
       </w:r>
       <w:r>
         <w:rPr>
-          <w:rFonts w:asciiTheme="minorHAnsi" w:eastAsia="Garamond" w:hAnsiTheme="minorHAnsi" w:cstheme="minorHAnsi"/>
+          <w:rFonts w:ascii="Times New Roman" w:eastAsia="Garamond" w:hAnsi="Times New Roman" w:cs="Times New Roman"/>
         </w:rPr>
         <w:t>, President</w:t>
       </w:r>
       <w:r>
         <w:rPr>
-          <w:rFonts w:asciiTheme="minorHAnsi" w:eastAsia="Garamond" w:hAnsiTheme="minorHAnsi" w:cstheme="minorHAnsi"/>
+          <w:rFonts w:ascii="Times New Roman" w:eastAsia="Garamond" w:hAnsi="Times New Roman" w:cs="Times New Roman"/>
         </w:rPr>
         <w:t xml:space="preserve">                       </w:t>
       </w:r>
       <w:r>
         <w:rPr>
-          <w:rFonts w:asciiTheme="minorHAnsi" w:eastAsia="Garamond" w:hAnsiTheme="minorHAnsi" w:cstheme="minorHAnsi"/>
+          <w:rFonts w:ascii="Times New Roman" w:eastAsia="Garamond" w:hAnsi="Times New Roman" w:cs="Times New Roman"/>
         </w:rPr>
         <w:tab/>
       </w:r>
       <w:r>
         <w:rPr>
-          <w:rFonts w:asciiTheme="minorHAnsi" w:eastAsia="Garamond" w:hAnsiTheme="minorHAnsi" w:cstheme="minorHAnsi"/>
+          <w:rFonts w:ascii="Times New Roman" w:eastAsia="Garamond" w:hAnsi="Times New Roman" w:cs="Times New Roman"/>
         </w:rPr>
         <w:tab/>
       </w:r>
       <w:r>
         <w:rPr>
-          <w:rFonts w:asciiTheme="minorHAnsi" w:eastAsia="Garamond" w:hAnsiTheme="minorHAnsi" w:cstheme="minorHAnsi"/>
+          <w:rFonts w:ascii="Times New Roman" w:eastAsia="Garamond" w:hAnsi="Times New Roman" w:cs="Times New Roman"/>
         </w:rPr>
         <w:tab/>
       </w:r>
       <w:r>
         <w:rPr>
-          <w:rFonts w:asciiTheme="minorHAnsi" w:eastAsia="Garamond" w:hAnsiTheme="minorHAnsi" w:cstheme="minorHAnsi"/>
+          <w:rFonts w:ascii="Times New Roman" w:eastAsia="Garamond" w:hAnsi="Times New Roman" w:cs="Times New Roman"/>
         </w:rPr>
         <w:tab/>
       </w:r>
       <w:r>
         <w:rPr>
-          <w:rFonts w:asciiTheme="minorHAnsi" w:eastAsia="Garamond" w:hAnsiTheme="minorHAnsi" w:cstheme="minorHAnsi"/>
+          <w:rFonts w:ascii="Times New Roman" w:eastAsia="Garamond" w:hAnsi="Times New Roman" w:cs="Times New Roman"/>
         </w:rPr>
         <w:tab/>
       </w:r>
       <w:r>
         <w:rPr>
-          <w:rFonts w:asciiTheme="minorHAnsi" w:eastAsia="Garamond" w:hAnsiTheme="minorHAnsi" w:cstheme="minorHAnsi"/>
+          <w:rFonts w:ascii="Times New Roman" w:eastAsia="Garamond" w:hAnsi="Times New Roman" w:cs="Times New Roman"/>
         </w:rPr>
         <w:tab/>
         <w:t xml:space="preserve">     </w:t>
       </w:r>
       <w:r>
         <w:rPr>
-          <w:rFonts w:asciiTheme="minorHAnsi" w:eastAsia="Garamond" w:hAnsiTheme="minorHAnsi" w:cstheme="minorHAnsi"/>
+          <w:rFonts w:ascii="Times New Roman" w:eastAsia="Garamond" w:hAnsi="Times New Roman" w:cs="Times New Roman"/>
         </w:rPr>
         <w:t xml:space="preserve">                </w:t>
       </w:r>
       <w:r>
         <w:rPr>
-          <w:rFonts w:asciiTheme="minorHAnsi" w:eastAsia="Times New Roman" w:hAnsiTheme="minorHAnsi" w:cstheme="minorHAnsi"/>
+          <w:rFonts w:ascii="Times New Roman" w:eastAsia="Times New Roman" w:hAnsi="Times New Roman" w:cs="Times New Roman"/>
         </w:rPr>
         <w:t>Aug 2023-May 2026</w:t>
       </w:r>
@@ -1713,24 +1701,24 @@
         </w:tabs>
         <w:spacing w:line="240" w:lineRule="auto"/>
         <w:rPr>
-          <w:rFonts w:asciiTheme="minorHAnsi" w:eastAsia="Garamond" w:hAnsiTheme="minorHAnsi" w:cstheme="minorHAnsi"/>
-        </w:rPr>
-      </w:pPr>
-      <w:r>
-        <w:rPr>
-          <w:rFonts w:asciiTheme="minorHAnsi" w:eastAsia="Garamond" w:hAnsiTheme="minorHAnsi" w:cstheme="minorHAnsi"/>
+          <w:rFonts w:ascii="Times New Roman" w:eastAsia="Garamond" w:hAnsi="Times New Roman" w:cs="Times New Roman"/>
+        </w:rPr>
+      </w:pPr>
+      <w:r>
+        <w:rPr>
+          <w:rFonts w:ascii="Times New Roman" w:eastAsia="Garamond" w:hAnsi="Times New Roman" w:cs="Times New Roman"/>
         </w:rPr>
         <w:t xml:space="preserve">Founding Member in the Club in 2023 as a student, </w:t>
       </w:r>
       <w:r>
         <w:rPr>
-          <w:rFonts w:asciiTheme="minorHAnsi" w:eastAsia="Garamond" w:hAnsiTheme="minorHAnsi" w:cstheme="minorHAnsi"/>
+          <w:rFonts w:ascii="Times New Roman" w:eastAsia="Garamond" w:hAnsi="Times New Roman" w:cs="Times New Roman"/>
         </w:rPr>
         <w:t>2025-2026 became the President of the clu</w:t>
       </w:r>
       <w:r>
         <w:rPr>
-          <w:rFonts w:asciiTheme="minorHAnsi" w:eastAsia="Garamond" w:hAnsiTheme="minorHAnsi" w:cstheme="minorHAnsi"/>
+          <w:rFonts w:ascii="Times New Roman" w:eastAsia="Garamond" w:hAnsi="Times New Roman" w:cs="Times New Roman"/>
         </w:rPr>
         <w:t>b, spearheading dozens of members leading to our strongest attendance.</w:t>
       </w:r>
@@ -1741,87 +1729,81 @@
         <w:ind w:left="720"/>
         <w:contextualSpacing/>
         <w:rPr>
-          <w:rFonts w:asciiTheme="minorHAnsi" w:eastAsia="Times New Roman" w:hAnsiTheme="minorHAnsi" w:cstheme="minorHAnsi"/>
-        </w:rPr>
-      </w:pPr>
-      <w:r>
-        <w:rPr>
-          <w:rFonts w:asciiTheme="minorHAnsi" w:eastAsia="Times New Roman" w:hAnsiTheme="minorHAnsi" w:cstheme="minorHAnsi"/>
+          <w:rFonts w:ascii="Times New Roman" w:eastAsia="Times New Roman" w:hAnsi="Times New Roman" w:cs="Times New Roman"/>
+        </w:rPr>
+      </w:pPr>
+      <w:r>
+        <w:rPr>
+          <w:rFonts w:ascii="Times New Roman" w:eastAsia="Times New Roman" w:hAnsi="Times New Roman" w:cs="Times New Roman"/>
           <w:b/>
         </w:rPr>
         <w:t>Speech Team</w:t>
       </w:r>
       <w:r>
         <w:rPr>
-          <w:rFonts w:asciiTheme="minorHAnsi" w:eastAsia="Times New Roman" w:hAnsiTheme="minorHAnsi" w:cstheme="minorHAnsi"/>
+          <w:rFonts w:ascii="Times New Roman" w:eastAsia="Times New Roman" w:hAnsi="Times New Roman" w:cs="Times New Roman"/>
         </w:rPr>
         <w:t xml:space="preserve">, Member </w:t>
       </w:r>
       <w:r>
         <w:rPr>
-          <w:rFonts w:asciiTheme="minorHAnsi" w:eastAsia="Times New Roman" w:hAnsiTheme="minorHAnsi" w:cstheme="minorHAnsi"/>
+          <w:rFonts w:ascii="Times New Roman" w:eastAsia="Times New Roman" w:hAnsi="Times New Roman" w:cs="Times New Roman"/>
         </w:rPr>
         <w:tab/>
       </w:r>
       <w:r>
         <w:rPr>
-          <w:rFonts w:asciiTheme="minorHAnsi" w:eastAsia="Times New Roman" w:hAnsiTheme="minorHAnsi" w:cstheme="minorHAnsi"/>
+          <w:rFonts w:ascii="Times New Roman" w:eastAsia="Times New Roman" w:hAnsi="Times New Roman" w:cs="Times New Roman"/>
         </w:rPr>
         <w:tab/>
       </w:r>
       <w:r>
         <w:rPr>
-          <w:rFonts w:asciiTheme="minorHAnsi" w:eastAsia="Times New Roman" w:hAnsiTheme="minorHAnsi" w:cstheme="minorHAnsi"/>
+          <w:rFonts w:ascii="Times New Roman" w:eastAsia="Times New Roman" w:hAnsi="Times New Roman" w:cs="Times New Roman"/>
         </w:rPr>
         <w:tab/>
       </w:r>
       <w:r>
         <w:rPr>
-          <w:rFonts w:asciiTheme="minorHAnsi" w:eastAsia="Times New Roman" w:hAnsiTheme="minorHAnsi" w:cstheme="minorHAnsi"/>
+          <w:rFonts w:ascii="Times New Roman" w:eastAsia="Times New Roman" w:hAnsi="Times New Roman" w:cs="Times New Roman"/>
         </w:rPr>
         <w:tab/>
       </w:r>
       <w:r>
         <w:rPr>
-          <w:rFonts w:asciiTheme="minorHAnsi" w:eastAsia="Times New Roman" w:hAnsiTheme="minorHAnsi" w:cstheme="minorHAnsi"/>
+          <w:rFonts w:ascii="Times New Roman" w:eastAsia="Times New Roman" w:hAnsi="Times New Roman" w:cs="Times New Roman"/>
         </w:rPr>
         <w:tab/>
       </w:r>
       <w:r>
         <w:rPr>
-          <w:rFonts w:asciiTheme="minorHAnsi" w:eastAsia="Times New Roman" w:hAnsiTheme="minorHAnsi" w:cstheme="minorHAnsi"/>
+          <w:rFonts w:ascii="Times New Roman" w:eastAsia="Times New Roman" w:hAnsi="Times New Roman" w:cs="Times New Roman"/>
         </w:rPr>
         <w:tab/>
         <w:t xml:space="preserve">    </w:t>
       </w:r>
       <w:r>
         <w:rPr>
-          <w:rFonts w:asciiTheme="minorHAnsi" w:eastAsia="Times New Roman" w:hAnsiTheme="minorHAnsi" w:cstheme="minorHAnsi"/>
+          <w:rFonts w:ascii="Times New Roman" w:eastAsia="Times New Roman" w:hAnsi="Times New Roman" w:cs="Times New Roman"/>
         </w:rPr>
         <w:tab/>
       </w:r>
       <w:r>
         <w:rPr>
-          <w:rFonts w:asciiTheme="minorHAnsi" w:eastAsia="Times New Roman" w:hAnsiTheme="minorHAnsi" w:cstheme="minorHAnsi"/>
+          <w:rFonts w:ascii="Times New Roman" w:eastAsia="Times New Roman" w:hAnsi="Times New Roman" w:cs="Times New Roman"/>
         </w:rPr>
         <w:tab/>
-        <w:t xml:space="preserve">    </w:t>
-      </w:r>
-      <w:r>
-        <w:rPr>
-          <w:rFonts w:asciiTheme="minorHAnsi" w:eastAsia="Times New Roman" w:hAnsiTheme="minorHAnsi" w:cstheme="minorHAnsi"/>
-        </w:rPr>
-        <w:t xml:space="preserve"> </w:t>
-      </w:r>
-      <w:r>
-        <w:rPr>
-          <w:rFonts w:asciiTheme="minorHAnsi" w:eastAsia="Times New Roman" w:hAnsiTheme="minorHAnsi" w:cstheme="minorHAnsi"/>
+        <w:t xml:space="preserve">     </w:t>
+      </w:r>
+      <w:r>
+        <w:rPr>
+          <w:rFonts w:ascii="Times New Roman" w:eastAsia="Times New Roman" w:hAnsi="Times New Roman" w:cs="Times New Roman"/>
         </w:rPr>
         <w:t xml:space="preserve">                  </w:t>
       </w:r>
       <w:r>
         <w:rPr>
-          <w:rFonts w:asciiTheme="minorHAnsi" w:eastAsia="Times New Roman" w:hAnsiTheme="minorHAnsi" w:cstheme="minorHAnsi"/>
+          <w:rFonts w:ascii="Times New Roman" w:eastAsia="Times New Roman" w:hAnsi="Times New Roman" w:cs="Times New Roman"/>
         </w:rPr>
         <w:t>Aug 2025-Feb 2026</w:t>
       </w:r>
@@ -1839,12 +1821,12 @@
         <w:ind w:left="1080"/>
         <w:contextualSpacing/>
         <w:rPr>
-          <w:rFonts w:asciiTheme="minorHAnsi" w:eastAsia="Garamond" w:hAnsiTheme="minorHAnsi" w:cstheme="minorHAnsi"/>
-        </w:rPr>
-      </w:pPr>
-      <w:r>
-        <w:rPr>
-          <w:rFonts w:asciiTheme="minorHAnsi" w:eastAsia="Garamond" w:hAnsiTheme="minorHAnsi" w:cstheme="minorHAnsi"/>
+          <w:rFonts w:ascii="Times New Roman" w:eastAsia="Garamond" w:hAnsi="Times New Roman" w:cs="Times New Roman"/>
+        </w:rPr>
+      </w:pPr>
+      <w:r>
+        <w:rPr>
+          <w:rFonts w:ascii="Times New Roman" w:eastAsia="Garamond" w:hAnsi="Times New Roman" w:cs="Times New Roman"/>
         </w:rPr>
         <w:t>Competed at the speech competition in December 2025 at Mt. Sac College, Pomona.</w:t>
       </w:r>

</xml_diff>